<commit_message>
fix(swiss): 回退 final 到 W27（W28 Word 报'文件损坏'）+ iter-25/26 探索归档
⚠️ 重大发现：W28 (含 OOXML autoSpaceDE/DN post-process) 让 MS Word 报
'文件可能已经损坏'。LibreOffice 渲染正常但 Word 拒绝打开 — 这违反客户
'Word 可编辑' 核心要求！

回退 final/imt050-wevac-eu-cn.docx 到 W27 (visual 8.67/max 12.35,
未做 OOXML post-process)。W27 Word/LibreOffice 都正常打开。

iter-25/iter-26 探索结果（27 候选保留为参考）：
- numPr w:ilvl bullets: 退步
- textAlignment auto: 持平
- run position offset: 退步
- szCs / noWrap / bookmarks / contextualSpacing: 持平或退步
- image resample 150/300dpi: 持平
- rFonts eastAsia hint: 退步

合法路径全局最优确认：W27 visual=8.67 / max=12.35 (Word & LibreOffice 都可用)。
</commit_message>
<xml_diff>
--- a/research/yjs-manual-opt/swiss/00_discussions/2026-05-pdf-to-docx-fidelity/final/imt050-wevac-eu-cn.docx
+++ b/research/yjs-manual-opt/swiss/00_discussions/2026-05-pdf-to-docx-fidelity/final/imt050-wevac-eu-cn.docx
@@ -1,12 +1,10 @@
 
 <file path=word/document.xml><?xml version="1.0" encoding="utf-8"?>
-<w:document xmlns:ns1="http://schemas.openxmlformats.org/markup-compatibility/2006" xmlns:ns2="http://schemas.openxmlformats.org/drawingml/2006/wordprocessingDrawing" xmlns:ns3="http://schemas.openxmlformats.org/drawingml/2006/main" xmlns:ns4="http://schemas.openxmlformats.org/drawingml/2006/picture" xmlns:ns5="http://schemas.openxmlformats.org/officeDocument/2006/relationships" xmlns:w="http://schemas.openxmlformats.org/wordprocessingml/2006/main" ns1:Ignorable="w14 wp14">
+<w:document xmlns:wpc="http://schemas.microsoft.com/office/word/2010/wordprocessingCanvas" xmlns:mo="http://schemas.microsoft.com/office/mac/office/2008/main" xmlns:mc="http://schemas.openxmlformats.org/markup-compatibility/2006" xmlns:mv="urn:schemas-microsoft-com:mac:vml" xmlns:o="urn:schemas-microsoft-com:office:office" xmlns:r="http://schemas.openxmlformats.org/officeDocument/2006/relationships" xmlns:m="http://schemas.openxmlformats.org/officeDocument/2006/math" xmlns:v="urn:schemas-microsoft-com:vml" xmlns:wp14="http://schemas.microsoft.com/office/word/2010/wordprocessingDrawing" xmlns:wp="http://schemas.openxmlformats.org/drawingml/2006/wordprocessingDrawing" xmlns:w10="urn:schemas-microsoft-com:office:word" xmlns:w="http://schemas.openxmlformats.org/wordprocessingml/2006/main" xmlns:w14="http://schemas.microsoft.com/office/word/2010/wordml" xmlns:wpg="http://schemas.microsoft.com/office/word/2010/wordprocessingGroup" xmlns:wpi="http://schemas.microsoft.com/office/word/2010/wordprocessingInk" xmlns:wne="http://schemas.microsoft.com/office/word/2006/wordml" xmlns:wps="http://schemas.microsoft.com/office/word/2010/wordprocessingShape" mc:Ignorable="w14 wp14">
   <w:body>
     <w:p>
       <w:pPr>
         <w:spacing w:before="400" w:after="2760"/>
-        <w:autoSpaceDE w:val="0"/>
-        <w:autoSpaceDN w:val="0"/>
       </w:pPr>
       <w:r>
         <w:rPr>
@@ -33,49 +31,45 @@
       <w:pPr>
         <w:spacing w:after="600" w:before="160"/>
         <w:jc w:val="left"/>
-        <w:autoSpaceDE w:val="0"/>
-        <w:autoSpaceDN w:val="0"/>
       </w:pPr>
       <w:r>
         <w:drawing>
-          <ns2:inline>
-            <ns2:extent cx="906829" cy="1170000"/>
-            <ns2:docPr id="1" name="Picture 1"/>
-            <ns2:cNvGraphicFramePr>
-              <ns3:graphicFrameLocks noChangeAspect="1"/>
-            </ns2:cNvGraphicFramePr>
-            <ns3:graphic>
-              <ns3:graphicData uri="http://schemas.openxmlformats.org/drawingml/2006/picture">
-                <ns4:pic>
-                  <ns4:nvPicPr>
-                    <ns4:cNvPr id="0" name="image1.png"/>
-                    <ns4:cNvPicPr/>
-                  </ns4:nvPicPr>
-                  <ns4:blipFill>
-                    <ns3:blip ns5:embed="rId10"/>
-                    <ns3:stretch>
-                      <ns3:fillRect/>
-                    </ns3:stretch>
-                  </ns4:blipFill>
-                  <ns4:spPr>
-                    <ns3:xfrm>
-                      <ns3:off x="0" y="0"/>
-                      <ns3:ext cx="906829" cy="1170000"/>
-                    </ns3:xfrm>
-                    <ns3:prstGeom prst="rect"/>
-                  </ns4:spPr>
-                </ns4:pic>
-              </ns3:graphicData>
-            </ns3:graphic>
-          </ns2:inline>
+          <wp:inline xmlns:a="http://schemas.openxmlformats.org/drawingml/2006/main" xmlns:pic="http://schemas.openxmlformats.org/drawingml/2006/picture">
+            <wp:extent cx="906829" cy="1170000"/>
+            <wp:docPr id="1" name="Picture 1"/>
+            <wp:cNvGraphicFramePr>
+              <a:graphicFrameLocks noChangeAspect="1"/>
+            </wp:cNvGraphicFramePr>
+            <a:graphic>
+              <a:graphicData uri="http://schemas.openxmlformats.org/drawingml/2006/picture">
+                <pic:pic>
+                  <pic:nvPicPr>
+                    <pic:cNvPr id="0" name="image1.png"/>
+                    <pic:cNvPicPr/>
+                  </pic:nvPicPr>
+                  <pic:blipFill>
+                    <a:blip r:embed="rId10"/>
+                    <a:stretch>
+                      <a:fillRect/>
+                    </a:stretch>
+                  </pic:blipFill>
+                  <pic:spPr>
+                    <a:xfrm>
+                      <a:off x="0" y="0"/>
+                      <a:ext cx="906829" cy="1170000"/>
+                    </a:xfrm>
+                    <a:prstGeom prst="rect"/>
+                  </pic:spPr>
+                </pic:pic>
+              </a:graphicData>
+            </a:graphic>
+          </wp:inline>
         </w:drawing>
       </w:r>
     </w:p>
     <w:p>
       <w:pPr>
         <w:spacing w:after="40" w:before="0" w:line="278" w:lineRule="auto"/>
-        <w:autoSpaceDE w:val="0"/>
-        <w:autoSpaceDN w:val="0"/>
       </w:pPr>
       <w:r>
         <w:rPr>
@@ -90,8 +84,6 @@
     <w:p>
       <w:pPr>
         <w:spacing w:after="0" w:before="0" w:line="278" w:lineRule="auto"/>
-        <w:autoSpaceDE w:val="0"/>
-        <w:autoSpaceDN w:val="0"/>
       </w:pPr>
       <w:r>
         <w:rPr>
@@ -107,8 +99,6 @@
     <w:p>
       <w:pPr>
         <w:spacing w:after="20" w:before="0" w:line="278" w:lineRule="auto"/>
-        <w:autoSpaceDE w:val="0"/>
-        <w:autoSpaceDN w:val="0"/>
       </w:pPr>
       <w:r>
         <w:rPr>
@@ -124,8 +114,6 @@
     <w:p>
       <w:pPr>
         <w:spacing w:after="2260"/>
-        <w:autoSpaceDE w:val="0"/>
-        <w:autoSpaceDN w:val="0"/>
       </w:pPr>
       <w:r>
         <w:rPr>
@@ -144,15 +132,11 @@
           <w:top w:val="single" w:sz="10" w:space="1" w:color="000000"/>
         </w:pBdr>
         <w:spacing w:after="60"/>
-        <w:autoSpaceDE w:val="0"/>
-        <w:autoSpaceDN w:val="0"/>
       </w:pPr>
     </w:p>
     <w:p>
       <w:pPr>
         <w:spacing w:after="0" w:before="0" w:line="278" w:lineRule="auto"/>
-        <w:autoSpaceDE w:val="0"/>
-        <w:autoSpaceDN w:val="0"/>
       </w:pPr>
       <w:r>
         <w:rPr>
@@ -168,14 +152,12 @@
     <w:p>
       <w:pPr>
         <w:sectPr>
-          <w:footerReference w:type="default" ns5:id="rId9"/>
+          <w:footerReference w:type="default" r:id="rId9"/>
           <w:pgSz w:w="8391" w:h="11906"/>
           <w:pgMar w:top="578" w:right="567" w:bottom="567" w:left="567" w:header="227" w:footer="198" w:gutter="0"/>
           <w:cols w:space="720"/>
           <w:docGrid w:linePitch="360"/>
         </w:sectPr>
-        <w:autoSpaceDE w:val="0"/>
-        <w:autoSpaceDN w:val="0"/>
       </w:pPr>
     </w:p>
     <w:p>
@@ -187,8 +169,6 @@
           <w:tab w:pos="7257" w:val="right"/>
         </w:tabs>
         <w:spacing w:after="80" w:line="240" w:lineRule="auto"/>
-        <w:autoSpaceDE w:val="0"/>
-        <w:autoSpaceDN w:val="0"/>
       </w:pPr>
       <w:r>
         <w:rPr>
@@ -208,14 +188,20 @@
           <w:color w:val="8E8E93"/>
         </w:rPr>
         <w:tab/>
+      </w:r>
+      <w:r>
+        <w:rPr>
+          <w:rFonts w:ascii="Courier New" w:hAnsi="Courier New" w:cs="Courier New" w:eastAsia="Microsoft YaHei"/>
+          <w:b w:val="0"/>
+          <w:sz w:val="10"/>
+          <w:color w:val="8E8E93"/>
+        </w:rPr>
         <w:t>IMT050 — 说明书</w:t>
       </w:r>
     </w:p>
     <w:p>
       <w:pPr>
         <w:spacing w:after="200" w:before="0" w:line="278" w:lineRule="auto"/>
-        <w:autoSpaceDE w:val="0"/>
-        <w:autoSpaceDN w:val="0"/>
       </w:pPr>
       <w:r>
         <w:rPr>
@@ -234,8 +220,6 @@
           <w:tab w:pos="7257" w:val="right"/>
         </w:tabs>
         <w:spacing w:after="120" w:line="240" w:lineRule="auto"/>
-        <w:autoSpaceDE w:val="0"/>
-        <w:autoSpaceDN w:val="0"/>
       </w:pPr>
       <w:r>
         <w:rPr>
@@ -273,8 +257,6 @@
           <w:tab w:pos="7257" w:val="right"/>
         </w:tabs>
         <w:spacing w:after="120" w:line="240" w:lineRule="auto"/>
-        <w:autoSpaceDE w:val="0"/>
-        <w:autoSpaceDN w:val="0"/>
       </w:pPr>
       <w:r>
         <w:rPr>
@@ -312,8 +294,6 @@
           <w:tab w:pos="7257" w:val="right"/>
         </w:tabs>
         <w:spacing w:after="120" w:line="240" w:lineRule="auto"/>
-        <w:autoSpaceDE w:val="0"/>
-        <w:autoSpaceDN w:val="0"/>
       </w:pPr>
       <w:r>
         <w:rPr>
@@ -351,8 +331,6 @@
           <w:tab w:pos="7257" w:val="right"/>
         </w:tabs>
         <w:spacing w:after="120" w:line="240" w:lineRule="auto"/>
-        <w:autoSpaceDE w:val="0"/>
-        <w:autoSpaceDN w:val="0"/>
       </w:pPr>
       <w:r>
         <w:rPr>
@@ -390,8 +368,6 @@
           <w:tab w:pos="7257" w:val="right"/>
         </w:tabs>
         <w:spacing w:after="120" w:line="240" w:lineRule="auto"/>
-        <w:autoSpaceDE w:val="0"/>
-        <w:autoSpaceDN w:val="0"/>
       </w:pPr>
       <w:r>
         <w:rPr>
@@ -429,8 +405,6 @@
           <w:tab w:pos="7257" w:val="right"/>
         </w:tabs>
         <w:spacing w:after="120" w:line="240" w:lineRule="auto"/>
-        <w:autoSpaceDE w:val="0"/>
-        <w:autoSpaceDN w:val="0"/>
       </w:pPr>
       <w:r>
         <w:rPr>
@@ -468,8 +442,6 @@
           <w:tab w:pos="7257" w:val="right"/>
         </w:tabs>
         <w:spacing w:after="120" w:line="240" w:lineRule="auto"/>
-        <w:autoSpaceDE w:val="0"/>
-        <w:autoSpaceDN w:val="0"/>
       </w:pPr>
       <w:r>
         <w:rPr>
@@ -507,8 +479,6 @@
           <w:tab w:pos="7257" w:val="right"/>
         </w:tabs>
         <w:spacing w:after="120" w:line="240" w:lineRule="auto"/>
-        <w:autoSpaceDE w:val="0"/>
-        <w:autoSpaceDN w:val="0"/>
       </w:pPr>
       <w:r>
         <w:rPr>
@@ -546,8 +516,6 @@
           <w:tab w:pos="7257" w:val="right"/>
         </w:tabs>
         <w:spacing w:after="120" w:line="240" w:lineRule="auto"/>
-        <w:autoSpaceDE w:val="0"/>
-        <w:autoSpaceDN w:val="0"/>
       </w:pPr>
       <w:r>
         <w:rPr>
@@ -585,8 +553,6 @@
           <w:tab w:pos="7257" w:val="right"/>
         </w:tabs>
         <w:spacing w:after="120" w:line="240" w:lineRule="auto"/>
-        <w:autoSpaceDE w:val="0"/>
-        <w:autoSpaceDN w:val="0"/>
       </w:pPr>
       <w:r>
         <w:rPr>
@@ -621,14 +587,12 @@
     <w:p>
       <w:pPr>
         <w:sectPr>
-          <w:footerReference w:type="default" ns5:id="rId11"/>
+          <w:footerReference w:type="default" r:id="rId11"/>
           <w:pgSz w:w="8391" w:h="11906"/>
           <w:pgMar w:top="578" w:right="567" w:bottom="567" w:left="567" w:header="227" w:footer="198" w:gutter="0"/>
           <w:cols w:space="720"/>
           <w:docGrid w:linePitch="360"/>
         </w:sectPr>
-        <w:autoSpaceDE w:val="0"/>
-        <w:autoSpaceDN w:val="0"/>
       </w:pPr>
     </w:p>
     <w:p>
@@ -640,8 +604,6 @@
           <w:tab w:pos="7257" w:val="right"/>
         </w:tabs>
         <w:spacing w:after="176" w:line="240" w:lineRule="auto"/>
-        <w:autoSpaceDE w:val="0"/>
-        <w:autoSpaceDN w:val="0"/>
       </w:pPr>
       <w:r>
         <w:rPr>
@@ -661,6 +623,14 @@
           <w:color w:val="8E8E93"/>
         </w:rPr>
         <w:tab/>
+      </w:r>
+      <w:r>
+        <w:rPr>
+          <w:rFonts w:ascii="Courier New" w:hAnsi="Courier New" w:cs="Courier New" w:eastAsia="Microsoft YaHei"/>
+          <w:b w:val="0"/>
+          <w:sz w:val="10"/>
+          <w:color w:val="8E8E93"/>
+        </w:rPr>
         <w:t>CH.01 — SAFETY</w:t>
       </w:r>
     </w:p>
@@ -671,8 +641,6 @@
         </w:pBdr>
         <w:spacing w:after="120" w:line="240" w:lineRule="auto"/>
         <w:ind w:left="85"/>
-        <w:autoSpaceDE w:val="0"/>
-        <w:autoSpaceDN w:val="0"/>
       </w:pPr>
       <w:r>
         <w:rPr>
@@ -698,8 +666,6 @@
     <w:p>
       <w:pPr>
         <w:spacing w:after="60" w:before="0" w:line="278" w:lineRule="auto"/>
-        <w:autoSpaceDE w:val="0"/>
-        <w:autoSpaceDN w:val="0"/>
       </w:pPr>
       <w:r>
         <w:rPr>
@@ -751,8 +717,6 @@
           <w:p>
             <w:pPr>
               <w:spacing w:after="20" w:before="0" w:line="278" w:lineRule="auto"/>
-              <w:autoSpaceDE w:val="0"/>
-              <w:autoSpaceDN w:val="0"/>
             </w:pPr>
             <w:r>
               <w:rPr>
@@ -770,41 +734,39 @@
               <w:spacing w:after="20" w:before="0"/>
               <w:ind w:left="-176"/>
               <w:jc w:val="left"/>
-              <w:autoSpaceDE w:val="0"/>
-              <w:autoSpaceDN w:val="0"/>
             </w:pPr>
             <w:r>
               <w:drawing>
-                <ns2:inline>
-                  <ns2:extent cx="228528" cy="209484"/>
-                  <ns2:docPr id="2" name="Picture 2"/>
-                  <ns2:cNvGraphicFramePr>
-                    <ns3:graphicFrameLocks noChangeAspect="1"/>
-                  </ns2:cNvGraphicFramePr>
-                  <ns3:graphic>
-                    <ns3:graphicData uri="http://schemas.openxmlformats.org/drawingml/2006/picture">
-                      <ns4:pic>
-                        <ns4:nvPicPr>
-                          <ns4:cNvPr id="0" name="image3.png"/>
-                          <ns4:cNvPicPr/>
-                        </ns4:nvPicPr>
-                        <ns4:blipFill>
-                          <ns3:blip ns5:embed="rId13"/>
-                          <ns3:stretch>
-                            <ns3:fillRect/>
-                          </ns3:stretch>
-                        </ns4:blipFill>
-                        <ns4:spPr>
-                          <ns3:xfrm>
-                            <ns3:off x="0" y="0"/>
-                            <ns3:ext cx="228528" cy="209484"/>
-                          </ns3:xfrm>
-                          <ns3:prstGeom prst="rect"/>
-                        </ns4:spPr>
-                      </ns4:pic>
-                    </ns3:graphicData>
-                  </ns3:graphic>
-                </ns2:inline>
+                <wp:inline xmlns:a="http://schemas.openxmlformats.org/drawingml/2006/main" xmlns:pic="http://schemas.openxmlformats.org/drawingml/2006/picture">
+                  <wp:extent cx="228528" cy="209484"/>
+                  <wp:docPr id="2" name="Picture 2"/>
+                  <wp:cNvGraphicFramePr>
+                    <a:graphicFrameLocks noChangeAspect="1"/>
+                  </wp:cNvGraphicFramePr>
+                  <a:graphic>
+                    <a:graphicData uri="http://schemas.openxmlformats.org/drawingml/2006/picture">
+                      <pic:pic>
+                        <pic:nvPicPr>
+                          <pic:cNvPr id="0" name="image3.png"/>
+                          <pic:cNvPicPr/>
+                        </pic:nvPicPr>
+                        <pic:blipFill>
+                          <a:blip r:embed="rId13"/>
+                          <a:stretch>
+                            <a:fillRect/>
+                          </a:stretch>
+                        </pic:blipFill>
+                        <pic:spPr>
+                          <a:xfrm>
+                            <a:off x="0" y="0"/>
+                            <a:ext cx="228528" cy="209484"/>
+                          </a:xfrm>
+                          <a:prstGeom prst="rect"/>
+                        </pic:spPr>
+                      </pic:pic>
+                    </a:graphicData>
+                  </a:graphic>
+                </wp:inline>
               </w:drawing>
             </w:r>
           </w:p>
@@ -812,8 +774,6 @@
             <w:pPr>
               <w:spacing w:before="0" w:after="27" w:line="230" w:lineRule="auto"/>
               <w:ind w:left="266" w:hanging="266"/>
-              <w:autoSpaceDE w:val="0"/>
-              <w:autoSpaceDN w:val="0"/>
             </w:pPr>
             <w:r>
               <w:rPr>
@@ -840,8 +800,6 @@
             <w:pPr>
               <w:spacing w:before="0" w:after="27" w:line="230" w:lineRule="auto"/>
               <w:ind w:left="266" w:hanging="266"/>
-              <w:autoSpaceDE w:val="0"/>
-              <w:autoSpaceDN w:val="0"/>
             </w:pPr>
             <w:r>
               <w:rPr>
@@ -868,8 +826,6 @@
             <w:pPr>
               <w:spacing w:before="0" w:after="27" w:line="230" w:lineRule="auto"/>
               <w:ind w:left="266" w:hanging="266"/>
-              <w:autoSpaceDE w:val="0"/>
-              <w:autoSpaceDN w:val="0"/>
             </w:pPr>
             <w:r>
               <w:rPr>
@@ -896,8 +852,6 @@
             <w:pPr>
               <w:spacing w:before="0" w:after="27" w:line="230" w:lineRule="auto"/>
               <w:ind w:left="266" w:hanging="266"/>
-              <w:autoSpaceDE w:val="0"/>
-              <w:autoSpaceDN w:val="0"/>
             </w:pPr>
             <w:r>
               <w:rPr>
@@ -924,8 +878,6 @@
             <w:pPr>
               <w:spacing w:before="0" w:after="27" w:line="230" w:lineRule="auto"/>
               <w:ind w:left="266" w:hanging="266"/>
-              <w:autoSpaceDE w:val="0"/>
-              <w:autoSpaceDN w:val="0"/>
             </w:pPr>
             <w:r>
               <w:rPr>
@@ -952,8 +904,6 @@
             <w:pPr>
               <w:spacing w:before="0" w:after="27" w:line="230" w:lineRule="auto"/>
               <w:ind w:left="266" w:hanging="266"/>
-              <w:autoSpaceDE w:val="0"/>
-              <w:autoSpaceDN w:val="0"/>
             </w:pPr>
             <w:r>
               <w:rPr>
@@ -980,8 +930,6 @@
             <w:pPr>
               <w:spacing w:before="0" w:after="27" w:line="230" w:lineRule="auto"/>
               <w:ind w:left="266" w:hanging="266"/>
-              <w:autoSpaceDE w:val="0"/>
-              <w:autoSpaceDN w:val="0"/>
             </w:pPr>
             <w:r>
               <w:rPr>
@@ -1008,8 +956,6 @@
             <w:pPr>
               <w:spacing w:before="0" w:after="27" w:line="230" w:lineRule="auto"/>
               <w:ind w:left="266" w:hanging="266"/>
-              <w:autoSpaceDE w:val="0"/>
-              <w:autoSpaceDN w:val="0"/>
             </w:pPr>
             <w:r>
               <w:rPr>
@@ -1036,8 +982,6 @@
             <w:pPr>
               <w:spacing w:before="0" w:after="27" w:line="230" w:lineRule="auto"/>
               <w:ind w:left="266" w:hanging="266"/>
-              <w:autoSpaceDE w:val="0"/>
-              <w:autoSpaceDN w:val="0"/>
             </w:pPr>
             <w:r>
               <w:rPr>
@@ -1064,8 +1008,6 @@
             <w:pPr>
               <w:spacing w:before="0" w:after="27" w:line="230" w:lineRule="auto"/>
               <w:ind w:left="266" w:hanging="266"/>
-              <w:autoSpaceDE w:val="0"/>
-              <w:autoSpaceDN w:val="0"/>
             </w:pPr>
             <w:r>
               <w:rPr>
@@ -1092,8 +1034,6 @@
             <w:pPr>
               <w:spacing w:before="0" w:after="27" w:line="230" w:lineRule="auto"/>
               <w:ind w:left="266" w:hanging="266"/>
-              <w:autoSpaceDE w:val="0"/>
-              <w:autoSpaceDN w:val="0"/>
             </w:pPr>
             <w:r>
               <w:rPr>
@@ -1120,8 +1060,6 @@
             <w:pPr>
               <w:spacing w:before="0" w:after="27" w:line="230" w:lineRule="auto"/>
               <w:ind w:left="266" w:hanging="266"/>
-              <w:autoSpaceDE w:val="0"/>
-              <w:autoSpaceDN w:val="0"/>
             </w:pPr>
             <w:r>
               <w:rPr>
@@ -1148,8 +1086,6 @@
             <w:pPr>
               <w:spacing w:before="0" w:after="27" w:line="230" w:lineRule="auto"/>
               <w:ind w:left="266" w:hanging="266"/>
-              <w:autoSpaceDE w:val="0"/>
-              <w:autoSpaceDN w:val="0"/>
             </w:pPr>
             <w:r>
               <w:rPr>
@@ -1176,8 +1112,6 @@
             <w:pPr>
               <w:spacing w:before="0" w:after="27" w:line="230" w:lineRule="auto"/>
               <w:ind w:left="266" w:hanging="266"/>
-              <w:autoSpaceDE w:val="0"/>
-              <w:autoSpaceDN w:val="0"/>
             </w:pPr>
             <w:r>
               <w:rPr>
@@ -1204,8 +1138,6 @@
             <w:pPr>
               <w:spacing w:before="0" w:after="27" w:line="230" w:lineRule="auto"/>
               <w:ind w:left="266" w:hanging="266"/>
-              <w:autoSpaceDE w:val="0"/>
-              <w:autoSpaceDN w:val="0"/>
             </w:pPr>
             <w:r>
               <w:rPr>
@@ -1232,8 +1164,6 @@
             <w:pPr>
               <w:spacing w:before="0" w:after="27" w:line="230" w:lineRule="auto"/>
               <w:ind w:left="266" w:hanging="266"/>
-              <w:autoSpaceDE w:val="0"/>
-              <w:autoSpaceDN w:val="0"/>
             </w:pPr>
             <w:r>
               <w:rPr>
@@ -1260,8 +1190,6 @@
             <w:pPr>
               <w:spacing w:before="0" w:after="27" w:line="230" w:lineRule="auto"/>
               <w:ind w:left="266" w:hanging="266"/>
-              <w:autoSpaceDE w:val="0"/>
-              <w:autoSpaceDN w:val="0"/>
             </w:pPr>
             <w:r>
               <w:rPr>
@@ -1288,8 +1216,6 @@
             <w:pPr>
               <w:spacing w:before="0" w:after="27" w:line="230" w:lineRule="auto"/>
               <w:ind w:left="266" w:hanging="266"/>
-              <w:autoSpaceDE w:val="0"/>
-              <w:autoSpaceDN w:val="0"/>
             </w:pPr>
             <w:r>
               <w:rPr>
@@ -1316,8 +1242,6 @@
             <w:pPr>
               <w:spacing w:before="0" w:after="27" w:line="230" w:lineRule="auto"/>
               <w:ind w:left="266" w:hanging="266"/>
-              <w:autoSpaceDE w:val="0"/>
-              <w:autoSpaceDN w:val="0"/>
             </w:pPr>
             <w:r>
               <w:rPr>
@@ -1344,8 +1268,6 @@
             <w:pPr>
               <w:spacing w:before="0" w:after="27" w:line="230" w:lineRule="auto"/>
               <w:ind w:left="266" w:hanging="266"/>
-              <w:autoSpaceDE w:val="0"/>
-              <w:autoSpaceDN w:val="0"/>
             </w:pPr>
             <w:r>
               <w:rPr>
@@ -1372,8 +1294,6 @@
             <w:pPr>
               <w:spacing w:before="0" w:after="27" w:line="230" w:lineRule="auto"/>
               <w:ind w:left="266" w:hanging="266"/>
-              <w:autoSpaceDE w:val="0"/>
-              <w:autoSpaceDN w:val="0"/>
             </w:pPr>
             <w:r>
               <w:rPr>
@@ -1400,8 +1320,6 @@
             <w:pPr>
               <w:spacing w:before="0" w:after="27" w:line="230" w:lineRule="auto"/>
               <w:ind w:left="266" w:hanging="266"/>
-              <w:autoSpaceDE w:val="0"/>
-              <w:autoSpaceDN w:val="0"/>
             </w:pPr>
             <w:r>
               <w:rPr>
@@ -1428,8 +1346,6 @@
             <w:pPr>
               <w:spacing w:before="0" w:after="27" w:line="230" w:lineRule="auto"/>
               <w:ind w:left="266" w:hanging="266"/>
-              <w:autoSpaceDE w:val="0"/>
-              <w:autoSpaceDN w:val="0"/>
             </w:pPr>
             <w:r>
               <w:rPr>
@@ -1456,8 +1372,6 @@
             <w:pPr>
               <w:spacing w:before="0" w:after="27" w:line="230" w:lineRule="auto"/>
               <w:ind w:left="266" w:hanging="266"/>
-              <w:autoSpaceDE w:val="0"/>
-              <w:autoSpaceDN w:val="0"/>
             </w:pPr>
             <w:r>
               <w:rPr>
@@ -1486,21 +1400,17 @@
     <w:p>
       <w:pPr>
         <w:spacing w:after="40"/>
-        <w:autoSpaceDE w:val="0"/>
-        <w:autoSpaceDN w:val="0"/>
       </w:pPr>
     </w:p>
     <w:p>
       <w:pPr>
         <w:sectPr>
-          <w:footerReference w:type="default" ns5:id="rId12"/>
+          <w:footerReference w:type="default" r:id="rId12"/>
           <w:pgSz w:w="8391" w:h="11906"/>
           <w:pgMar w:top="578" w:right="567" w:bottom="567" w:left="567" w:header="227" w:footer="198" w:gutter="0"/>
           <w:cols w:space="720"/>
           <w:docGrid w:linePitch="360"/>
         </w:sectPr>
-        <w:autoSpaceDE w:val="0"/>
-        <w:autoSpaceDN w:val="0"/>
       </w:pPr>
     </w:p>
     <w:p>
@@ -1512,8 +1422,6 @@
           <w:tab w:pos="7257" w:val="right"/>
         </w:tabs>
         <w:spacing w:after="176" w:line="240" w:lineRule="auto"/>
-        <w:autoSpaceDE w:val="0"/>
-        <w:autoSpaceDN w:val="0"/>
       </w:pPr>
       <w:r>
         <w:rPr>
@@ -1533,6 +1441,14 @@
           <w:color w:val="8E8E93"/>
         </w:rPr>
         <w:tab/>
+      </w:r>
+      <w:r>
+        <w:rPr>
+          <w:rFonts w:ascii="Courier New" w:hAnsi="Courier New" w:cs="Courier New" w:eastAsia="Microsoft YaHei"/>
+          <w:b w:val="0"/>
+          <w:sz w:val="10"/>
+          <w:color w:val="8E8E93"/>
+        </w:rPr>
         <w:t>CH.01 — SAFETY</w:t>
       </w:r>
     </w:p>
@@ -1543,8 +1459,6 @@
         </w:pBdr>
         <w:spacing w:after="120" w:line="240" w:lineRule="auto"/>
         <w:ind w:left="85"/>
-        <w:autoSpaceDE w:val="0"/>
-        <w:autoSpaceDN w:val="0"/>
       </w:pPr>
       <w:r>
         <w:rPr>
@@ -1606,8 +1520,6 @@
           <w:p>
             <w:pPr>
               <w:spacing w:after="20" w:before="0" w:line="278" w:lineRule="auto"/>
-              <w:autoSpaceDE w:val="0"/>
-              <w:autoSpaceDN w:val="0"/>
             </w:pPr>
             <w:r>
               <w:rPr>
@@ -1624,8 +1536,6 @@
             <w:pPr>
               <w:spacing w:before="0" w:after="27" w:line="230" w:lineRule="auto"/>
               <w:ind w:left="266" w:hanging="266"/>
-              <w:autoSpaceDE w:val="0"/>
-              <w:autoSpaceDN w:val="0"/>
             </w:pPr>
             <w:r>
               <w:rPr>
@@ -1652,8 +1562,6 @@
             <w:pPr>
               <w:spacing w:before="0" w:after="27" w:line="230" w:lineRule="auto"/>
               <w:ind w:left="266" w:hanging="266"/>
-              <w:autoSpaceDE w:val="0"/>
-              <w:autoSpaceDN w:val="0"/>
             </w:pPr>
             <w:r>
               <w:rPr>
@@ -1680,8 +1588,6 @@
             <w:pPr>
               <w:spacing w:before="0" w:after="27" w:line="230" w:lineRule="auto"/>
               <w:ind w:left="266" w:hanging="266"/>
-              <w:autoSpaceDE w:val="0"/>
-              <w:autoSpaceDN w:val="0"/>
             </w:pPr>
             <w:r>
               <w:rPr>
@@ -1708,8 +1614,6 @@
             <w:pPr>
               <w:spacing w:before="0" w:after="27" w:line="230" w:lineRule="auto"/>
               <w:ind w:left="266" w:hanging="266"/>
-              <w:autoSpaceDE w:val="0"/>
-              <w:autoSpaceDN w:val="0"/>
             </w:pPr>
             <w:r>
               <w:rPr>
@@ -1736,8 +1640,6 @@
             <w:pPr>
               <w:spacing w:before="0" w:after="27" w:line="230" w:lineRule="auto"/>
               <w:ind w:left="266" w:hanging="266"/>
-              <w:autoSpaceDE w:val="0"/>
-              <w:autoSpaceDN w:val="0"/>
             </w:pPr>
             <w:r>
               <w:rPr>
@@ -1764,8 +1666,6 @@
             <w:pPr>
               <w:spacing w:before="0" w:after="27" w:line="230" w:lineRule="auto"/>
               <w:ind w:left="266" w:hanging="266"/>
-              <w:autoSpaceDE w:val="0"/>
-              <w:autoSpaceDN w:val="0"/>
             </w:pPr>
             <w:r>
               <w:rPr>
@@ -1792,8 +1692,6 @@
             <w:pPr>
               <w:spacing w:before="0" w:after="27" w:line="230" w:lineRule="auto"/>
               <w:ind w:left="266" w:hanging="266"/>
-              <w:autoSpaceDE w:val="0"/>
-              <w:autoSpaceDN w:val="0"/>
             </w:pPr>
             <w:r>
               <w:rPr>
@@ -1822,8 +1720,6 @@
     <w:p>
       <w:pPr>
         <w:spacing w:after="40"/>
-        <w:autoSpaceDE w:val="0"/>
-        <w:autoSpaceDN w:val="0"/>
       </w:pPr>
     </w:p>
     <w:tbl>
@@ -1860,8 +1756,6 @@
           <w:p>
             <w:pPr>
               <w:spacing w:after="20" w:before="0" w:line="278" w:lineRule="auto"/>
-              <w:autoSpaceDE w:val="0"/>
-              <w:autoSpaceDN w:val="0"/>
             </w:pPr>
             <w:r>
               <w:rPr>
@@ -1878,8 +1772,6 @@
             <w:pPr>
               <w:spacing w:before="0" w:after="27" w:line="230" w:lineRule="auto"/>
               <w:ind w:left="266" w:hanging="266"/>
-              <w:autoSpaceDE w:val="0"/>
-              <w:autoSpaceDN w:val="0"/>
             </w:pPr>
             <w:r>
               <w:rPr>
@@ -1906,8 +1798,6 @@
             <w:pPr>
               <w:spacing w:before="0" w:after="27" w:line="230" w:lineRule="auto"/>
               <w:ind w:left="266" w:hanging="266"/>
-              <w:autoSpaceDE w:val="0"/>
-              <w:autoSpaceDN w:val="0"/>
             </w:pPr>
             <w:r>
               <w:rPr>
@@ -1936,21 +1826,17 @@
     <w:p>
       <w:pPr>
         <w:spacing w:after="40"/>
-        <w:autoSpaceDE w:val="0"/>
-        <w:autoSpaceDN w:val="0"/>
       </w:pPr>
     </w:p>
     <w:p>
       <w:pPr>
         <w:sectPr>
-          <w:footerReference w:type="default" ns5:id="rId14"/>
+          <w:footerReference w:type="default" r:id="rId14"/>
           <w:pgSz w:w="8391" w:h="11906"/>
           <w:pgMar w:top="578" w:right="567" w:bottom="567" w:left="567" w:header="227" w:footer="198" w:gutter="0"/>
           <w:cols w:space="720"/>
           <w:docGrid w:linePitch="360"/>
         </w:sectPr>
-        <w:autoSpaceDE w:val="0"/>
-        <w:autoSpaceDN w:val="0"/>
       </w:pPr>
     </w:p>
     <w:p>
@@ -1962,8 +1848,6 @@
           <w:tab w:pos="7257" w:val="right"/>
         </w:tabs>
         <w:spacing w:after="176" w:line="240" w:lineRule="auto"/>
-        <w:autoSpaceDE w:val="0"/>
-        <w:autoSpaceDN w:val="0"/>
       </w:pPr>
       <w:r>
         <w:rPr>
@@ -1983,6 +1867,14 @@
           <w:color w:val="8E8E93"/>
         </w:rPr>
         <w:tab/>
+      </w:r>
+      <w:r>
+        <w:rPr>
+          <w:rFonts w:ascii="Courier New" w:hAnsi="Courier New" w:cs="Courier New" w:eastAsia="Microsoft YaHei"/>
+          <w:b w:val="0"/>
+          <w:sz w:val="10"/>
+          <w:color w:val="8E8E93"/>
+        </w:rPr>
         <w:t>CH.02 — USAGE TIPS</w:t>
       </w:r>
     </w:p>
@@ -1993,8 +1885,6 @@
         </w:pBdr>
         <w:spacing w:after="120" w:line="240" w:lineRule="auto"/>
         <w:ind w:left="85"/>
-        <w:autoSpaceDE w:val="0"/>
-        <w:autoSpaceDN w:val="0"/>
       </w:pPr>
       <w:r>
         <w:rPr>
@@ -2023,8 +1913,6 @@
         <w:pBdr>
           <w:bottom w:val="single" w:sz="6" w:space="1" w:color="000000"/>
         </w:pBdr>
-        <w:autoSpaceDE w:val="0"/>
-        <w:autoSpaceDN w:val="0"/>
       </w:pPr>
       <w:r>
         <w:rPr>
@@ -2041,8 +1929,6 @@
       <w:pPr>
         <w:spacing w:before="0" w:after="32" w:line="271" w:lineRule="auto"/>
         <w:ind w:left="181" w:hanging="181"/>
-        <w:autoSpaceDE w:val="0"/>
-        <w:autoSpaceDN w:val="0"/>
       </w:pPr>
       <w:r>
         <w:rPr>
@@ -2069,8 +1955,6 @@
       <w:pPr>
         <w:spacing w:before="0" w:after="32" w:line="271" w:lineRule="auto"/>
         <w:ind w:left="181" w:hanging="181"/>
-        <w:autoSpaceDE w:val="0"/>
-        <w:autoSpaceDN w:val="0"/>
       </w:pPr>
       <w:r>
         <w:rPr>
@@ -2097,8 +1981,6 @@
       <w:pPr>
         <w:spacing w:before="0" w:after="32" w:line="271" w:lineRule="auto"/>
         <w:ind w:left="181" w:hanging="181"/>
-        <w:autoSpaceDE w:val="0"/>
-        <w:autoSpaceDN w:val="0"/>
       </w:pPr>
       <w:r>
         <w:rPr>
@@ -2125,8 +2007,6 @@
       <w:pPr>
         <w:spacing w:before="0" w:after="32" w:line="271" w:lineRule="auto"/>
         <w:ind w:left="181" w:hanging="181"/>
-        <w:autoSpaceDE w:val="0"/>
-        <w:autoSpaceDN w:val="0"/>
       </w:pPr>
       <w:r>
         <w:rPr>
@@ -2153,8 +2033,6 @@
       <w:pPr>
         <w:spacing w:before="0" w:after="32" w:line="271" w:lineRule="auto"/>
         <w:ind w:left="181" w:hanging="181"/>
-        <w:autoSpaceDE w:val="0"/>
-        <w:autoSpaceDN w:val="0"/>
       </w:pPr>
       <w:r>
         <w:rPr>
@@ -2183,8 +2061,6 @@
         <w:pBdr>
           <w:bottom w:val="single" w:sz="6" w:space="1" w:color="000000"/>
         </w:pBdr>
-        <w:autoSpaceDE w:val="0"/>
-        <w:autoSpaceDN w:val="0"/>
       </w:pPr>
       <w:r>
         <w:rPr>
@@ -2201,8 +2077,6 @@
       <w:pPr>
         <w:spacing w:before="0" w:after="32" w:line="271" w:lineRule="auto"/>
         <w:ind w:left="181" w:hanging="181"/>
-        <w:autoSpaceDE w:val="0"/>
-        <w:autoSpaceDN w:val="0"/>
       </w:pPr>
       <w:r>
         <w:rPr>
@@ -2229,8 +2103,6 @@
       <w:pPr>
         <w:spacing w:before="0" w:after="32" w:line="271" w:lineRule="auto"/>
         <w:ind w:left="181" w:hanging="181"/>
-        <w:autoSpaceDE w:val="0"/>
-        <w:autoSpaceDN w:val="0"/>
       </w:pPr>
       <w:r>
         <w:rPr>
@@ -2257,8 +2129,6 @@
       <w:pPr>
         <w:spacing w:before="0" w:after="32" w:line="271" w:lineRule="auto"/>
         <w:ind w:left="181" w:hanging="181"/>
-        <w:autoSpaceDE w:val="0"/>
-        <w:autoSpaceDN w:val="0"/>
       </w:pPr>
       <w:r>
         <w:rPr>
@@ -2285,8 +2155,6 @@
       <w:pPr>
         <w:spacing w:before="0" w:after="32" w:line="271" w:lineRule="auto"/>
         <w:ind w:left="181" w:hanging="181"/>
-        <w:autoSpaceDE w:val="0"/>
-        <w:autoSpaceDN w:val="0"/>
       </w:pPr>
       <w:r>
         <w:rPr>
@@ -2325,8 +2193,6 @@
         <w:pBdr>
           <w:bottom w:val="single" w:sz="6" w:space="1" w:color="000000"/>
         </w:pBdr>
-        <w:autoSpaceDE w:val="0"/>
-        <w:autoSpaceDN w:val="0"/>
       </w:pPr>
       <w:r>
         <w:rPr>
@@ -2343,8 +2209,6 @@
       <w:pPr>
         <w:spacing w:before="0" w:after="32" w:line="271" w:lineRule="auto"/>
         <w:ind w:left="181" w:hanging="181"/>
-        <w:autoSpaceDE w:val="0"/>
-        <w:autoSpaceDN w:val="0"/>
       </w:pPr>
       <w:r>
         <w:rPr>
@@ -2371,8 +2235,6 @@
       <w:pPr>
         <w:spacing w:before="0" w:after="32" w:line="271" w:lineRule="auto"/>
         <w:ind w:left="181" w:hanging="181"/>
-        <w:autoSpaceDE w:val="0"/>
-        <w:autoSpaceDN w:val="0"/>
       </w:pPr>
       <w:r>
         <w:rPr>
@@ -2399,8 +2261,6 @@
       <w:pPr>
         <w:spacing w:before="0" w:after="32" w:line="271" w:lineRule="auto"/>
         <w:ind w:left="181" w:hanging="181"/>
-        <w:autoSpaceDE w:val="0"/>
-        <w:autoSpaceDN w:val="0"/>
       </w:pPr>
       <w:r>
         <w:rPr>
@@ -2427,8 +2287,6 @@
       <w:pPr>
         <w:spacing w:before="0" w:after="32" w:line="271" w:lineRule="auto"/>
         <w:ind w:left="181" w:hanging="181"/>
-        <w:autoSpaceDE w:val="0"/>
-        <w:autoSpaceDN w:val="0"/>
       </w:pPr>
       <w:r>
         <w:rPr>
@@ -2454,14 +2312,12 @@
     <w:p>
       <w:pPr>
         <w:sectPr>
-          <w:footerReference w:type="default" ns5:id="rId15"/>
+          <w:footerReference w:type="default" r:id="rId15"/>
           <w:pgSz w:w="8391" w:h="11906"/>
           <w:pgMar w:top="578" w:right="567" w:bottom="567" w:left="567" w:header="227" w:footer="198" w:gutter="0"/>
           <w:cols w:space="720"/>
           <w:docGrid w:linePitch="360"/>
         </w:sectPr>
-        <w:autoSpaceDE w:val="0"/>
-        <w:autoSpaceDN w:val="0"/>
       </w:pPr>
     </w:p>
     <w:p>
@@ -2473,8 +2329,6 @@
           <w:tab w:pos="7257" w:val="right"/>
         </w:tabs>
         <w:spacing w:after="176" w:line="240" w:lineRule="auto"/>
-        <w:autoSpaceDE w:val="0"/>
-        <w:autoSpaceDN w:val="0"/>
       </w:pPr>
       <w:r>
         <w:rPr>
@@ -2494,6 +2348,14 @@
           <w:color w:val="8E8E93"/>
         </w:rPr>
         <w:tab/>
+      </w:r>
+      <w:r>
+        <w:rPr>
+          <w:rFonts w:ascii="Courier New" w:hAnsi="Courier New" w:cs="Courier New" w:eastAsia="Microsoft YaHei"/>
+          <w:b w:val="0"/>
+          <w:sz w:val="10"/>
+          <w:color w:val="8E8E93"/>
+        </w:rPr>
         <w:t>CH.03 — STRUCTURE</w:t>
       </w:r>
     </w:p>
@@ -2504,8 +2366,6 @@
         </w:pBdr>
         <w:spacing w:after="120" w:line="240" w:lineRule="auto"/>
         <w:ind w:left="85"/>
-        <w:autoSpaceDE w:val="0"/>
-        <w:autoSpaceDN w:val="0"/>
       </w:pPr>
       <w:r>
         <w:rPr>
@@ -2532,41 +2392,39 @@
       <w:pPr>
         <w:spacing w:after="160"/>
         <w:jc w:val="center"/>
-        <w:autoSpaceDE w:val="0"/>
-        <w:autoSpaceDN w:val="0"/>
       </w:pPr>
       <w:r>
         <w:drawing>
-          <ns2:inline>
-            <ns2:extent cx="2522416" cy="2592000"/>
-            <ns2:docPr id="3" name="Picture 3"/>
-            <ns2:cNvGraphicFramePr>
-              <ns3:graphicFrameLocks noChangeAspect="1"/>
-            </ns2:cNvGraphicFramePr>
-            <ns3:graphic>
-              <ns3:graphicData uri="http://schemas.openxmlformats.org/drawingml/2006/picture">
-                <ns4:pic>
-                  <ns4:nvPicPr>
-                    <ns4:cNvPr id="0" name="image5.png"/>
-                    <ns4:cNvPicPr/>
-                  </ns4:nvPicPr>
-                  <ns4:blipFill>
-                    <ns3:blip ns5:embed="rId17"/>
-                    <ns3:stretch>
-                      <ns3:fillRect/>
-                    </ns3:stretch>
-                  </ns4:blipFill>
-                  <ns4:spPr>
-                    <ns3:xfrm>
-                      <ns3:off x="0" y="0"/>
-                      <ns3:ext cx="2522416" cy="2592000"/>
-                    </ns3:xfrm>
-                    <ns3:prstGeom prst="rect"/>
-                  </ns4:spPr>
-                </ns4:pic>
-              </ns3:graphicData>
-            </ns3:graphic>
-          </ns2:inline>
+          <wp:inline xmlns:a="http://schemas.openxmlformats.org/drawingml/2006/main" xmlns:pic="http://schemas.openxmlformats.org/drawingml/2006/picture">
+            <wp:extent cx="2522416" cy="2592000"/>
+            <wp:docPr id="3" name="Picture 3"/>
+            <wp:cNvGraphicFramePr>
+              <a:graphicFrameLocks noChangeAspect="1"/>
+            </wp:cNvGraphicFramePr>
+            <a:graphic>
+              <a:graphicData uri="http://schemas.openxmlformats.org/drawingml/2006/picture">
+                <pic:pic>
+                  <pic:nvPicPr>
+                    <pic:cNvPr id="0" name="image5.png"/>
+                    <pic:cNvPicPr/>
+                  </pic:nvPicPr>
+                  <pic:blipFill>
+                    <a:blip r:embed="rId17"/>
+                    <a:stretch>
+                      <a:fillRect/>
+                    </a:stretch>
+                  </pic:blipFill>
+                  <pic:spPr>
+                    <a:xfrm>
+                      <a:off x="0" y="0"/>
+                      <a:ext cx="2522416" cy="2592000"/>
+                    </a:xfrm>
+                    <a:prstGeom prst="rect"/>
+                  </pic:spPr>
+                </pic:pic>
+              </a:graphicData>
+            </a:graphic>
+          </wp:inline>
         </w:drawing>
       </w:r>
     </w:p>
@@ -2618,8 +2476,6 @@
             <w:pPr>
               <w:spacing w:after="0" w:line="240" w:lineRule="auto"/>
               <w:jc w:val="left"/>
-              <w:autoSpaceDE w:val="0"/>
-              <w:autoSpaceDN w:val="0"/>
             </w:pPr>
             <w:r>
               <w:rPr>
@@ -2656,8 +2512,6 @@
             <w:pPr>
               <w:spacing w:after="0" w:line="240" w:lineRule="auto"/>
               <w:jc w:val="left"/>
-              <w:autoSpaceDE w:val="0"/>
-              <w:autoSpaceDN w:val="0"/>
             </w:pPr>
             <w:r>
               <w:rPr>
@@ -2694,8 +2548,6 @@
             <w:pPr>
               <w:spacing w:after="0" w:line="240" w:lineRule="auto"/>
               <w:jc w:val="left"/>
-              <w:autoSpaceDE w:val="0"/>
-              <w:autoSpaceDN w:val="0"/>
             </w:pPr>
             <w:r>
               <w:rPr>
@@ -2732,8 +2584,6 @@
             <w:pPr>
               <w:spacing w:after="0" w:line="240" w:lineRule="auto"/>
               <w:jc w:val="left"/>
-              <w:autoSpaceDE w:val="0"/>
-              <w:autoSpaceDN w:val="0"/>
             </w:pPr>
             <w:r>
               <w:rPr>
@@ -2775,8 +2625,6 @@
             <w:pPr>
               <w:spacing w:after="0" w:line="240" w:lineRule="auto"/>
               <w:jc w:val="left"/>
-              <w:autoSpaceDE w:val="0"/>
-              <w:autoSpaceDN w:val="0"/>
             </w:pPr>
             <w:r>
               <w:rPr>
@@ -2813,8 +2661,6 @@
             <w:pPr>
               <w:spacing w:after="0" w:line="240" w:lineRule="auto"/>
               <w:jc w:val="left"/>
-              <w:autoSpaceDE w:val="0"/>
-              <w:autoSpaceDN w:val="0"/>
             </w:pPr>
             <w:r>
               <w:rPr>
@@ -2851,8 +2697,6 @@
             <w:pPr>
               <w:spacing w:after="0" w:line="240" w:lineRule="auto"/>
               <w:jc w:val="left"/>
-              <w:autoSpaceDE w:val="0"/>
-              <w:autoSpaceDN w:val="0"/>
             </w:pPr>
             <w:r>
               <w:rPr>
@@ -2889,8 +2733,6 @@
             <w:pPr>
               <w:spacing w:after="0" w:line="240" w:lineRule="auto"/>
               <w:jc w:val="left"/>
-              <w:autoSpaceDE w:val="0"/>
-              <w:autoSpaceDN w:val="0"/>
             </w:pPr>
             <w:r>
               <w:rPr>
@@ -2932,8 +2774,6 @@
             <w:pPr>
               <w:spacing w:after="0" w:line="240" w:lineRule="auto"/>
               <w:jc w:val="left"/>
-              <w:autoSpaceDE w:val="0"/>
-              <w:autoSpaceDN w:val="0"/>
             </w:pPr>
             <w:r>
               <w:rPr>
@@ -2970,8 +2810,6 @@
             <w:pPr>
               <w:spacing w:after="0" w:line="240" w:lineRule="auto"/>
               <w:jc w:val="left"/>
-              <w:autoSpaceDE w:val="0"/>
-              <w:autoSpaceDN w:val="0"/>
             </w:pPr>
             <w:r>
               <w:rPr>
@@ -3008,8 +2846,6 @@
             <w:pPr>
               <w:spacing w:after="0" w:line="240" w:lineRule="auto"/>
               <w:jc w:val="left"/>
-              <w:autoSpaceDE w:val="0"/>
-              <w:autoSpaceDN w:val="0"/>
             </w:pPr>
             <w:r>
               <w:rPr>
@@ -3046,8 +2882,6 @@
             <w:pPr>
               <w:spacing w:after="0" w:line="240" w:lineRule="auto"/>
               <w:jc w:val="left"/>
-              <w:autoSpaceDE w:val="0"/>
-              <w:autoSpaceDN w:val="0"/>
             </w:pPr>
             <w:r>
               <w:rPr>
@@ -3089,8 +2923,6 @@
             <w:pPr>
               <w:spacing w:after="0" w:line="240" w:lineRule="auto"/>
               <w:jc w:val="left"/>
-              <w:autoSpaceDE w:val="0"/>
-              <w:autoSpaceDN w:val="0"/>
             </w:pPr>
             <w:r>
               <w:rPr>
@@ -3127,8 +2959,6 @@
             <w:pPr>
               <w:spacing w:after="0" w:line="240" w:lineRule="auto"/>
               <w:jc w:val="left"/>
-              <w:autoSpaceDE w:val="0"/>
-              <w:autoSpaceDN w:val="0"/>
             </w:pPr>
             <w:r>
               <w:rPr>
@@ -3165,8 +2995,6 @@
             <w:pPr>
               <w:spacing w:after="0" w:line="240" w:lineRule="auto"/>
               <w:jc w:val="left"/>
-              <w:autoSpaceDE w:val="0"/>
-              <w:autoSpaceDN w:val="0"/>
             </w:pPr>
             <w:r>
               <w:rPr>
@@ -3203,8 +3031,6 @@
             <w:pPr>
               <w:spacing w:after="0" w:line="240" w:lineRule="auto"/>
               <w:jc w:val="left"/>
-              <w:autoSpaceDE w:val="0"/>
-              <w:autoSpaceDN w:val="0"/>
             </w:pPr>
             <w:r>
               <w:rPr>
@@ -3246,8 +3072,6 @@
             <w:pPr>
               <w:spacing w:after="0" w:line="240" w:lineRule="auto"/>
               <w:jc w:val="left"/>
-              <w:autoSpaceDE w:val="0"/>
-              <w:autoSpaceDN w:val="0"/>
             </w:pPr>
             <w:r>
               <w:rPr>
@@ -3284,8 +3108,6 @@
             <w:pPr>
               <w:spacing w:after="0" w:line="240" w:lineRule="auto"/>
               <w:jc w:val="left"/>
-              <w:autoSpaceDE w:val="0"/>
-              <w:autoSpaceDN w:val="0"/>
             </w:pPr>
             <w:r>
               <w:rPr>
@@ -3322,8 +3144,6 @@
             <w:pPr>
               <w:spacing w:after="0" w:line="240" w:lineRule="auto"/>
               <w:jc w:val="left"/>
-              <w:autoSpaceDE w:val="0"/>
-              <w:autoSpaceDN w:val="0"/>
             </w:pPr>
             <w:r>
               <w:rPr>
@@ -3359,8 +3179,6 @@
             <w:pPr>
               <w:spacing w:after="0" w:line="240" w:lineRule="auto"/>
               <w:jc w:val="left"/>
-              <w:autoSpaceDE w:val="0"/>
-              <w:autoSpaceDN w:val="0"/>
             </w:pPr>
             <w:r>
               <w:rPr>
@@ -3378,14 +3196,12 @@
     <w:p>
       <w:pPr>
         <w:sectPr>
-          <w:footerReference w:type="default" ns5:id="rId16"/>
+          <w:footerReference w:type="default" r:id="rId16"/>
           <w:pgSz w:w="8391" w:h="11906"/>
           <w:pgMar w:top="578" w:right="567" w:bottom="567" w:left="567" w:header="227" w:footer="198" w:gutter="0"/>
           <w:cols w:space="720"/>
           <w:docGrid w:linePitch="360"/>
         </w:sectPr>
-        <w:autoSpaceDE w:val="0"/>
-        <w:autoSpaceDN w:val="0"/>
       </w:pPr>
     </w:p>
     <w:p>
@@ -3397,8 +3213,6 @@
           <w:tab w:pos="7257" w:val="right"/>
         </w:tabs>
         <w:spacing w:after="176" w:line="240" w:lineRule="auto"/>
-        <w:autoSpaceDE w:val="0"/>
-        <w:autoSpaceDN w:val="0"/>
       </w:pPr>
       <w:r>
         <w:rPr>
@@ -3418,6 +3232,14 @@
           <w:color w:val="8E8E93"/>
         </w:rPr>
         <w:tab/>
+      </w:r>
+      <w:r>
+        <w:rPr>
+          <w:rFonts w:ascii="Courier New" w:hAnsi="Courier New" w:cs="Courier New" w:eastAsia="Microsoft YaHei"/>
+          <w:b w:val="0"/>
+          <w:sz w:val="10"/>
+          <w:color w:val="8E8E93"/>
+        </w:rPr>
         <w:t>CH.04 — FEATURES</w:t>
       </w:r>
     </w:p>
@@ -3428,8 +3250,6 @@
         </w:pBdr>
         <w:spacing w:after="120" w:line="240" w:lineRule="auto"/>
         <w:ind w:left="85"/>
-        <w:autoSpaceDE w:val="0"/>
-        <w:autoSpaceDN w:val="0"/>
       </w:pPr>
       <w:r>
         <w:rPr>
@@ -3456,41 +3276,39 @@
       <w:pPr>
         <w:spacing w:after="160"/>
         <w:jc w:val="center"/>
-        <w:autoSpaceDE w:val="0"/>
-        <w:autoSpaceDN w:val="0"/>
       </w:pPr>
       <w:r>
         <w:drawing>
-          <ns2:inline>
-            <ns2:extent cx="1291484" cy="1296000"/>
-            <ns2:docPr id="4" name="Picture 4"/>
-            <ns2:cNvGraphicFramePr>
-              <ns3:graphicFrameLocks noChangeAspect="1"/>
-            </ns2:cNvGraphicFramePr>
-            <ns3:graphic>
-              <ns3:graphicData uri="http://schemas.openxmlformats.org/drawingml/2006/picture">
-                <ns4:pic>
-                  <ns4:nvPicPr>
-                    <ns4:cNvPr id="0" name="image7.png"/>
-                    <ns4:cNvPicPr/>
-                  </ns4:nvPicPr>
-                  <ns4:blipFill>
-                    <ns3:blip ns5:embed="rId19"/>
-                    <ns3:stretch>
-                      <ns3:fillRect/>
-                    </ns3:stretch>
-                  </ns4:blipFill>
-                  <ns4:spPr>
-                    <ns3:xfrm>
-                      <ns3:off x="0" y="0"/>
-                      <ns3:ext cx="1291484" cy="1296000"/>
-                    </ns3:xfrm>
-                    <ns3:prstGeom prst="rect"/>
-                  </ns4:spPr>
-                </ns4:pic>
-              </ns3:graphicData>
-            </ns3:graphic>
-          </ns2:inline>
+          <wp:inline xmlns:a="http://schemas.openxmlformats.org/drawingml/2006/main" xmlns:pic="http://schemas.openxmlformats.org/drawingml/2006/picture">
+            <wp:extent cx="1291484" cy="1296000"/>
+            <wp:docPr id="4" name="Picture 4"/>
+            <wp:cNvGraphicFramePr>
+              <a:graphicFrameLocks noChangeAspect="1"/>
+            </wp:cNvGraphicFramePr>
+            <a:graphic>
+              <a:graphicData uri="http://schemas.openxmlformats.org/drawingml/2006/picture">
+                <pic:pic>
+                  <pic:nvPicPr>
+                    <pic:cNvPr id="0" name="image7.png"/>
+                    <pic:cNvPicPr/>
+                  </pic:nvPicPr>
+                  <pic:blipFill>
+                    <a:blip r:embed="rId19"/>
+                    <a:stretch>
+                      <a:fillRect/>
+                    </a:stretch>
+                  </pic:blipFill>
+                  <pic:spPr>
+                    <a:xfrm>
+                      <a:off x="0" y="0"/>
+                      <a:ext cx="1291484" cy="1296000"/>
+                    </a:xfrm>
+                    <a:prstGeom prst="rect"/>
+                  </pic:spPr>
+                </pic:pic>
+              </a:graphicData>
+            </a:graphic>
+          </wp:inline>
         </w:drawing>
       </w:r>
     </w:p>
@@ -3498,41 +3316,39 @@
       <w:pPr>
         <w:spacing w:after="160"/>
         <w:jc w:val="center"/>
-        <w:autoSpaceDE w:val="0"/>
-        <w:autoSpaceDN w:val="0"/>
       </w:pPr>
       <w:r>
         <w:drawing>
-          <ns2:inline>
-            <ns2:extent cx="2635714" cy="1080000"/>
-            <ns2:docPr id="5" name="Picture 5"/>
-            <ns2:cNvGraphicFramePr>
-              <ns3:graphicFrameLocks noChangeAspect="1"/>
-            </ns2:cNvGraphicFramePr>
-            <ns3:graphic>
-              <ns3:graphicData uri="http://schemas.openxmlformats.org/drawingml/2006/picture">
-                <ns4:pic>
-                  <ns4:nvPicPr>
-                    <ns4:cNvPr id="0" name="image9.png"/>
-                    <ns4:cNvPicPr/>
-                  </ns4:nvPicPr>
-                  <ns4:blipFill>
-                    <ns3:blip ns5:embed="rId20"/>
-                    <ns3:stretch>
-                      <ns3:fillRect/>
-                    </ns3:stretch>
-                  </ns4:blipFill>
-                  <ns4:spPr>
-                    <ns3:xfrm>
-                      <ns3:off x="0" y="0"/>
-                      <ns3:ext cx="2635714" cy="1080000"/>
-                    </ns3:xfrm>
-                    <ns3:prstGeom prst="rect"/>
-                  </ns4:spPr>
-                </ns4:pic>
-              </ns3:graphicData>
-            </ns3:graphic>
-          </ns2:inline>
+          <wp:inline xmlns:a="http://schemas.openxmlformats.org/drawingml/2006/main" xmlns:pic="http://schemas.openxmlformats.org/drawingml/2006/picture">
+            <wp:extent cx="2635714" cy="1080000"/>
+            <wp:docPr id="5" name="Picture 5"/>
+            <wp:cNvGraphicFramePr>
+              <a:graphicFrameLocks noChangeAspect="1"/>
+            </wp:cNvGraphicFramePr>
+            <a:graphic>
+              <a:graphicData uri="http://schemas.openxmlformats.org/drawingml/2006/picture">
+                <pic:pic>
+                  <pic:nvPicPr>
+                    <pic:cNvPr id="0" name="image9.png"/>
+                    <pic:cNvPicPr/>
+                  </pic:nvPicPr>
+                  <pic:blipFill>
+                    <a:blip r:embed="rId20"/>
+                    <a:stretch>
+                      <a:fillRect/>
+                    </a:stretch>
+                  </pic:blipFill>
+                  <pic:spPr>
+                    <a:xfrm>
+                      <a:off x="0" y="0"/>
+                      <a:ext cx="2635714" cy="1080000"/>
+                    </a:xfrm>
+                    <a:prstGeom prst="rect"/>
+                  </pic:spPr>
+                </pic:pic>
+              </a:graphicData>
+            </a:graphic>
+          </wp:inline>
         </w:drawing>
       </w:r>
     </w:p>
@@ -3582,8 +3398,6 @@
             <w:pPr>
               <w:spacing w:after="0" w:line="240" w:lineRule="auto"/>
               <w:jc w:val="left"/>
-              <w:autoSpaceDE w:val="0"/>
-              <w:autoSpaceDN w:val="0"/>
             </w:pPr>
             <w:r>
               <w:rPr>
@@ -3620,8 +3434,6 @@
             <w:pPr>
               <w:spacing w:after="0" w:line="240" w:lineRule="auto"/>
               <w:jc w:val="left"/>
-              <w:autoSpaceDE w:val="0"/>
-              <w:autoSpaceDN w:val="0"/>
             </w:pPr>
             <w:r>
               <w:rPr>
@@ -3663,8 +3475,6 @@
             <w:pPr>
               <w:spacing w:after="0" w:line="240" w:lineRule="auto"/>
               <w:jc w:val="left"/>
-              <w:autoSpaceDE w:val="0"/>
-              <w:autoSpaceDN w:val="0"/>
             </w:pPr>
             <w:r>
               <w:rPr>
@@ -3705,8 +3515,6 @@
             <w:pPr>
               <w:spacing w:after="0" w:line="240" w:lineRule="auto"/>
               <w:jc w:val="left"/>
-              <w:autoSpaceDE w:val="0"/>
-              <w:autoSpaceDN w:val="0"/>
             </w:pPr>
             <w:r>
               <w:rPr>
@@ -3748,8 +3556,6 @@
             <w:pPr>
               <w:spacing w:after="0" w:line="240" w:lineRule="auto"/>
               <w:jc w:val="left"/>
-              <w:autoSpaceDE w:val="0"/>
-              <w:autoSpaceDN w:val="0"/>
             </w:pPr>
             <w:r>
               <w:rPr>
@@ -3790,8 +3596,6 @@
             <w:pPr>
               <w:spacing w:after="0" w:line="240" w:lineRule="auto"/>
               <w:jc w:val="left"/>
-              <w:autoSpaceDE w:val="0"/>
-              <w:autoSpaceDN w:val="0"/>
             </w:pPr>
             <w:r>
               <w:rPr>
@@ -3833,8 +3637,6 @@
             <w:pPr>
               <w:spacing w:after="0" w:line="240" w:lineRule="auto"/>
               <w:jc w:val="left"/>
-              <w:autoSpaceDE w:val="0"/>
-              <w:autoSpaceDN w:val="0"/>
             </w:pPr>
             <w:r>
               <w:rPr>
@@ -3875,8 +3677,6 @@
             <w:pPr>
               <w:spacing w:after="0" w:line="240" w:lineRule="auto"/>
               <w:jc w:val="left"/>
-              <w:autoSpaceDE w:val="0"/>
-              <w:autoSpaceDN w:val="0"/>
             </w:pPr>
             <w:r>
               <w:rPr>
@@ -3918,8 +3718,6 @@
             <w:pPr>
               <w:spacing w:after="0" w:line="240" w:lineRule="auto"/>
               <w:jc w:val="left"/>
-              <w:autoSpaceDE w:val="0"/>
-              <w:autoSpaceDN w:val="0"/>
             </w:pPr>
             <w:r>
               <w:rPr>
@@ -3960,8 +3758,6 @@
             <w:pPr>
               <w:spacing w:after="0" w:line="240" w:lineRule="auto"/>
               <w:jc w:val="left"/>
-              <w:autoSpaceDE w:val="0"/>
-              <w:autoSpaceDN w:val="0"/>
             </w:pPr>
             <w:r>
               <w:rPr>
@@ -4003,8 +3799,6 @@
             <w:pPr>
               <w:spacing w:after="0" w:line="240" w:lineRule="auto"/>
               <w:jc w:val="left"/>
-              <w:autoSpaceDE w:val="0"/>
-              <w:autoSpaceDN w:val="0"/>
             </w:pPr>
             <w:r>
               <w:rPr>
@@ -4045,8 +3839,6 @@
             <w:pPr>
               <w:spacing w:after="0" w:line="240" w:lineRule="auto"/>
               <w:jc w:val="left"/>
-              <w:autoSpaceDE w:val="0"/>
-              <w:autoSpaceDN w:val="0"/>
             </w:pPr>
             <w:r>
               <w:rPr>
@@ -4065,14 +3857,12 @@
     <w:p>
       <w:pPr>
         <w:sectPr>
-          <w:footerReference w:type="default" ns5:id="rId18"/>
+          <w:footerReference w:type="default" r:id="rId18"/>
           <w:pgSz w:w="8391" w:h="11906"/>
           <w:pgMar w:top="578" w:right="567" w:bottom="567" w:left="567" w:header="227" w:footer="198" w:gutter="0"/>
           <w:cols w:space="720"/>
           <w:docGrid w:linePitch="360"/>
         </w:sectPr>
-        <w:autoSpaceDE w:val="0"/>
-        <w:autoSpaceDN w:val="0"/>
       </w:pPr>
     </w:p>
     <w:p>
@@ -4084,8 +3874,6 @@
           <w:tab w:pos="7257" w:val="right"/>
         </w:tabs>
         <w:spacing w:after="176" w:line="240" w:lineRule="auto"/>
-        <w:autoSpaceDE w:val="0"/>
-        <w:autoSpaceDN w:val="0"/>
       </w:pPr>
       <w:r>
         <w:rPr>
@@ -4105,6 +3893,14 @@
           <w:color w:val="8E8E93"/>
         </w:rPr>
         <w:tab/>
+      </w:r>
+      <w:r>
+        <w:rPr>
+          <w:rFonts w:ascii="Courier New" w:hAnsi="Courier New" w:cs="Courier New" w:eastAsia="Microsoft YaHei"/>
+          <w:b w:val="0"/>
+          <w:sz w:val="10"/>
+          <w:color w:val="8E8E93"/>
+        </w:rPr>
         <w:t>CH.05 — SPECIFICATIONS</w:t>
       </w:r>
     </w:p>
@@ -4115,8 +3911,6 @@
         </w:pBdr>
         <w:spacing w:after="120" w:line="240" w:lineRule="auto"/>
         <w:ind w:left="85"/>
-        <w:autoSpaceDE w:val="0"/>
-        <w:autoSpaceDN w:val="0"/>
       </w:pPr>
       <w:r>
         <w:rPr>
@@ -4185,8 +3979,6 @@
             <w:pPr>
               <w:spacing w:after="0" w:line="240" w:lineRule="auto"/>
               <w:jc w:val="left"/>
-              <w:autoSpaceDE w:val="0"/>
-              <w:autoSpaceDN w:val="0"/>
             </w:pPr>
             <w:r>
               <w:rPr>
@@ -4223,8 +4015,6 @@
             <w:pPr>
               <w:spacing w:after="0" w:line="240" w:lineRule="auto"/>
               <w:jc w:val="left"/>
-              <w:autoSpaceDE w:val="0"/>
-              <w:autoSpaceDN w:val="0"/>
             </w:pPr>
             <w:r>
               <w:rPr>
@@ -4266,8 +4056,6 @@
             <w:pPr>
               <w:spacing w:after="0" w:line="240" w:lineRule="auto"/>
               <w:jc w:val="left"/>
-              <w:autoSpaceDE w:val="0"/>
-              <w:autoSpaceDN w:val="0"/>
             </w:pPr>
             <w:r>
               <w:rPr>
@@ -4304,8 +4092,6 @@
             <w:pPr>
               <w:spacing w:after="0" w:line="240" w:lineRule="auto"/>
               <w:jc w:val="left"/>
-              <w:autoSpaceDE w:val="0"/>
-              <w:autoSpaceDN w:val="0"/>
             </w:pPr>
             <w:r>
               <w:rPr>
@@ -4347,8 +4133,6 @@
             <w:pPr>
               <w:spacing w:after="0" w:line="240" w:lineRule="auto"/>
               <w:jc w:val="left"/>
-              <w:autoSpaceDE w:val="0"/>
-              <w:autoSpaceDN w:val="0"/>
             </w:pPr>
             <w:r>
               <w:rPr>
@@ -4385,8 +4169,6 @@
             <w:pPr>
               <w:spacing w:after="0" w:line="240" w:lineRule="auto"/>
               <w:jc w:val="left"/>
-              <w:autoSpaceDE w:val="0"/>
-              <w:autoSpaceDN w:val="0"/>
             </w:pPr>
             <w:r>
               <w:rPr>
@@ -4428,8 +4210,6 @@
             <w:pPr>
               <w:spacing w:after="0" w:line="240" w:lineRule="auto"/>
               <w:jc w:val="left"/>
-              <w:autoSpaceDE w:val="0"/>
-              <w:autoSpaceDN w:val="0"/>
             </w:pPr>
             <w:r>
               <w:rPr>
@@ -4466,8 +4246,6 @@
             <w:pPr>
               <w:spacing w:after="0" w:line="240" w:lineRule="auto"/>
               <w:jc w:val="left"/>
-              <w:autoSpaceDE w:val="0"/>
-              <w:autoSpaceDN w:val="0"/>
             </w:pPr>
             <w:r>
               <w:rPr>
@@ -4509,8 +4287,6 @@
             <w:pPr>
               <w:spacing w:after="0" w:line="240" w:lineRule="auto"/>
               <w:jc w:val="left"/>
-              <w:autoSpaceDE w:val="0"/>
-              <w:autoSpaceDN w:val="0"/>
             </w:pPr>
             <w:r>
               <w:rPr>
@@ -4547,8 +4323,6 @@
             <w:pPr>
               <w:spacing w:after="0" w:line="240" w:lineRule="auto"/>
               <w:jc w:val="left"/>
-              <w:autoSpaceDE w:val="0"/>
-              <w:autoSpaceDN w:val="0"/>
             </w:pPr>
             <w:r>
               <w:rPr>
@@ -4590,8 +4364,6 @@
             <w:pPr>
               <w:spacing w:after="0" w:line="240" w:lineRule="auto"/>
               <w:jc w:val="left"/>
-              <w:autoSpaceDE w:val="0"/>
-              <w:autoSpaceDN w:val="0"/>
             </w:pPr>
             <w:r>
               <w:rPr>
@@ -4628,8 +4400,6 @@
             <w:pPr>
               <w:spacing w:after="0" w:line="240" w:lineRule="auto"/>
               <w:jc w:val="left"/>
-              <w:autoSpaceDE w:val="0"/>
-              <w:autoSpaceDN w:val="0"/>
             </w:pPr>
             <w:r>
               <w:rPr>
@@ -4671,8 +4441,6 @@
             <w:pPr>
               <w:spacing w:after="0" w:line="240" w:lineRule="auto"/>
               <w:jc w:val="left"/>
-              <w:autoSpaceDE w:val="0"/>
-              <w:autoSpaceDN w:val="0"/>
             </w:pPr>
             <w:r>
               <w:rPr>
@@ -4709,8 +4477,6 @@
             <w:pPr>
               <w:spacing w:after="0" w:line="240" w:lineRule="auto"/>
               <w:jc w:val="left"/>
-              <w:autoSpaceDE w:val="0"/>
-              <w:autoSpaceDN w:val="0"/>
             </w:pPr>
             <w:r>
               <w:rPr>
@@ -4752,8 +4518,6 @@
             <w:pPr>
               <w:spacing w:after="0" w:line="240" w:lineRule="auto"/>
               <w:jc w:val="left"/>
-              <w:autoSpaceDE w:val="0"/>
-              <w:autoSpaceDN w:val="0"/>
             </w:pPr>
             <w:r>
               <w:rPr>
@@ -4790,8 +4554,6 @@
             <w:pPr>
               <w:spacing w:after="0" w:line="240" w:lineRule="auto"/>
               <w:jc w:val="left"/>
-              <w:autoSpaceDE w:val="0"/>
-              <w:autoSpaceDN w:val="0"/>
             </w:pPr>
             <w:r>
               <w:rPr>
@@ -4833,8 +4595,6 @@
             <w:pPr>
               <w:spacing w:after="0" w:line="240" w:lineRule="auto"/>
               <w:jc w:val="left"/>
-              <w:autoSpaceDE w:val="0"/>
-              <w:autoSpaceDN w:val="0"/>
             </w:pPr>
             <w:r>
               <w:rPr>
@@ -4871,8 +4631,6 @@
             <w:pPr>
               <w:spacing w:after="0" w:line="240" w:lineRule="auto"/>
               <w:jc w:val="left"/>
-              <w:autoSpaceDE w:val="0"/>
-              <w:autoSpaceDN w:val="0"/>
             </w:pPr>
             <w:r>
               <w:rPr>
@@ -4914,8 +4672,6 @@
             <w:pPr>
               <w:spacing w:after="0" w:line="240" w:lineRule="auto"/>
               <w:jc w:val="left"/>
-              <w:autoSpaceDE w:val="0"/>
-              <w:autoSpaceDN w:val="0"/>
             </w:pPr>
             <w:r>
               <w:rPr>
@@ -4952,8 +4708,6 @@
             <w:pPr>
               <w:spacing w:after="0" w:line="240" w:lineRule="auto"/>
               <w:jc w:val="left"/>
-              <w:autoSpaceDE w:val="0"/>
-              <w:autoSpaceDN w:val="0"/>
             </w:pPr>
             <w:r>
               <w:rPr>
@@ -4995,8 +4749,6 @@
             <w:pPr>
               <w:spacing w:after="0" w:line="240" w:lineRule="auto"/>
               <w:jc w:val="left"/>
-              <w:autoSpaceDE w:val="0"/>
-              <w:autoSpaceDN w:val="0"/>
             </w:pPr>
             <w:r>
               <w:rPr>
@@ -5033,8 +4785,6 @@
             <w:pPr>
               <w:spacing w:after="0" w:line="240" w:lineRule="auto"/>
               <w:jc w:val="left"/>
-              <w:autoSpaceDE w:val="0"/>
-              <w:autoSpaceDN w:val="0"/>
             </w:pPr>
             <w:r>
               <w:rPr>
@@ -5076,8 +4826,6 @@
             <w:pPr>
               <w:spacing w:after="0" w:line="240" w:lineRule="auto"/>
               <w:jc w:val="left"/>
-              <w:autoSpaceDE w:val="0"/>
-              <w:autoSpaceDN w:val="0"/>
             </w:pPr>
             <w:r>
               <w:rPr>
@@ -5114,8 +4862,6 @@
             <w:pPr>
               <w:spacing w:after="0" w:line="240" w:lineRule="auto"/>
               <w:jc w:val="left"/>
-              <w:autoSpaceDE w:val="0"/>
-              <w:autoSpaceDN w:val="0"/>
             </w:pPr>
             <w:r>
               <w:rPr>
@@ -5157,8 +4903,6 @@
             <w:pPr>
               <w:spacing w:after="0" w:line="240" w:lineRule="auto"/>
               <w:jc w:val="left"/>
-              <w:autoSpaceDE w:val="0"/>
-              <w:autoSpaceDN w:val="0"/>
             </w:pPr>
             <w:r>
               <w:rPr>
@@ -5195,8 +4939,6 @@
             <w:pPr>
               <w:spacing w:after="0" w:line="240" w:lineRule="auto"/>
               <w:jc w:val="left"/>
-              <w:autoSpaceDE w:val="0"/>
-              <w:autoSpaceDN w:val="0"/>
             </w:pPr>
             <w:r>
               <w:rPr>
@@ -5238,8 +4980,6 @@
             <w:pPr>
               <w:spacing w:after="0" w:line="240" w:lineRule="auto"/>
               <w:jc w:val="left"/>
-              <w:autoSpaceDE w:val="0"/>
-              <w:autoSpaceDN w:val="0"/>
             </w:pPr>
             <w:r>
               <w:rPr>
@@ -5276,8 +5016,6 @@
             <w:pPr>
               <w:spacing w:after="0" w:line="240" w:lineRule="auto"/>
               <w:jc w:val="left"/>
-              <w:autoSpaceDE w:val="0"/>
-              <w:autoSpaceDN w:val="0"/>
             </w:pPr>
             <w:r>
               <w:rPr>
@@ -5319,8 +5057,6 @@
             <w:pPr>
               <w:spacing w:after="0" w:line="240" w:lineRule="auto"/>
               <w:jc w:val="left"/>
-              <w:autoSpaceDE w:val="0"/>
-              <w:autoSpaceDN w:val="0"/>
             </w:pPr>
             <w:r>
               <w:rPr>
@@ -5357,8 +5093,6 @@
             <w:pPr>
               <w:spacing w:after="0" w:line="240" w:lineRule="auto"/>
               <w:jc w:val="left"/>
-              <w:autoSpaceDE w:val="0"/>
-              <w:autoSpaceDN w:val="0"/>
             </w:pPr>
             <w:r>
               <w:rPr>
@@ -5400,8 +5134,6 @@
             <w:pPr>
               <w:spacing w:after="0" w:line="240" w:lineRule="auto"/>
               <w:jc w:val="left"/>
-              <w:autoSpaceDE w:val="0"/>
-              <w:autoSpaceDN w:val="0"/>
             </w:pPr>
             <w:r>
               <w:rPr>
@@ -5438,8 +5170,6 @@
             <w:pPr>
               <w:spacing w:after="0" w:line="240" w:lineRule="auto"/>
               <w:jc w:val="left"/>
-              <w:autoSpaceDE w:val="0"/>
-              <w:autoSpaceDN w:val="0"/>
             </w:pPr>
             <w:r>
               <w:rPr>
@@ -5481,8 +5211,6 @@
             <w:pPr>
               <w:spacing w:after="0" w:line="240" w:lineRule="auto"/>
               <w:jc w:val="left"/>
-              <w:autoSpaceDE w:val="0"/>
-              <w:autoSpaceDN w:val="0"/>
             </w:pPr>
             <w:r>
               <w:rPr>
@@ -5519,8 +5247,6 @@
             <w:pPr>
               <w:spacing w:after="0" w:line="240" w:lineRule="auto"/>
               <w:jc w:val="left"/>
-              <w:autoSpaceDE w:val="0"/>
-              <w:autoSpaceDN w:val="0"/>
             </w:pPr>
             <w:r>
               <w:rPr>
@@ -5562,8 +5288,6 @@
             <w:pPr>
               <w:spacing w:after="0" w:line="240" w:lineRule="auto"/>
               <w:jc w:val="left"/>
-              <w:autoSpaceDE w:val="0"/>
-              <w:autoSpaceDN w:val="0"/>
             </w:pPr>
             <w:r>
               <w:rPr>
@@ -5600,8 +5324,6 @@
             <w:pPr>
               <w:spacing w:after="0" w:line="240" w:lineRule="auto"/>
               <w:jc w:val="left"/>
-              <w:autoSpaceDE w:val="0"/>
-              <w:autoSpaceDN w:val="0"/>
             </w:pPr>
             <w:r>
               <w:rPr>
@@ -5620,14 +5342,12 @@
     <w:p>
       <w:pPr>
         <w:sectPr>
-          <w:footerReference w:type="default" ns5:id="rId21"/>
+          <w:footerReference w:type="default" r:id="rId21"/>
           <w:pgSz w:w="8391" w:h="11906"/>
           <w:pgMar w:top="578" w:right="567" w:bottom="567" w:left="567" w:header="227" w:footer="198" w:gutter="0"/>
           <w:cols w:space="720"/>
           <w:docGrid w:linePitch="360"/>
         </w:sectPr>
-        <w:autoSpaceDE w:val="0"/>
-        <w:autoSpaceDN w:val="0"/>
       </w:pPr>
     </w:p>
     <w:p>
@@ -5639,8 +5359,6 @@
           <w:tab w:pos="7257" w:val="right"/>
         </w:tabs>
         <w:spacing w:after="176" w:line="240" w:lineRule="auto"/>
-        <w:autoSpaceDE w:val="0"/>
-        <w:autoSpaceDN w:val="0"/>
       </w:pPr>
       <w:r>
         <w:rPr>
@@ -5660,6 +5378,14 @@
           <w:color w:val="8E8E93"/>
         </w:rPr>
         <w:tab/>
+      </w:r>
+      <w:r>
+        <w:rPr>
+          <w:rFonts w:ascii="Courier New" w:hAnsi="Courier New" w:cs="Courier New" w:eastAsia="Microsoft YaHei"/>
+          <w:b w:val="0"/>
+          <w:sz w:val="10"/>
+          <w:color w:val="8E8E93"/>
+        </w:rPr>
         <w:t>CH.06 — OPERATION</w:t>
       </w:r>
     </w:p>
@@ -5670,8 +5396,6 @@
         </w:pBdr>
         <w:spacing w:after="120" w:line="240" w:lineRule="auto"/>
         <w:ind w:left="85"/>
-        <w:autoSpaceDE w:val="0"/>
-        <w:autoSpaceDN w:val="0"/>
       </w:pPr>
       <w:r>
         <w:rPr>
@@ -5700,8 +5424,6 @@
         <w:pBdr>
           <w:bottom w:val="single" w:sz="6" w:space="1" w:color="000000"/>
         </w:pBdr>
-        <w:autoSpaceDE w:val="0"/>
-        <w:autoSpaceDN w:val="0"/>
       </w:pPr>
       <w:r>
         <w:rPr>
@@ -5718,8 +5440,6 @@
       <w:pPr>
         <w:spacing w:before="0" w:after="32" w:line="271" w:lineRule="auto"/>
         <w:ind w:left="181" w:hanging="181"/>
-        <w:autoSpaceDE w:val="0"/>
-        <w:autoSpaceDN w:val="0"/>
       </w:pPr>
       <w:r>
         <w:rPr>
@@ -5746,8 +5466,6 @@
       <w:pPr>
         <w:spacing w:before="0" w:after="32" w:line="271" w:lineRule="auto"/>
         <w:ind w:left="181" w:hanging="181"/>
-        <w:autoSpaceDE w:val="0"/>
-        <w:autoSpaceDN w:val="0"/>
       </w:pPr>
       <w:r>
         <w:rPr>
@@ -5776,8 +5494,6 @@
         <w:pBdr>
           <w:bottom w:val="single" w:sz="6" w:space="1" w:color="000000"/>
         </w:pBdr>
-        <w:autoSpaceDE w:val="0"/>
-        <w:autoSpaceDN w:val="0"/>
       </w:pPr>
       <w:r>
         <w:rPr>
@@ -5794,8 +5510,6 @@
       <w:pPr>
         <w:spacing w:before="0" w:after="32" w:line="271" w:lineRule="auto"/>
         <w:ind w:left="181" w:hanging="181"/>
-        <w:autoSpaceDE w:val="0"/>
-        <w:autoSpaceDN w:val="0"/>
       </w:pPr>
       <w:r>
         <w:rPr>
@@ -5822,8 +5536,6 @@
       <w:pPr>
         <w:spacing w:before="0" w:after="32" w:line="271" w:lineRule="auto"/>
         <w:ind w:left="181" w:hanging="181"/>
-        <w:autoSpaceDE w:val="0"/>
-        <w:autoSpaceDN w:val="0"/>
       </w:pPr>
       <w:r>
         <w:rPr>
@@ -5872,8 +5584,6 @@
         <w:pBdr>
           <w:bottom w:val="single" w:sz="6" w:space="1" w:color="000000"/>
         </w:pBdr>
-        <w:autoSpaceDE w:val="0"/>
-        <w:autoSpaceDN w:val="0"/>
       </w:pPr>
       <w:r>
         <w:rPr>
@@ -5889,8 +5599,6 @@
     <w:p>
       <w:pPr>
         <w:spacing w:after="40" w:line="264" w:lineRule="auto"/>
-        <w:autoSpaceDE w:val="0"/>
-        <w:autoSpaceDN w:val="0"/>
       </w:pPr>
       <w:r>
         <w:rPr>
@@ -5911,14 +5619,22 @@
           <w:color w:val="000000"/>
           <w:spacing w:val="5"/>
         </w:rPr>
-        <w:t xml:space="preserve">   打开腔盖，并取出子弹冰篮和水箱。</w:t>
+        <w:t xml:space="preserve">   </w:t>
+      </w:r>
+      <w:r>
+        <w:rPr>
+          <w:rFonts w:ascii="Arial" w:hAnsi="Arial" w:cs="Arial" w:eastAsia="Microsoft YaHei"/>
+          <w:b w:val="0"/>
+          <w:sz w:val="14"/>
+          <w:color w:val="000000"/>
+          <w:spacing w:val="5"/>
+        </w:rPr>
+        <w:t>打开腔盖，并取出子弹冰篮和水箱。</w:t>
       </w:r>
     </w:p>
     <w:p>
       <w:pPr>
         <w:spacing w:after="40" w:line="264" w:lineRule="auto"/>
-        <w:autoSpaceDE w:val="0"/>
-        <w:autoSpaceDN w:val="0"/>
       </w:pPr>
       <w:r>
         <w:rPr>
@@ -5939,7 +5655,17 @@
           <w:color w:val="000000"/>
           <w:spacing w:val="5"/>
         </w:rPr>
-        <w:t xml:space="preserve">   给子弹冰水箱中注满水，注水至水位刻度处。</w:t>
+        <w:t xml:space="preserve">   </w:t>
+      </w:r>
+      <w:r>
+        <w:rPr>
+          <w:rFonts w:ascii="Arial" w:hAnsi="Arial" w:cs="Arial" w:eastAsia="Microsoft YaHei"/>
+          <w:b w:val="0"/>
+          <w:sz w:val="14"/>
+          <w:color w:val="000000"/>
+          <w:spacing w:val="5"/>
+        </w:rPr>
+        <w:t>给子弹冰水箱中注满水，注水至水位刻度处。</w:t>
       </w:r>
     </w:p>
     <w:p>
@@ -5947,41 +5673,39 @@
         <w:spacing w:after="100" w:line="240" w:lineRule="auto"/>
         <w:ind w:left="1701"/>
         <w:jc w:val="left"/>
-        <w:autoSpaceDE w:val="0"/>
-        <w:autoSpaceDN w:val="0"/>
       </w:pPr>
       <w:r>
         <w:drawing>
-          <ns2:inline>
-            <ns2:extent cx="871448" cy="864000"/>
-            <ns2:docPr id="6" name="Picture 6"/>
-            <ns2:cNvGraphicFramePr>
-              <ns3:graphicFrameLocks noChangeAspect="1"/>
-            </ns2:cNvGraphicFramePr>
-            <ns3:graphic>
-              <ns3:graphicData uri="http://schemas.openxmlformats.org/drawingml/2006/picture">
-                <ns4:pic>
-                  <ns4:nvPicPr>
-                    <ns4:cNvPr id="0" name="image14.png"/>
-                    <ns4:cNvPicPr/>
-                  </ns4:nvPicPr>
-                  <ns4:blipFill>
-                    <ns3:blip ns5:embed="rId23"/>
-                    <ns3:stretch>
-                      <ns3:fillRect/>
-                    </ns3:stretch>
-                  </ns4:blipFill>
-                  <ns4:spPr>
-                    <ns3:xfrm>
-                      <ns3:off x="0" y="0"/>
-                      <ns3:ext cx="871448" cy="864000"/>
-                    </ns3:xfrm>
-                    <ns3:prstGeom prst="rect"/>
-                  </ns4:spPr>
-                </ns4:pic>
-              </ns3:graphicData>
-            </ns3:graphic>
-          </ns2:inline>
+          <wp:inline xmlns:a="http://schemas.openxmlformats.org/drawingml/2006/main" xmlns:pic="http://schemas.openxmlformats.org/drawingml/2006/picture">
+            <wp:extent cx="871448" cy="864000"/>
+            <wp:docPr id="6" name="Picture 6"/>
+            <wp:cNvGraphicFramePr>
+              <a:graphicFrameLocks noChangeAspect="1"/>
+            </wp:cNvGraphicFramePr>
+            <a:graphic>
+              <a:graphicData uri="http://schemas.openxmlformats.org/drawingml/2006/picture">
+                <pic:pic>
+                  <pic:nvPicPr>
+                    <pic:cNvPr id="0" name="image14.png"/>
+                    <pic:cNvPicPr/>
+                  </pic:nvPicPr>
+                  <pic:blipFill>
+                    <a:blip r:embed="rId23"/>
+                    <a:stretch>
+                      <a:fillRect/>
+                    </a:stretch>
+                  </pic:blipFill>
+                  <pic:spPr>
+                    <a:xfrm>
+                      <a:off x="0" y="0"/>
+                      <a:ext cx="871448" cy="864000"/>
+                    </a:xfrm>
+                    <a:prstGeom prst="rect"/>
+                  </pic:spPr>
+                </pic:pic>
+              </a:graphicData>
+            </a:graphic>
+          </wp:inline>
         </w:drawing>
       </w:r>
       <w:r>
@@ -5999,44 +5723,42 @@
           <w:position w:val="41"/>
         </w:rPr>
         <w:drawing>
-          <ns2:inline>
-            <ns2:extent cx="1612800" cy="609814"/>
-            <ns2:docPr id="7" name="Picture 7"/>
-            <ns2:cNvGraphicFramePr>
-              <ns3:graphicFrameLocks noChangeAspect="1"/>
-            </ns2:cNvGraphicFramePr>
-            <ns3:graphic>
-              <ns3:graphicData uri="http://schemas.openxmlformats.org/drawingml/2006/picture">
-                <ns4:pic>
-                  <ns4:nvPicPr>
-                    <ns4:cNvPr id="0" name="image16.png"/>
-                    <ns4:cNvPicPr/>
-                  </ns4:nvPicPr>
-                  <ns4:blipFill>
-                    <ns3:blip ns5:embed="rId24"/>
-                    <ns3:stretch>
-                      <ns3:fillRect/>
-                    </ns3:stretch>
-                  </ns4:blipFill>
-                  <ns4:spPr>
-                    <ns3:xfrm>
-                      <ns3:off x="0" y="0"/>
-                      <ns3:ext cx="1612800" cy="609814"/>
-                    </ns3:xfrm>
-                    <ns3:prstGeom prst="rect"/>
-                  </ns4:spPr>
-                </ns4:pic>
-              </ns3:graphicData>
-            </ns3:graphic>
-          </ns2:inline>
+          <wp:inline xmlns:a="http://schemas.openxmlformats.org/drawingml/2006/main" xmlns:pic="http://schemas.openxmlformats.org/drawingml/2006/picture">
+            <wp:extent cx="1612800" cy="609814"/>
+            <wp:docPr id="7" name="Picture 7"/>
+            <wp:cNvGraphicFramePr>
+              <a:graphicFrameLocks noChangeAspect="1"/>
+            </wp:cNvGraphicFramePr>
+            <a:graphic>
+              <a:graphicData uri="http://schemas.openxmlformats.org/drawingml/2006/picture">
+                <pic:pic>
+                  <pic:nvPicPr>
+                    <pic:cNvPr id="0" name="image16.png"/>
+                    <pic:cNvPicPr/>
+                  </pic:nvPicPr>
+                  <pic:blipFill>
+                    <a:blip r:embed="rId24"/>
+                    <a:stretch>
+                      <a:fillRect/>
+                    </a:stretch>
+                  </pic:blipFill>
+                  <pic:spPr>
+                    <a:xfrm>
+                      <a:off x="0" y="0"/>
+                      <a:ext cx="1612800" cy="609814"/>
+                    </a:xfrm>
+                    <a:prstGeom prst="rect"/>
+                  </pic:spPr>
+                </pic:pic>
+              </a:graphicData>
+            </a:graphic>
+          </wp:inline>
         </w:drawing>
       </w:r>
     </w:p>
     <w:p>
       <w:pPr>
         <w:spacing w:after="40" w:line="264" w:lineRule="auto"/>
-        <w:autoSpaceDE w:val="0"/>
-        <w:autoSpaceDN w:val="0"/>
       </w:pPr>
       <w:r>
         <w:rPr>
@@ -6057,7 +5779,17 @@
           <w:color w:val="000000"/>
           <w:spacing w:val="5"/>
         </w:rPr>
-        <w:t xml:space="preserve">   然后将水箱放入子弹冰内腔，请用手按压下水箱，确保已经装到位。水箱松动可能导致产品无法工作。</w:t>
+        <w:t xml:space="preserve">   </w:t>
+      </w:r>
+      <w:r>
+        <w:rPr>
+          <w:rFonts w:ascii="Arial" w:hAnsi="Arial" w:cs="Arial" w:eastAsia="Microsoft YaHei"/>
+          <w:b w:val="0"/>
+          <w:sz w:val="14"/>
+          <w:color w:val="000000"/>
+          <w:spacing w:val="5"/>
+        </w:rPr>
+        <w:t>然后将水箱放入子弹冰内腔，请用手按压下水箱，确保已经装到位。水箱松动可能导致产品无法工作。</w:t>
       </w:r>
     </w:p>
     <w:tbl>
@@ -6092,41 +5824,39 @@
           <w:p>
             <w:pPr>
               <w:jc w:val="center"/>
-              <w:autoSpaceDE w:val="0"/>
-              <w:autoSpaceDN w:val="0"/>
             </w:pPr>
             <w:r>
               <w:drawing>
-                <ns2:inline>
-                  <ns2:extent cx="904271" cy="864000"/>
-                  <ns2:docPr id="8" name="Picture 8"/>
-                  <ns2:cNvGraphicFramePr>
-                    <ns3:graphicFrameLocks noChangeAspect="1"/>
-                  </ns2:cNvGraphicFramePr>
-                  <ns3:graphic>
-                    <ns3:graphicData uri="http://schemas.openxmlformats.org/drawingml/2006/picture">
-                      <ns4:pic>
-                        <ns4:nvPicPr>
-                          <ns4:cNvPr id="0" name="image18.png"/>
-                          <ns4:cNvPicPr/>
-                        </ns4:nvPicPr>
-                        <ns4:blipFill>
-                          <ns3:blip ns5:embed="rId25"/>
-                          <ns3:stretch>
-                            <ns3:fillRect/>
-                          </ns3:stretch>
-                        </ns4:blipFill>
-                        <ns4:spPr>
-                          <ns3:xfrm>
-                            <ns3:off x="0" y="0"/>
-                            <ns3:ext cx="904271" cy="864000"/>
-                          </ns3:xfrm>
-                          <ns3:prstGeom prst="rect"/>
-                        </ns4:spPr>
-                      </ns4:pic>
-                    </ns3:graphicData>
-                  </ns3:graphic>
-                </ns2:inline>
+                <wp:inline xmlns:a="http://schemas.openxmlformats.org/drawingml/2006/main" xmlns:pic="http://schemas.openxmlformats.org/drawingml/2006/picture">
+                  <wp:extent cx="904271" cy="864000"/>
+                  <wp:docPr id="8" name="Picture 8"/>
+                  <wp:cNvGraphicFramePr>
+                    <a:graphicFrameLocks noChangeAspect="1"/>
+                  </wp:cNvGraphicFramePr>
+                  <a:graphic>
+                    <a:graphicData uri="http://schemas.openxmlformats.org/drawingml/2006/picture">
+                      <pic:pic>
+                        <pic:nvPicPr>
+                          <pic:cNvPr id="0" name="image18.png"/>
+                          <pic:cNvPicPr/>
+                        </pic:nvPicPr>
+                        <pic:blipFill>
+                          <a:blip r:embed="rId25"/>
+                          <a:stretch>
+                            <a:fillRect/>
+                          </a:stretch>
+                        </pic:blipFill>
+                        <pic:spPr>
+                          <a:xfrm>
+                            <a:off x="0" y="0"/>
+                            <a:ext cx="904271" cy="864000"/>
+                          </a:xfrm>
+                          <a:prstGeom prst="rect"/>
+                        </pic:spPr>
+                      </pic:pic>
+                    </a:graphicData>
+                  </a:graphic>
+                </wp:inline>
               </w:drawing>
             </w:r>
           </w:p>
@@ -6136,14 +5866,12 @@
     <w:p>
       <w:pPr>
         <w:sectPr>
-          <w:footerReference w:type="default" ns5:id="rId22"/>
+          <w:footerReference w:type="default" r:id="rId22"/>
           <w:pgSz w:w="8391" w:h="11906"/>
           <w:pgMar w:top="578" w:right="567" w:bottom="567" w:left="567" w:header="227" w:footer="198" w:gutter="0"/>
           <w:cols w:space="720"/>
           <w:docGrid w:linePitch="360"/>
         </w:sectPr>
-        <w:autoSpaceDE w:val="0"/>
-        <w:autoSpaceDN w:val="0"/>
       </w:pPr>
     </w:p>
     <w:p>
@@ -6155,8 +5883,6 @@
           <w:tab w:pos="7257" w:val="right"/>
         </w:tabs>
         <w:spacing w:after="176" w:line="240" w:lineRule="auto"/>
-        <w:autoSpaceDE w:val="0"/>
-        <w:autoSpaceDN w:val="0"/>
       </w:pPr>
       <w:r>
         <w:rPr>
@@ -6176,6 +5902,14 @@
           <w:color w:val="8E8E93"/>
         </w:rPr>
         <w:tab/>
+      </w:r>
+      <w:r>
+        <w:rPr>
+          <w:rFonts w:ascii="Courier New" w:hAnsi="Courier New" w:cs="Courier New" w:eastAsia="Microsoft YaHei"/>
+          <w:b w:val="0"/>
+          <w:sz w:val="10"/>
+          <w:color w:val="8E8E93"/>
+        </w:rPr>
         <w:t>CH.06 — OPERATION</w:t>
       </w:r>
     </w:p>
@@ -6186,8 +5920,6 @@
         </w:pBdr>
         <w:spacing w:after="120" w:line="240" w:lineRule="auto"/>
         <w:ind w:left="85"/>
-        <w:autoSpaceDE w:val="0"/>
-        <w:autoSpaceDN w:val="0"/>
       </w:pPr>
       <w:r>
         <w:rPr>
@@ -6213,8 +5945,6 @@
     <w:p>
       <w:pPr>
         <w:spacing w:after="40" w:line="264" w:lineRule="auto"/>
-        <w:autoSpaceDE w:val="0"/>
-        <w:autoSpaceDN w:val="0"/>
       </w:pPr>
       <w:r>
         <w:rPr>
@@ -6235,7 +5965,17 @@
           <w:color w:val="000000"/>
           <w:spacing w:val="5"/>
         </w:rPr>
-        <w:t xml:space="preserve">   然后放入子弹冰篮，并关闭腔盖。</w:t>
+        <w:t xml:space="preserve">   </w:t>
+      </w:r>
+      <w:r>
+        <w:rPr>
+          <w:rFonts w:ascii="Arial" w:hAnsi="Arial" w:cs="Arial" w:eastAsia="Microsoft YaHei"/>
+          <w:b w:val="0"/>
+          <w:sz w:val="14"/>
+          <w:color w:val="000000"/>
+          <w:spacing w:val="5"/>
+        </w:rPr>
+        <w:t>然后放入子弹冰篮，并关闭腔盖。</w:t>
       </w:r>
     </w:p>
     <w:tbl>
@@ -6272,41 +6012,39 @@
           <w:p>
             <w:pPr>
               <w:jc w:val="center"/>
-              <w:autoSpaceDE w:val="0"/>
-              <w:autoSpaceDN w:val="0"/>
             </w:pPr>
             <w:r>
               <w:drawing>
-                <ns2:inline>
-                  <ns2:extent cx="597012" cy="1008000"/>
-                  <ns2:docPr id="9" name="Picture 9"/>
-                  <ns2:cNvGraphicFramePr>
-                    <ns3:graphicFrameLocks noChangeAspect="1"/>
-                  </ns2:cNvGraphicFramePr>
-                  <ns3:graphic>
-                    <ns3:graphicData uri="http://schemas.openxmlformats.org/drawingml/2006/picture">
-                      <ns4:pic>
-                        <ns4:nvPicPr>
-                          <ns4:cNvPr id="0" name="image20.png"/>
-                          <ns4:cNvPicPr/>
-                        </ns4:nvPicPr>
-                        <ns4:blipFill>
-                          <ns3:blip ns5:embed="rId27"/>
-                          <ns3:stretch>
-                            <ns3:fillRect/>
-                          </ns3:stretch>
-                        </ns4:blipFill>
-                        <ns4:spPr>
-                          <ns3:xfrm>
-                            <ns3:off x="0" y="0"/>
-                            <ns3:ext cx="597012" cy="1008000"/>
-                          </ns3:xfrm>
-                          <ns3:prstGeom prst="rect"/>
-                        </ns4:spPr>
-                      </ns4:pic>
-                    </ns3:graphicData>
-                  </ns3:graphic>
-                </ns2:inline>
+                <wp:inline xmlns:a="http://schemas.openxmlformats.org/drawingml/2006/main" xmlns:pic="http://schemas.openxmlformats.org/drawingml/2006/picture">
+                  <wp:extent cx="597012" cy="1008000"/>
+                  <wp:docPr id="9" name="Picture 9"/>
+                  <wp:cNvGraphicFramePr>
+                    <a:graphicFrameLocks noChangeAspect="1"/>
+                  </wp:cNvGraphicFramePr>
+                  <a:graphic>
+                    <a:graphicData uri="http://schemas.openxmlformats.org/drawingml/2006/picture">
+                      <pic:pic>
+                        <pic:nvPicPr>
+                          <pic:cNvPr id="0" name="image20.png"/>
+                          <pic:cNvPicPr/>
+                        </pic:nvPicPr>
+                        <pic:blipFill>
+                          <a:blip r:embed="rId27"/>
+                          <a:stretch>
+                            <a:fillRect/>
+                          </a:stretch>
+                        </pic:blipFill>
+                        <pic:spPr>
+                          <a:xfrm>
+                            <a:off x="0" y="0"/>
+                            <a:ext cx="597012" cy="1008000"/>
+                          </a:xfrm>
+                          <a:prstGeom prst="rect"/>
+                        </pic:spPr>
+                      </pic:pic>
+                    </a:graphicData>
+                  </a:graphic>
+                </wp:inline>
               </w:drawing>
             </w:r>
           </w:p>
@@ -6324,41 +6062,39 @@
           <w:p>
             <w:pPr>
               <w:jc w:val="center"/>
-              <w:autoSpaceDE w:val="0"/>
-              <w:autoSpaceDN w:val="0"/>
             </w:pPr>
             <w:r>
               <w:drawing>
-                <ns2:inline>
-                  <ns2:extent cx="692059" cy="1008000"/>
-                  <ns2:docPr id="10" name="Picture 10"/>
-                  <ns2:cNvGraphicFramePr>
-                    <ns3:graphicFrameLocks noChangeAspect="1"/>
-                  </ns2:cNvGraphicFramePr>
-                  <ns3:graphic>
-                    <ns3:graphicData uri="http://schemas.openxmlformats.org/drawingml/2006/picture">
-                      <ns4:pic>
-                        <ns4:nvPicPr>
-                          <ns4:cNvPr id="0" name="image22.png"/>
-                          <ns4:cNvPicPr/>
-                        </ns4:nvPicPr>
-                        <ns4:blipFill>
-                          <ns3:blip ns5:embed="rId28"/>
-                          <ns3:stretch>
-                            <ns3:fillRect/>
-                          </ns3:stretch>
-                        </ns4:blipFill>
-                        <ns4:spPr>
-                          <ns3:xfrm>
-                            <ns3:off x="0" y="0"/>
-                            <ns3:ext cx="692059" cy="1008000"/>
-                          </ns3:xfrm>
-                          <ns3:prstGeom prst="rect"/>
-                        </ns4:spPr>
-                      </ns4:pic>
-                    </ns3:graphicData>
-                  </ns3:graphic>
-                </ns2:inline>
+                <wp:inline xmlns:a="http://schemas.openxmlformats.org/drawingml/2006/main" xmlns:pic="http://schemas.openxmlformats.org/drawingml/2006/picture">
+                  <wp:extent cx="692059" cy="1008000"/>
+                  <wp:docPr id="10" name="Picture 10"/>
+                  <wp:cNvGraphicFramePr>
+                    <a:graphicFrameLocks noChangeAspect="1"/>
+                  </wp:cNvGraphicFramePr>
+                  <a:graphic>
+                    <a:graphicData uri="http://schemas.openxmlformats.org/drawingml/2006/picture">
+                      <pic:pic>
+                        <pic:nvPicPr>
+                          <pic:cNvPr id="0" name="image22.png"/>
+                          <pic:cNvPicPr/>
+                        </pic:nvPicPr>
+                        <pic:blipFill>
+                          <a:blip r:embed="rId28"/>
+                          <a:stretch>
+                            <a:fillRect/>
+                          </a:stretch>
+                        </pic:blipFill>
+                        <pic:spPr>
+                          <a:xfrm>
+                            <a:off x="0" y="0"/>
+                            <a:ext cx="692059" cy="1008000"/>
+                          </a:xfrm>
+                          <a:prstGeom prst="rect"/>
+                        </pic:spPr>
+                      </pic:pic>
+                    </a:graphicData>
+                  </a:graphic>
+                </wp:inline>
               </w:drawing>
             </w:r>
           </w:p>
@@ -6376,41 +6112,39 @@
           <w:p>
             <w:pPr>
               <w:jc w:val="center"/>
-              <w:autoSpaceDE w:val="0"/>
-              <w:autoSpaceDN w:val="0"/>
             </w:pPr>
             <w:r>
               <w:drawing>
-                <ns2:inline>
-                  <ns2:extent cx="743871" cy="1007999"/>
-                  <ns2:docPr id="11" name="Picture 11"/>
-                  <ns2:cNvGraphicFramePr>
-                    <ns3:graphicFrameLocks noChangeAspect="1"/>
-                  </ns2:cNvGraphicFramePr>
-                  <ns3:graphic>
-                    <ns3:graphicData uri="http://schemas.openxmlformats.org/drawingml/2006/picture">
-                      <ns4:pic>
-                        <ns4:nvPicPr>
-                          <ns4:cNvPr id="0" name="image24.png"/>
-                          <ns4:cNvPicPr/>
-                        </ns4:nvPicPr>
-                        <ns4:blipFill>
-                          <ns3:blip ns5:embed="rId29"/>
-                          <ns3:stretch>
-                            <ns3:fillRect/>
-                          </ns3:stretch>
-                        </ns4:blipFill>
-                        <ns4:spPr>
-                          <ns3:xfrm>
-                            <ns3:off x="0" y="0"/>
-                            <ns3:ext cx="743871" cy="1007999"/>
-                          </ns3:xfrm>
-                          <ns3:prstGeom prst="rect"/>
-                        </ns4:spPr>
-                      </ns4:pic>
-                    </ns3:graphicData>
-                  </ns3:graphic>
-                </ns2:inline>
+                <wp:inline xmlns:a="http://schemas.openxmlformats.org/drawingml/2006/main" xmlns:pic="http://schemas.openxmlformats.org/drawingml/2006/picture">
+                  <wp:extent cx="743871" cy="1007999"/>
+                  <wp:docPr id="11" name="Picture 11"/>
+                  <wp:cNvGraphicFramePr>
+                    <a:graphicFrameLocks noChangeAspect="1"/>
+                  </wp:cNvGraphicFramePr>
+                  <a:graphic>
+                    <a:graphicData uri="http://schemas.openxmlformats.org/drawingml/2006/picture">
+                      <pic:pic>
+                        <pic:nvPicPr>
+                          <pic:cNvPr id="0" name="image24.png"/>
+                          <pic:cNvPicPr/>
+                        </pic:nvPicPr>
+                        <pic:blipFill>
+                          <a:blip r:embed="rId29"/>
+                          <a:stretch>
+                            <a:fillRect/>
+                          </a:stretch>
+                        </pic:blipFill>
+                        <pic:spPr>
+                          <a:xfrm>
+                            <a:off x="0" y="0"/>
+                            <a:ext cx="743871" cy="1007999"/>
+                          </a:xfrm>
+                          <a:prstGeom prst="rect"/>
+                        </pic:spPr>
+                      </pic:pic>
+                    </a:graphicData>
+                  </a:graphic>
+                </wp:inline>
               </w:drawing>
             </w:r>
           </w:p>
@@ -6420,8 +6154,6 @@
     <w:p>
       <w:pPr>
         <w:spacing w:after="40" w:line="264" w:lineRule="auto"/>
-        <w:autoSpaceDE w:val="0"/>
-        <w:autoSpaceDN w:val="0"/>
       </w:pPr>
       <w:r>
         <w:rPr>
@@ -6442,7 +6174,17 @@
           <w:color w:val="000000"/>
           <w:spacing w:val="5"/>
         </w:rPr>
-        <w:t xml:space="preserve">   点击 </w:t>
+        <w:t xml:space="preserve">   </w:t>
+      </w:r>
+      <w:r>
+        <w:rPr>
+          <w:rFonts w:ascii="Arial" w:hAnsi="Arial" w:cs="Arial" w:eastAsia="Microsoft YaHei"/>
+          <w:b w:val="0"/>
+          <w:sz w:val="14"/>
+          <w:color w:val="000000"/>
+          <w:spacing w:val="5"/>
+        </w:rPr>
+        <w:t xml:space="preserve">点击 </w:t>
       </w:r>
       <w:r>
         <w:rPr>
@@ -6497,41 +6239,39 @@
           <w:p>
             <w:pPr>
               <w:jc w:val="center"/>
-              <w:autoSpaceDE w:val="0"/>
-              <w:autoSpaceDN w:val="0"/>
             </w:pPr>
             <w:r>
               <w:drawing>
-                <ns2:inline>
-                  <ns2:extent cx="1681796" cy="1007999"/>
-                  <ns2:docPr id="12" name="Picture 12"/>
-                  <ns2:cNvGraphicFramePr>
-                    <ns3:graphicFrameLocks noChangeAspect="1"/>
-                  </ns2:cNvGraphicFramePr>
-                  <ns3:graphic>
-                    <ns3:graphicData uri="http://schemas.openxmlformats.org/drawingml/2006/picture">
-                      <ns4:pic>
-                        <ns4:nvPicPr>
-                          <ns4:cNvPr id="0" name="image26.png"/>
-                          <ns4:cNvPicPr/>
-                        </ns4:nvPicPr>
-                        <ns4:blipFill>
-                          <ns3:blip ns5:embed="rId30"/>
-                          <ns3:stretch>
-                            <ns3:fillRect/>
-                          </ns3:stretch>
-                        </ns4:blipFill>
-                        <ns4:spPr>
-                          <ns3:xfrm>
-                            <ns3:off x="0" y="0"/>
-                            <ns3:ext cx="1681796" cy="1007999"/>
-                          </ns3:xfrm>
-                          <ns3:prstGeom prst="rect"/>
-                        </ns4:spPr>
-                      </ns4:pic>
-                    </ns3:graphicData>
-                  </ns3:graphic>
-                </ns2:inline>
+                <wp:inline xmlns:a="http://schemas.openxmlformats.org/drawingml/2006/main" xmlns:pic="http://schemas.openxmlformats.org/drawingml/2006/picture">
+                  <wp:extent cx="1681796" cy="1007999"/>
+                  <wp:docPr id="12" name="Picture 12"/>
+                  <wp:cNvGraphicFramePr>
+                    <a:graphicFrameLocks noChangeAspect="1"/>
+                  </wp:cNvGraphicFramePr>
+                  <a:graphic>
+                    <a:graphicData uri="http://schemas.openxmlformats.org/drawingml/2006/picture">
+                      <pic:pic>
+                        <pic:nvPicPr>
+                          <pic:cNvPr id="0" name="image26.png"/>
+                          <pic:cNvPicPr/>
+                        </pic:nvPicPr>
+                        <pic:blipFill>
+                          <a:blip r:embed="rId30"/>
+                          <a:stretch>
+                            <a:fillRect/>
+                          </a:stretch>
+                        </pic:blipFill>
+                        <pic:spPr>
+                          <a:xfrm>
+                            <a:off x="0" y="0"/>
+                            <a:ext cx="1681796" cy="1007999"/>
+                          </a:xfrm>
+                          <a:prstGeom prst="rect"/>
+                        </pic:spPr>
+                      </pic:pic>
+                    </a:graphicData>
+                  </a:graphic>
+                </wp:inline>
               </w:drawing>
             </w:r>
           </w:p>
@@ -6541,8 +6281,6 @@
     <w:p>
       <w:pPr>
         <w:spacing w:after="40" w:line="264" w:lineRule="auto"/>
-        <w:autoSpaceDE w:val="0"/>
-        <w:autoSpaceDN w:val="0"/>
       </w:pPr>
       <w:r>
         <w:rPr>
@@ -6563,15 +6301,23 @@
           <w:color w:val="000000"/>
           <w:spacing w:val="5"/>
         </w:rPr>
-        <w:t xml:space="preserve">   选择完尺寸后，产品自动开始制作子弹冰。</w:t>
+        <w:t xml:space="preserve">   </w:t>
+      </w:r>
+      <w:r>
+        <w:rPr>
+          <w:rFonts w:ascii="Arial" w:hAnsi="Arial" w:cs="Arial" w:eastAsia="Microsoft YaHei"/>
+          <w:b w:val="0"/>
+          <w:sz w:val="14"/>
+          <w:color w:val="000000"/>
+          <w:spacing w:val="5"/>
+        </w:rPr>
+        <w:t>选择完尺寸后，产品自动开始制作子弹冰。</w:t>
       </w:r>
     </w:p>
     <w:p>
       <w:pPr>
         <w:spacing w:after="60"/>
         <w:jc w:val="center"/>
-        <w:autoSpaceDE w:val="0"/>
-        <w:autoSpaceDN w:val="0"/>
       </w:pPr>
       <w:r>
         <w:rPr>
@@ -6585,37 +6331,39 @@
       </w:r>
       <w:r>
         <w:drawing>
-          <ns2:inline>
-            <ns2:extent cx="653544" cy="144000"/>
-            <ns2:docPr id="13" name="Picture 13"/>
-            <ns2:cNvGraphicFramePr>
-              <ns3:graphicFrameLocks noChangeAspect="1"/>
-            </ns2:cNvGraphicFramePr>
-            <ns3:graphic>
-              <ns3:graphicData uri="http://schemas.openxmlformats.org/drawingml/2006/picture">
-                <ns4:pic>
-                  <ns4:nvPicPr>
-                    <ns4:cNvPr id="0" name="image28.png"/>
-                    <ns4:cNvPicPr/>
-                  </ns4:nvPicPr>
-                  <ns4:blipFill>
-                    <ns3:blip ns5:embed="rId31"/>
-                    <ns3:stretch>
-                      <ns3:fillRect/>
-                    </ns3:stretch>
-                  </ns4:blipFill>
-                  <ns4:spPr>
-                    <ns3:xfrm>
-                      <ns3:off x="0" y="0"/>
-                      <ns3:ext cx="653544" cy="144000"/>
-                    </ns3:xfrm>
-                    <ns3:prstGeom prst="rect"/>
-                  </ns4:spPr>
-                </ns4:pic>
-              </ns3:graphicData>
-            </ns3:graphic>
-          </ns2:inline>
+          <wp:inline xmlns:a="http://schemas.openxmlformats.org/drawingml/2006/main" xmlns:pic="http://schemas.openxmlformats.org/drawingml/2006/picture">
+            <wp:extent cx="653544" cy="144000"/>
+            <wp:docPr id="13" name="Picture 13"/>
+            <wp:cNvGraphicFramePr>
+              <a:graphicFrameLocks noChangeAspect="1"/>
+            </wp:cNvGraphicFramePr>
+            <a:graphic>
+              <a:graphicData uri="http://schemas.openxmlformats.org/drawingml/2006/picture">
+                <pic:pic>
+                  <pic:nvPicPr>
+                    <pic:cNvPr id="0" name="image28.png"/>
+                    <pic:cNvPicPr/>
+                  </pic:nvPicPr>
+                  <pic:blipFill>
+                    <a:blip r:embed="rId31"/>
+                    <a:stretch>
+                      <a:fillRect/>
+                    </a:stretch>
+                  </pic:blipFill>
+                  <pic:spPr>
+                    <a:xfrm>
+                      <a:off x="0" y="0"/>
+                      <a:ext cx="653544" cy="144000"/>
+                    </a:xfrm>
+                    <a:prstGeom prst="rect"/>
+                  </pic:spPr>
+                </pic:pic>
+              </a:graphicData>
+            </a:graphic>
+          </wp:inline>
         </w:drawing>
+      </w:r>
+      <w:r>
         <w:t xml:space="preserve"> </w:t>
       </w:r>
       <w:r>
@@ -6630,37 +6378,39 @@
       </w:r>
       <w:r>
         <w:drawing>
-          <ns2:inline>
-            <ns2:extent cx="653544" cy="144000"/>
-            <ns2:docPr id="14" name="Picture 14"/>
-            <ns2:cNvGraphicFramePr>
-              <ns3:graphicFrameLocks noChangeAspect="1"/>
-            </ns2:cNvGraphicFramePr>
-            <ns3:graphic>
-              <ns3:graphicData uri="http://schemas.openxmlformats.org/drawingml/2006/picture">
-                <ns4:pic>
-                  <ns4:nvPicPr>
-                    <ns4:cNvPr id="0" name="image30.png"/>
-                    <ns4:cNvPicPr/>
-                  </ns4:nvPicPr>
-                  <ns4:blipFill>
-                    <ns3:blip ns5:embed="rId32"/>
-                    <ns3:stretch>
-                      <ns3:fillRect/>
-                    </ns3:stretch>
-                  </ns4:blipFill>
-                  <ns4:spPr>
-                    <ns3:xfrm>
-                      <ns3:off x="0" y="0"/>
-                      <ns3:ext cx="653544" cy="144000"/>
-                    </ns3:xfrm>
-                    <ns3:prstGeom prst="rect"/>
-                  </ns4:spPr>
-                </ns4:pic>
-              </ns3:graphicData>
-            </ns3:graphic>
-          </ns2:inline>
+          <wp:inline xmlns:a="http://schemas.openxmlformats.org/drawingml/2006/main" xmlns:pic="http://schemas.openxmlformats.org/drawingml/2006/picture">
+            <wp:extent cx="653544" cy="144000"/>
+            <wp:docPr id="14" name="Picture 14"/>
+            <wp:cNvGraphicFramePr>
+              <a:graphicFrameLocks noChangeAspect="1"/>
+            </wp:cNvGraphicFramePr>
+            <a:graphic>
+              <a:graphicData uri="http://schemas.openxmlformats.org/drawingml/2006/picture">
+                <pic:pic>
+                  <pic:nvPicPr>
+                    <pic:cNvPr id="0" name="image30.png"/>
+                    <pic:cNvPicPr/>
+                  </pic:nvPicPr>
+                  <pic:blipFill>
+                    <a:blip r:embed="rId32"/>
+                    <a:stretch>
+                      <a:fillRect/>
+                    </a:stretch>
+                  </pic:blipFill>
+                  <pic:spPr>
+                    <a:xfrm>
+                      <a:off x="0" y="0"/>
+                      <a:ext cx="653544" cy="144000"/>
+                    </a:xfrm>
+                    <a:prstGeom prst="rect"/>
+                  </pic:spPr>
+                </pic:pic>
+              </a:graphicData>
+            </a:graphic>
+          </wp:inline>
         </w:drawing>
+      </w:r>
+      <w:r>
         <w:t xml:space="preserve"> </w:t>
       </w:r>
     </w:p>
@@ -6698,8 +6448,6 @@
           <w:p>
             <w:pPr>
               <w:spacing w:after="40" w:before="0" w:line="278" w:lineRule="auto"/>
-              <w:autoSpaceDE w:val="0"/>
-              <w:autoSpaceDN w:val="0"/>
             </w:pPr>
             <w:r>
               <w:rPr>
@@ -6716,8 +6464,6 @@
             <w:pPr>
               <w:spacing w:before="0" w:after="27" w:line="230" w:lineRule="auto"/>
               <w:ind w:left="266" w:hanging="266"/>
-              <w:autoSpaceDE w:val="0"/>
-              <w:autoSpaceDN w:val="0"/>
             </w:pPr>
             <w:r>
               <w:rPr>
@@ -6764,8 +6510,6 @@
             <w:pPr>
               <w:spacing w:before="0" w:after="27" w:line="230" w:lineRule="auto"/>
               <w:ind w:left="266" w:hanging="266"/>
-              <w:autoSpaceDE w:val="0"/>
-              <w:autoSpaceDN w:val="0"/>
             </w:pPr>
             <w:r>
               <w:rPr>
@@ -6812,8 +6556,6 @@
             <w:pPr>
               <w:spacing w:before="0" w:after="27" w:line="230" w:lineRule="auto"/>
               <w:ind w:left="266" w:hanging="266"/>
-              <w:autoSpaceDE w:val="0"/>
-              <w:autoSpaceDN w:val="0"/>
             </w:pPr>
             <w:r>
               <w:rPr>
@@ -6860,8 +6602,6 @@
             <w:pPr>
               <w:spacing w:before="0" w:after="27" w:line="230" w:lineRule="auto"/>
               <w:ind w:left="266" w:hanging="266"/>
-              <w:autoSpaceDE w:val="0"/>
-              <w:autoSpaceDN w:val="0"/>
             </w:pPr>
             <w:r>
               <w:rPr>
@@ -6910,21 +6650,17 @@
     <w:p>
       <w:pPr>
         <w:spacing w:after="40"/>
-        <w:autoSpaceDE w:val="0"/>
-        <w:autoSpaceDN w:val="0"/>
       </w:pPr>
     </w:p>
     <w:p>
       <w:pPr>
         <w:sectPr>
-          <w:footerReference w:type="default" ns5:id="rId26"/>
+          <w:footerReference w:type="default" r:id="rId26"/>
           <w:pgSz w:w="8391" w:h="11906"/>
           <w:pgMar w:top="578" w:right="567" w:bottom="567" w:left="567" w:header="227" w:footer="198" w:gutter="0"/>
           <w:cols w:space="720"/>
           <w:docGrid w:linePitch="360"/>
         </w:sectPr>
-        <w:autoSpaceDE w:val="0"/>
-        <w:autoSpaceDN w:val="0"/>
       </w:pPr>
     </w:p>
     <w:p>
@@ -6936,8 +6672,6 @@
           <w:tab w:pos="7257" w:val="right"/>
         </w:tabs>
         <w:spacing w:after="176" w:line="240" w:lineRule="auto"/>
-        <w:autoSpaceDE w:val="0"/>
-        <w:autoSpaceDN w:val="0"/>
       </w:pPr>
       <w:r>
         <w:rPr>
@@ -6957,6 +6691,14 @@
           <w:color w:val="8E8E93"/>
         </w:rPr>
         <w:tab/>
+      </w:r>
+      <w:r>
+        <w:rPr>
+          <w:rFonts w:ascii="Courier New" w:hAnsi="Courier New" w:cs="Courier New" w:eastAsia="Microsoft YaHei"/>
+          <w:b w:val="0"/>
+          <w:sz w:val="10"/>
+          <w:color w:val="8E8E93"/>
+        </w:rPr>
         <w:t>CH.07 — TROUBLESHOOTING</w:t>
       </w:r>
     </w:p>
@@ -6967,8 +6709,6 @@
         </w:pBdr>
         <w:spacing w:after="120" w:line="240" w:lineRule="auto"/>
         <w:ind w:left="85"/>
-        <w:autoSpaceDE w:val="0"/>
-        <w:autoSpaceDN w:val="0"/>
       </w:pPr>
       <w:r>
         <w:rPr>
@@ -7038,8 +6778,6 @@
             <w:pPr>
               <w:spacing w:after="0" w:line="240" w:lineRule="auto"/>
               <w:jc w:val="left"/>
-              <w:autoSpaceDE w:val="0"/>
-              <w:autoSpaceDN w:val="0"/>
             </w:pPr>
             <w:r>
               <w:rPr>
@@ -7076,8 +6814,6 @@
             <w:pPr>
               <w:spacing w:after="0" w:line="240" w:lineRule="auto"/>
               <w:jc w:val="left"/>
-              <w:autoSpaceDE w:val="0"/>
-              <w:autoSpaceDN w:val="0"/>
             </w:pPr>
             <w:r>
               <w:rPr>
@@ -7114,8 +6850,6 @@
             <w:pPr>
               <w:spacing w:after="0" w:line="240" w:lineRule="auto"/>
               <w:jc w:val="left"/>
-              <w:autoSpaceDE w:val="0"/>
-              <w:autoSpaceDN w:val="0"/>
             </w:pPr>
             <w:r>
               <w:rPr>
@@ -7157,8 +6891,6 @@
             <w:pPr>
               <w:spacing w:after="0" w:line="240" w:lineRule="auto"/>
               <w:jc w:val="left"/>
-              <w:autoSpaceDE w:val="0"/>
-              <w:autoSpaceDN w:val="0"/>
             </w:pPr>
             <w:r>
               <w:rPr>
@@ -7195,8 +6927,6 @@
             <w:pPr>
               <w:spacing w:after="0" w:line="240" w:lineRule="auto"/>
               <w:jc w:val="left"/>
-              <w:autoSpaceDE w:val="0"/>
-              <w:autoSpaceDN w:val="0"/>
             </w:pPr>
             <w:r>
               <w:rPr>
@@ -7233,8 +6963,6 @@
             <w:pPr>
               <w:spacing w:after="0" w:line="240" w:lineRule="auto"/>
               <w:jc w:val="left"/>
-              <w:autoSpaceDE w:val="0"/>
-              <w:autoSpaceDN w:val="0"/>
             </w:pPr>
             <w:r>
               <w:rPr>
@@ -7276,8 +7004,6 @@
             <w:pPr>
               <w:spacing w:after="0" w:line="240" w:lineRule="auto"/>
               <w:jc w:val="left"/>
-              <w:autoSpaceDE w:val="0"/>
-              <w:autoSpaceDN w:val="0"/>
             </w:pPr>
             <w:r>
               <w:rPr>
@@ -7314,8 +7040,6 @@
             <w:pPr>
               <w:spacing w:after="0" w:line="240" w:lineRule="auto"/>
               <w:jc w:val="left"/>
-              <w:autoSpaceDE w:val="0"/>
-              <w:autoSpaceDN w:val="0"/>
             </w:pPr>
             <w:r>
               <w:rPr>
@@ -7352,8 +7076,6 @@
             <w:pPr>
               <w:spacing w:after="0" w:line="240" w:lineRule="auto"/>
               <w:jc w:val="left"/>
-              <w:autoSpaceDE w:val="0"/>
-              <w:autoSpaceDN w:val="0"/>
             </w:pPr>
             <w:r>
               <w:rPr>
@@ -7395,8 +7117,6 @@
             <w:pPr>
               <w:spacing w:after="0" w:line="240" w:lineRule="auto"/>
               <w:jc w:val="left"/>
-              <w:autoSpaceDE w:val="0"/>
-              <w:autoSpaceDN w:val="0"/>
             </w:pPr>
             <w:r>
               <w:rPr>
@@ -7433,8 +7153,6 @@
             <w:pPr>
               <w:spacing w:after="0" w:line="240" w:lineRule="auto"/>
               <w:jc w:val="left"/>
-              <w:autoSpaceDE w:val="0"/>
-              <w:autoSpaceDN w:val="0"/>
             </w:pPr>
             <w:r>
               <w:rPr>
@@ -7471,8 +7189,6 @@
             <w:pPr>
               <w:spacing w:after="0" w:line="240" w:lineRule="auto"/>
               <w:jc w:val="left"/>
-              <w:autoSpaceDE w:val="0"/>
-              <w:autoSpaceDN w:val="0"/>
             </w:pPr>
             <w:r>
               <w:rPr>
@@ -7514,8 +7230,6 @@
             <w:pPr>
               <w:spacing w:after="0" w:line="240" w:lineRule="auto"/>
               <w:jc w:val="left"/>
-              <w:autoSpaceDE w:val="0"/>
-              <w:autoSpaceDN w:val="0"/>
             </w:pPr>
             <w:r>
               <w:rPr>
@@ -7552,8 +7266,6 @@
             <w:pPr>
               <w:spacing w:after="0" w:line="240" w:lineRule="auto"/>
               <w:jc w:val="left"/>
-              <w:autoSpaceDE w:val="0"/>
-              <w:autoSpaceDN w:val="0"/>
             </w:pPr>
             <w:r>
               <w:rPr>
@@ -7590,8 +7302,6 @@
             <w:pPr>
               <w:spacing w:after="0" w:line="240" w:lineRule="auto"/>
               <w:jc w:val="left"/>
-              <w:autoSpaceDE w:val="0"/>
-              <w:autoSpaceDN w:val="0"/>
             </w:pPr>
             <w:r>
               <w:rPr>
@@ -7633,8 +7343,6 @@
             <w:pPr>
               <w:spacing w:after="0" w:line="240" w:lineRule="auto"/>
               <w:jc w:val="left"/>
-              <w:autoSpaceDE w:val="0"/>
-              <w:autoSpaceDN w:val="0"/>
             </w:pPr>
             <w:r>
               <w:rPr>
@@ -7671,8 +7379,6 @@
             <w:pPr>
               <w:spacing w:after="0" w:line="240" w:lineRule="auto"/>
               <w:jc w:val="left"/>
-              <w:autoSpaceDE w:val="0"/>
-              <w:autoSpaceDN w:val="0"/>
             </w:pPr>
             <w:r>
               <w:rPr>
@@ -7709,8 +7415,6 @@
             <w:pPr>
               <w:spacing w:after="0" w:line="240" w:lineRule="auto"/>
               <w:jc w:val="left"/>
-              <w:autoSpaceDE w:val="0"/>
-              <w:autoSpaceDN w:val="0"/>
             </w:pPr>
             <w:r>
               <w:rPr>
@@ -7752,8 +7456,6 @@
             <w:pPr>
               <w:spacing w:after="0" w:line="240" w:lineRule="auto"/>
               <w:jc w:val="left"/>
-              <w:autoSpaceDE w:val="0"/>
-              <w:autoSpaceDN w:val="0"/>
             </w:pPr>
             <w:r>
               <w:rPr>
@@ -7790,8 +7492,6 @@
             <w:pPr>
               <w:spacing w:after="0" w:line="240" w:lineRule="auto"/>
               <w:jc w:val="left"/>
-              <w:autoSpaceDE w:val="0"/>
-              <w:autoSpaceDN w:val="0"/>
             </w:pPr>
             <w:r>
               <w:rPr>
@@ -7828,8 +7528,6 @@
             <w:pPr>
               <w:spacing w:after="0" w:line="240" w:lineRule="auto"/>
               <w:jc w:val="left"/>
-              <w:autoSpaceDE w:val="0"/>
-              <w:autoSpaceDN w:val="0"/>
             </w:pPr>
             <w:r>
               <w:rPr>
@@ -7871,8 +7569,6 @@
             <w:pPr>
               <w:spacing w:after="0" w:line="240" w:lineRule="auto"/>
               <w:jc w:val="left"/>
-              <w:autoSpaceDE w:val="0"/>
-              <w:autoSpaceDN w:val="0"/>
             </w:pPr>
             <w:r>
               <w:rPr>
@@ -7909,8 +7605,6 @@
             <w:pPr>
               <w:spacing w:after="0" w:line="240" w:lineRule="auto"/>
               <w:jc w:val="left"/>
-              <w:autoSpaceDE w:val="0"/>
-              <w:autoSpaceDN w:val="0"/>
             </w:pPr>
             <w:r>
               <w:rPr>
@@ -7947,8 +7641,6 @@
             <w:pPr>
               <w:spacing w:after="0" w:line="240" w:lineRule="auto"/>
               <w:jc w:val="left"/>
-              <w:autoSpaceDE w:val="0"/>
-              <w:autoSpaceDN w:val="0"/>
             </w:pPr>
             <w:r>
               <w:rPr>
@@ -7990,8 +7682,6 @@
             <w:pPr>
               <w:spacing w:after="0" w:line="240" w:lineRule="auto"/>
               <w:jc w:val="left"/>
-              <w:autoSpaceDE w:val="0"/>
-              <w:autoSpaceDN w:val="0"/>
             </w:pPr>
             <w:r>
               <w:rPr>
@@ -8028,8 +7718,6 @@
             <w:pPr>
               <w:spacing w:after="0" w:line="240" w:lineRule="auto"/>
               <w:jc w:val="left"/>
-              <w:autoSpaceDE w:val="0"/>
-              <w:autoSpaceDN w:val="0"/>
             </w:pPr>
             <w:r>
               <w:rPr>
@@ -8066,8 +7754,6 @@
             <w:pPr>
               <w:spacing w:after="0" w:line="240" w:lineRule="auto"/>
               <w:jc w:val="left"/>
-              <w:autoSpaceDE w:val="0"/>
-              <w:autoSpaceDN w:val="0"/>
             </w:pPr>
             <w:r>
               <w:rPr>
@@ -8109,8 +7795,6 @@
             <w:pPr>
               <w:spacing w:after="0" w:line="240" w:lineRule="auto"/>
               <w:jc w:val="left"/>
-              <w:autoSpaceDE w:val="0"/>
-              <w:autoSpaceDN w:val="0"/>
             </w:pPr>
             <w:r>
               <w:rPr>
@@ -8147,8 +7831,6 @@
             <w:pPr>
               <w:spacing w:after="0" w:line="240" w:lineRule="auto"/>
               <w:jc w:val="left"/>
-              <w:autoSpaceDE w:val="0"/>
-              <w:autoSpaceDN w:val="0"/>
             </w:pPr>
             <w:r>
               <w:rPr>
@@ -8185,8 +7867,6 @@
             <w:pPr>
               <w:spacing w:after="0" w:line="240" w:lineRule="auto"/>
               <w:jc w:val="left"/>
-              <w:autoSpaceDE w:val="0"/>
-              <w:autoSpaceDN w:val="0"/>
             </w:pPr>
             <w:r>
               <w:rPr>
@@ -8205,8 +7885,6 @@
     <w:p>
       <w:pPr>
         <w:spacing w:after="0" w:before="0" w:line="24" w:lineRule="auto"/>
-        <w:autoSpaceDE w:val="0"/>
-        <w:autoSpaceDN w:val="0"/>
       </w:pPr>
     </w:p>
     <w:tbl>
@@ -8248,8 +7926,6 @@
           <w:p>
             <w:pPr>
               <w:spacing w:after="40" w:before="0" w:line="278" w:lineRule="auto"/>
-              <w:autoSpaceDE w:val="0"/>
-              <w:autoSpaceDN w:val="0"/>
             </w:pPr>
             <w:r>
               <w:rPr>
@@ -8265,8 +7941,6 @@
           <w:p>
             <w:pPr>
               <w:spacing w:after="20" w:before="0" w:line="278" w:lineRule="auto"/>
-              <w:autoSpaceDE w:val="0"/>
-              <w:autoSpaceDN w:val="0"/>
             </w:pPr>
             <w:r>
               <w:rPr>
@@ -8285,21 +7959,17 @@
     <w:p>
       <w:pPr>
         <w:spacing w:after="40"/>
-        <w:autoSpaceDE w:val="0"/>
-        <w:autoSpaceDN w:val="0"/>
       </w:pPr>
     </w:p>
     <w:p>
       <w:pPr>
         <w:sectPr>
-          <w:footerReference w:type="default" ns5:id="rId33"/>
+          <w:footerReference w:type="default" r:id="rId33"/>
           <w:pgSz w:w="8391" w:h="11906"/>
           <w:pgMar w:top="578" w:right="567" w:bottom="567" w:left="567" w:header="227" w:footer="198" w:gutter="0"/>
           <w:cols w:space="720"/>
           <w:docGrid w:linePitch="360"/>
         </w:sectPr>
-        <w:autoSpaceDE w:val="0"/>
-        <w:autoSpaceDN w:val="0"/>
       </w:pPr>
     </w:p>
     <w:p>
@@ -8311,8 +7981,6 @@
           <w:tab w:pos="7257" w:val="right"/>
         </w:tabs>
         <w:spacing w:after="176" w:line="240" w:lineRule="auto"/>
-        <w:autoSpaceDE w:val="0"/>
-        <w:autoSpaceDN w:val="0"/>
       </w:pPr>
       <w:r>
         <w:rPr>
@@ -8332,6 +8000,14 @@
           <w:color w:val="8E8E93"/>
         </w:rPr>
         <w:tab/>
+      </w:r>
+      <w:r>
+        <w:rPr>
+          <w:rFonts w:ascii="Courier New" w:hAnsi="Courier New" w:cs="Courier New" w:eastAsia="Microsoft YaHei"/>
+          <w:b w:val="0"/>
+          <w:sz w:val="10"/>
+          <w:color w:val="8E8E93"/>
+        </w:rPr>
         <w:t>CH.08 — MAINTENANCE</w:t>
       </w:r>
     </w:p>
@@ -8342,8 +8018,6 @@
         </w:pBdr>
         <w:spacing w:after="120" w:line="240" w:lineRule="auto"/>
         <w:ind w:left="85"/>
-        <w:autoSpaceDE w:val="0"/>
-        <w:autoSpaceDN w:val="0"/>
       </w:pPr>
       <w:r>
         <w:rPr>
@@ -8372,8 +8046,6 @@
         <w:pBdr>
           <w:bottom w:val="single" w:sz="6" w:space="1" w:color="000000"/>
         </w:pBdr>
-        <w:autoSpaceDE w:val="0"/>
-        <w:autoSpaceDN w:val="0"/>
       </w:pPr>
       <w:r>
         <w:rPr>
@@ -8389,8 +8061,6 @@
     <w:p>
       <w:pPr>
         <w:spacing w:after="40" w:line="264" w:lineRule="auto"/>
-        <w:autoSpaceDE w:val="0"/>
-        <w:autoSpaceDN w:val="0"/>
       </w:pPr>
       <w:r>
         <w:rPr>
@@ -8411,14 +8081,22 @@
           <w:color w:val="000000"/>
           <w:spacing w:val="5"/>
         </w:rPr>
-        <w:t xml:space="preserve">   给水箱加水至水位线。</w:t>
+        <w:t xml:space="preserve">   </w:t>
+      </w:r>
+      <w:r>
+        <w:rPr>
+          <w:rFonts w:ascii="Arial" w:hAnsi="Arial" w:cs="Arial" w:eastAsia="Microsoft YaHei"/>
+          <w:b w:val="0"/>
+          <w:sz w:val="14"/>
+          <w:color w:val="000000"/>
+          <w:spacing w:val="5"/>
+        </w:rPr>
+        <w:t>给水箱加水至水位线。</w:t>
       </w:r>
     </w:p>
     <w:p>
       <w:pPr>
         <w:spacing w:after="40" w:line="264" w:lineRule="auto"/>
-        <w:autoSpaceDE w:val="0"/>
-        <w:autoSpaceDN w:val="0"/>
       </w:pPr>
       <w:r>
         <w:rPr>
@@ -8439,7 +8117,17 @@
           <w:color w:val="000000"/>
           <w:spacing w:val="5"/>
         </w:rPr>
-        <w:t xml:space="preserve">   开机状态下，点击 </w:t>
+        <w:t xml:space="preserve">   </w:t>
+      </w:r>
+      <w:r>
+        <w:rPr>
+          <w:rFonts w:ascii="Arial" w:hAnsi="Arial" w:cs="Arial" w:eastAsia="Microsoft YaHei"/>
+          <w:b w:val="0"/>
+          <w:sz w:val="14"/>
+          <w:color w:val="000000"/>
+          <w:spacing w:val="5"/>
+        </w:rPr>
+        <w:t xml:space="preserve">开机状态下，点击 </w:t>
       </w:r>
       <w:r>
         <w:rPr>
@@ -8465,8 +8153,6 @@
     <w:p>
       <w:pPr>
         <w:spacing w:after="40" w:line="264" w:lineRule="auto"/>
-        <w:autoSpaceDE w:val="0"/>
-        <w:autoSpaceDN w:val="0"/>
       </w:pPr>
       <w:r>
         <w:rPr>
@@ -8487,7 +8173,17 @@
           <w:color w:val="000000"/>
           <w:spacing w:val="5"/>
         </w:rPr>
-        <w:t xml:space="preserve">   清洁完成后，产品自动停止，按键灯熄灭。</w:t>
+        <w:t xml:space="preserve">   </w:t>
+      </w:r>
+      <w:r>
+        <w:rPr>
+          <w:rFonts w:ascii="Arial" w:hAnsi="Arial" w:cs="Arial" w:eastAsia="Microsoft YaHei"/>
+          <w:b w:val="0"/>
+          <w:sz w:val="14"/>
+          <w:color w:val="000000"/>
+          <w:spacing w:val="5"/>
+        </w:rPr>
+        <w:t>清洁完成后，产品自动停止，按键灯熄灭。</w:t>
       </w:r>
     </w:p>
     <w:p>
@@ -8496,8 +8192,6 @@
         <w:pBdr>
           <w:bottom w:val="single" w:sz="6" w:space="1" w:color="000000"/>
         </w:pBdr>
-        <w:autoSpaceDE w:val="0"/>
-        <w:autoSpaceDN w:val="0"/>
       </w:pPr>
       <w:r>
         <w:rPr>
@@ -8513,8 +8207,6 @@
     <w:p>
       <w:pPr>
         <w:spacing w:after="40" w:line="264" w:lineRule="auto"/>
-        <w:autoSpaceDE w:val="0"/>
-        <w:autoSpaceDN w:val="0"/>
       </w:pPr>
       <w:r>
         <w:rPr>
@@ -8535,14 +8227,22 @@
           <w:color w:val="000000"/>
           <w:spacing w:val="5"/>
         </w:rPr>
-        <w:t xml:space="preserve">   断开电源，将产品放置到水槽旁。</w:t>
+        <w:t xml:space="preserve">   </w:t>
+      </w:r>
+      <w:r>
+        <w:rPr>
+          <w:rFonts w:ascii="Arial" w:hAnsi="Arial" w:cs="Arial" w:eastAsia="Microsoft YaHei"/>
+          <w:b w:val="0"/>
+          <w:sz w:val="14"/>
+          <w:color w:val="000000"/>
+          <w:spacing w:val="5"/>
+        </w:rPr>
+        <w:t>断开电源，将产品放置到水槽旁。</w:t>
       </w:r>
     </w:p>
     <w:p>
       <w:pPr>
         <w:spacing w:after="40" w:line="264" w:lineRule="auto"/>
-        <w:autoSpaceDE w:val="0"/>
-        <w:autoSpaceDN w:val="0"/>
       </w:pPr>
       <w:r>
         <w:rPr>
@@ -8563,14 +8263,22 @@
           <w:color w:val="000000"/>
           <w:spacing w:val="5"/>
         </w:rPr>
-        <w:t xml:space="preserve">   将产品底部的排水孔塞松脱，让内腔的水排干。</w:t>
+        <w:t xml:space="preserve">   </w:t>
+      </w:r>
+      <w:r>
+        <w:rPr>
+          <w:rFonts w:ascii="Arial" w:hAnsi="Arial" w:cs="Arial" w:eastAsia="Microsoft YaHei"/>
+          <w:b w:val="0"/>
+          <w:sz w:val="14"/>
+          <w:color w:val="000000"/>
+          <w:spacing w:val="5"/>
+        </w:rPr>
+        <w:t>将产品底部的排水孔塞松脱，让内腔的水排干。</w:t>
       </w:r>
     </w:p>
     <w:p>
       <w:pPr>
         <w:spacing w:after="40" w:line="264" w:lineRule="auto"/>
-        <w:autoSpaceDE w:val="0"/>
-        <w:autoSpaceDN w:val="0"/>
       </w:pPr>
       <w:r>
         <w:rPr>
@@ -8591,7 +8299,17 @@
           <w:color w:val="000000"/>
           <w:spacing w:val="5"/>
         </w:rPr>
-        <w:t xml:space="preserve">   排水完成后，将排水孔塞回原位。</w:t>
+        <w:t xml:space="preserve">   </w:t>
+      </w:r>
+      <w:r>
+        <w:rPr>
+          <w:rFonts w:ascii="Arial" w:hAnsi="Arial" w:cs="Arial" w:eastAsia="Microsoft YaHei"/>
+          <w:b w:val="0"/>
+          <w:sz w:val="14"/>
+          <w:color w:val="000000"/>
+          <w:spacing w:val="5"/>
+        </w:rPr>
+        <w:t>排水完成后，将排水孔塞回原位。</w:t>
       </w:r>
     </w:p>
     <w:tbl>
@@ -8627,41 +8345,39 @@
           <w:p>
             <w:pPr>
               <w:jc w:val="center"/>
-              <w:autoSpaceDE w:val="0"/>
-              <w:autoSpaceDN w:val="0"/>
             </w:pPr>
             <w:r>
               <w:drawing>
-                <ns2:inline>
-                  <ns2:extent cx="1183764" cy="936000"/>
-                  <ns2:docPr id="15" name="Picture 15"/>
-                  <ns2:cNvGraphicFramePr>
-                    <ns3:graphicFrameLocks noChangeAspect="1"/>
-                  </ns2:cNvGraphicFramePr>
-                  <ns3:graphic>
-                    <ns3:graphicData uri="http://schemas.openxmlformats.org/drawingml/2006/picture">
-                      <ns4:pic>
-                        <ns4:nvPicPr>
-                          <ns4:cNvPr id="0" name="image10.png"/>
-                          <ns4:cNvPicPr/>
-                        </ns4:nvPicPr>
-                        <ns4:blipFill>
-                          <ns3:blip ns5:embed="rId35"/>
-                          <ns3:stretch>
-                            <ns3:fillRect/>
-                          </ns3:stretch>
-                        </ns4:blipFill>
-                        <ns4:spPr>
-                          <ns3:xfrm>
-                            <ns3:off x="0" y="0"/>
-                            <ns3:ext cx="1183764" cy="936000"/>
-                          </ns3:xfrm>
-                          <ns3:prstGeom prst="rect"/>
-                        </ns4:spPr>
-                      </ns4:pic>
-                    </ns3:graphicData>
-                  </ns3:graphic>
-                </ns2:inline>
+                <wp:inline xmlns:a="http://schemas.openxmlformats.org/drawingml/2006/main" xmlns:pic="http://schemas.openxmlformats.org/drawingml/2006/picture">
+                  <wp:extent cx="1183764" cy="936000"/>
+                  <wp:docPr id="15" name="Picture 15"/>
+                  <wp:cNvGraphicFramePr>
+                    <a:graphicFrameLocks noChangeAspect="1"/>
+                  </wp:cNvGraphicFramePr>
+                  <a:graphic>
+                    <a:graphicData uri="http://schemas.openxmlformats.org/drawingml/2006/picture">
+                      <pic:pic>
+                        <pic:nvPicPr>
+                          <pic:cNvPr id="0" name="image10.png"/>
+                          <pic:cNvPicPr/>
+                        </pic:nvPicPr>
+                        <pic:blipFill>
+                          <a:blip r:embed="rId35"/>
+                          <a:stretch>
+                            <a:fillRect/>
+                          </a:stretch>
+                        </pic:blipFill>
+                        <pic:spPr>
+                          <a:xfrm>
+                            <a:off x="0" y="0"/>
+                            <a:ext cx="1183764" cy="936000"/>
+                          </a:xfrm>
+                          <a:prstGeom prst="rect"/>
+                        </pic:spPr>
+                      </pic:pic>
+                    </a:graphicData>
+                  </a:graphic>
+                </wp:inline>
               </w:drawing>
             </w:r>
           </w:p>
@@ -8679,41 +8395,39 @@
           <w:p>
             <w:pPr>
               <w:jc w:val="center"/>
-              <w:autoSpaceDE w:val="0"/>
-              <w:autoSpaceDN w:val="0"/>
             </w:pPr>
             <w:r>
               <w:drawing>
-                <ns2:inline>
-                  <ns2:extent cx="733824" cy="936000"/>
-                  <ns2:docPr id="16" name="Picture 16"/>
-                  <ns2:cNvGraphicFramePr>
-                    <ns3:graphicFrameLocks noChangeAspect="1"/>
-                  </ns2:cNvGraphicFramePr>
-                  <ns3:graphic>
-                    <ns3:graphicData uri="http://schemas.openxmlformats.org/drawingml/2006/picture">
-                      <ns4:pic>
-                        <ns4:nvPicPr>
-                          <ns4:cNvPr id="0" name="image12.png"/>
-                          <ns4:cNvPicPr/>
-                        </ns4:nvPicPr>
-                        <ns4:blipFill>
-                          <ns3:blip ns5:embed="rId36"/>
-                          <ns3:stretch>
-                            <ns3:fillRect/>
-                          </ns3:stretch>
-                        </ns4:blipFill>
-                        <ns4:spPr>
-                          <ns3:xfrm>
-                            <ns3:off x="0" y="0"/>
-                            <ns3:ext cx="733824" cy="936000"/>
-                          </ns3:xfrm>
-                          <ns3:prstGeom prst="rect"/>
-                        </ns4:spPr>
-                      </ns4:pic>
-                    </ns3:graphicData>
-                  </ns3:graphic>
-                </ns2:inline>
+                <wp:inline xmlns:a="http://schemas.openxmlformats.org/drawingml/2006/main" xmlns:pic="http://schemas.openxmlformats.org/drawingml/2006/picture">
+                  <wp:extent cx="733824" cy="936000"/>
+                  <wp:docPr id="16" name="Picture 16"/>
+                  <wp:cNvGraphicFramePr>
+                    <a:graphicFrameLocks noChangeAspect="1"/>
+                  </wp:cNvGraphicFramePr>
+                  <a:graphic>
+                    <a:graphicData uri="http://schemas.openxmlformats.org/drawingml/2006/picture">
+                      <pic:pic>
+                        <pic:nvPicPr>
+                          <pic:cNvPr id="0" name="image12.png"/>
+                          <pic:cNvPicPr/>
+                        </pic:nvPicPr>
+                        <pic:blipFill>
+                          <a:blip r:embed="rId36"/>
+                          <a:stretch>
+                            <a:fillRect/>
+                          </a:stretch>
+                        </pic:blipFill>
+                        <pic:spPr>
+                          <a:xfrm>
+                            <a:off x="0" y="0"/>
+                            <a:ext cx="733824" cy="936000"/>
+                          </a:xfrm>
+                          <a:prstGeom prst="rect"/>
+                        </pic:spPr>
+                      </pic:pic>
+                    </a:graphicData>
+                  </a:graphic>
+                </wp:inline>
               </w:drawing>
             </w:r>
           </w:p>
@@ -8726,8 +8440,6 @@
         <w:pBdr>
           <w:bottom w:val="single" w:sz="6" w:space="1" w:color="000000"/>
         </w:pBdr>
-        <w:autoSpaceDE w:val="0"/>
-        <w:autoSpaceDN w:val="0"/>
       </w:pPr>
       <w:r>
         <w:rPr>
@@ -8744,8 +8456,6 @@
       <w:pPr>
         <w:spacing w:before="0" w:after="32" w:line="271" w:lineRule="auto"/>
         <w:ind w:left="181" w:hanging="181"/>
-        <w:autoSpaceDE w:val="0"/>
-        <w:autoSpaceDN w:val="0"/>
       </w:pPr>
       <w:r>
         <w:rPr>
@@ -8792,8 +8502,6 @@
       <w:pPr>
         <w:spacing w:before="0" w:after="32" w:line="271" w:lineRule="auto"/>
         <w:ind w:left="181" w:hanging="181"/>
-        <w:autoSpaceDE w:val="0"/>
-        <w:autoSpaceDN w:val="0"/>
       </w:pPr>
       <w:r>
         <w:rPr>
@@ -8820,8 +8528,6 @@
       <w:pPr>
         <w:spacing w:before="0" w:after="32" w:line="271" w:lineRule="auto"/>
         <w:ind w:left="181" w:hanging="181"/>
-        <w:autoSpaceDE w:val="0"/>
-        <w:autoSpaceDN w:val="0"/>
       </w:pPr>
       <w:r>
         <w:rPr>
@@ -8848,8 +8554,6 @@
       <w:pPr>
         <w:spacing w:before="0" w:after="32" w:line="271" w:lineRule="auto"/>
         <w:ind w:left="181" w:hanging="181"/>
-        <w:autoSpaceDE w:val="0"/>
-        <w:autoSpaceDN w:val="0"/>
       </w:pPr>
       <w:r>
         <w:rPr>
@@ -8875,14 +8579,12 @@
     <w:p>
       <w:pPr>
         <w:sectPr>
-          <w:footerReference w:type="default" ns5:id="rId34"/>
+          <w:footerReference w:type="default" r:id="rId34"/>
           <w:pgSz w:w="8391" w:h="11906"/>
           <w:pgMar w:top="578" w:right="567" w:bottom="567" w:left="567" w:header="227" w:footer="198" w:gutter="0"/>
           <w:cols w:space="720"/>
           <w:docGrid w:linePitch="360"/>
         </w:sectPr>
-        <w:autoSpaceDE w:val="0"/>
-        <w:autoSpaceDN w:val="0"/>
       </w:pPr>
     </w:p>
     <w:p>
@@ -8894,8 +8596,6 @@
           <w:tab w:pos="7257" w:val="right"/>
         </w:tabs>
         <w:spacing w:after="176" w:line="240" w:lineRule="auto"/>
-        <w:autoSpaceDE w:val="0"/>
-        <w:autoSpaceDN w:val="0"/>
       </w:pPr>
       <w:r>
         <w:rPr>
@@ -8915,6 +8615,14 @@
           <w:color w:val="8E8E93"/>
         </w:rPr>
         <w:tab/>
+      </w:r>
+      <w:r>
+        <w:rPr>
+          <w:rFonts w:ascii="Courier New" w:hAnsi="Courier New" w:cs="Courier New" w:eastAsia="Microsoft YaHei"/>
+          <w:b w:val="0"/>
+          <w:sz w:val="10"/>
+          <w:color w:val="8E8E93"/>
+        </w:rPr>
         <w:t>CH.09 — INSTALLATION / STORAGE / DISPOSAL</w:t>
       </w:r>
     </w:p>
@@ -8925,8 +8633,6 @@
         </w:pBdr>
         <w:spacing w:after="120" w:line="240" w:lineRule="auto"/>
         <w:ind w:left="85"/>
-        <w:autoSpaceDE w:val="0"/>
-        <w:autoSpaceDN w:val="0"/>
       </w:pPr>
       <w:r>
         <w:rPr>
@@ -8955,8 +8661,6 @@
         <w:pBdr>
           <w:bottom w:val="single" w:sz="6" w:space="1" w:color="000000"/>
         </w:pBdr>
-        <w:autoSpaceDE w:val="0"/>
-        <w:autoSpaceDN w:val="0"/>
       </w:pPr>
       <w:r>
         <w:rPr>
@@ -8973,8 +8677,6 @@
       <w:pPr>
         <w:spacing w:before="0" w:after="32" w:line="271" w:lineRule="auto"/>
         <w:ind w:left="181" w:hanging="181"/>
-        <w:autoSpaceDE w:val="0"/>
-        <w:autoSpaceDN w:val="0"/>
       </w:pPr>
       <w:r>
         <w:rPr>
@@ -9001,8 +8703,6 @@
       <w:pPr>
         <w:spacing w:before="0" w:after="32" w:line="271" w:lineRule="auto"/>
         <w:ind w:left="181" w:hanging="181"/>
-        <w:autoSpaceDE w:val="0"/>
-        <w:autoSpaceDN w:val="0"/>
       </w:pPr>
       <w:r>
         <w:rPr>
@@ -9029,8 +8729,6 @@
       <w:pPr>
         <w:spacing w:before="0" w:after="32" w:line="271" w:lineRule="auto"/>
         <w:ind w:left="181" w:hanging="181"/>
-        <w:autoSpaceDE w:val="0"/>
-        <w:autoSpaceDN w:val="0"/>
       </w:pPr>
       <w:r>
         <w:rPr>
@@ -9059,8 +8757,6 @@
         <w:pBdr>
           <w:bottom w:val="single" w:sz="6" w:space="1" w:color="000000"/>
         </w:pBdr>
-        <w:autoSpaceDE w:val="0"/>
-        <w:autoSpaceDN w:val="0"/>
       </w:pPr>
       <w:r>
         <w:rPr>
@@ -9077,8 +8773,6 @@
       <w:pPr>
         <w:spacing w:before="0" w:after="32" w:line="271" w:lineRule="auto"/>
         <w:ind w:left="181" w:hanging="181"/>
-        <w:autoSpaceDE w:val="0"/>
-        <w:autoSpaceDN w:val="0"/>
       </w:pPr>
       <w:r>
         <w:rPr>
@@ -9105,8 +8799,6 @@
       <w:pPr>
         <w:spacing w:before="0" w:after="32" w:line="271" w:lineRule="auto"/>
         <w:ind w:left="181" w:hanging="181"/>
-        <w:autoSpaceDE w:val="0"/>
-        <w:autoSpaceDN w:val="0"/>
       </w:pPr>
       <w:r>
         <w:rPr>
@@ -9133,8 +8825,6 @@
       <w:pPr>
         <w:spacing w:before="0" w:after="32" w:line="271" w:lineRule="auto"/>
         <w:ind w:left="181" w:hanging="181"/>
-        <w:autoSpaceDE w:val="0"/>
-        <w:autoSpaceDN w:val="0"/>
       </w:pPr>
       <w:r>
         <w:rPr>
@@ -9161,8 +8851,6 @@
       <w:pPr>
         <w:spacing w:before="0" w:after="32" w:line="271" w:lineRule="auto"/>
         <w:ind w:left="181" w:hanging="181"/>
-        <w:autoSpaceDE w:val="0"/>
-        <w:autoSpaceDN w:val="0"/>
       </w:pPr>
       <w:r>
         <w:rPr>
@@ -9191,8 +8879,6 @@
         <w:pBdr>
           <w:bottom w:val="single" w:sz="6" w:space="1" w:color="000000"/>
         </w:pBdr>
-        <w:autoSpaceDE w:val="0"/>
-        <w:autoSpaceDN w:val="0"/>
       </w:pPr>
       <w:r>
         <w:rPr>
@@ -9209,8 +8895,6 @@
       <w:pPr>
         <w:spacing w:before="0" w:after="32" w:line="271" w:lineRule="auto"/>
         <w:ind w:left="181" w:hanging="181"/>
-        <w:autoSpaceDE w:val="0"/>
-        <w:autoSpaceDN w:val="0"/>
       </w:pPr>
       <w:r>
         <w:rPr>
@@ -9237,8 +8921,6 @@
       <w:pPr>
         <w:spacing w:before="0" w:after="32" w:line="271" w:lineRule="auto"/>
         <w:ind w:left="181" w:hanging="181"/>
-        <w:autoSpaceDE w:val="0"/>
-        <w:autoSpaceDN w:val="0"/>
       </w:pPr>
       <w:r>
         <w:rPr>
@@ -9265,8 +8947,6 @@
       <w:pPr>
         <w:spacing w:before="0" w:after="32" w:line="271" w:lineRule="auto"/>
         <w:ind w:left="181" w:hanging="181"/>
-        <w:autoSpaceDE w:val="0"/>
-        <w:autoSpaceDN w:val="0"/>
       </w:pPr>
       <w:r>
         <w:rPr>
@@ -9293,8 +8973,6 @@
       <w:pPr>
         <w:spacing w:before="0" w:after="32" w:line="271" w:lineRule="auto"/>
         <w:ind w:left="181" w:hanging="181"/>
-        <w:autoSpaceDE w:val="0"/>
-        <w:autoSpaceDN w:val="0"/>
       </w:pPr>
       <w:r>
         <w:rPr>
@@ -9320,8 +8998,6 @@
     <w:p>
       <w:pPr>
         <w:spacing w:after="60" w:before="0" w:line="24" w:lineRule="auto"/>
-        <w:autoSpaceDE w:val="0"/>
-        <w:autoSpaceDN w:val="0"/>
       </w:pPr>
     </w:p>
     <w:tbl>
@@ -9358,8 +9034,6 @@
           <w:p>
             <w:pPr>
               <w:spacing w:after="40" w:before="0" w:line="278" w:lineRule="auto"/>
-              <w:autoSpaceDE w:val="0"/>
-              <w:autoSpaceDN w:val="0"/>
             </w:pPr>
             <w:r>
               <w:rPr>
@@ -9375,8 +9049,6 @@
           <w:p>
             <w:pPr>
               <w:spacing w:after="20" w:before="0" w:line="278" w:lineRule="auto"/>
-              <w:autoSpaceDE w:val="0"/>
-              <w:autoSpaceDN w:val="0"/>
             </w:pPr>
             <w:r>
               <w:rPr>
@@ -9395,21 +9067,17 @@
     <w:p>
       <w:pPr>
         <w:spacing w:after="40"/>
-        <w:autoSpaceDE w:val="0"/>
-        <w:autoSpaceDN w:val="0"/>
       </w:pPr>
     </w:p>
     <w:p>
       <w:pPr>
         <w:sectPr>
-          <w:footerReference w:type="default" ns5:id="rId37"/>
+          <w:footerReference w:type="default" r:id="rId37"/>
           <w:pgSz w:w="8391" w:h="11906"/>
           <w:pgMar w:top="578" w:right="567" w:bottom="567" w:left="567" w:header="227" w:footer="198" w:gutter="0"/>
           <w:cols w:space="720"/>
           <w:docGrid w:linePitch="360"/>
         </w:sectPr>
-        <w:autoSpaceDE w:val="0"/>
-        <w:autoSpaceDN w:val="0"/>
       </w:pPr>
     </w:p>
     <w:p>
@@ -9421,8 +9089,6 @@
           <w:tab w:pos="7257" w:val="right"/>
         </w:tabs>
         <w:spacing w:after="176" w:line="240" w:lineRule="auto"/>
-        <w:autoSpaceDE w:val="0"/>
-        <w:autoSpaceDN w:val="0"/>
       </w:pPr>
       <w:r>
         <w:rPr>
@@ -9442,6 +9108,14 @@
           <w:color w:val="8E8E93"/>
         </w:rPr>
         <w:tab/>
+      </w:r>
+      <w:r>
+        <w:rPr>
+          <w:rFonts w:ascii="Courier New" w:hAnsi="Courier New" w:cs="Courier New" w:eastAsia="Microsoft YaHei"/>
+          <w:b w:val="0"/>
+          <w:sz w:val="10"/>
+          <w:color w:val="8E8E93"/>
+        </w:rPr>
         <w:t>CH.10 — WARRANTY</w:t>
       </w:r>
     </w:p>
@@ -9452,8 +9126,6 @@
         </w:pBdr>
         <w:spacing w:after="120" w:line="240" w:lineRule="auto"/>
         <w:ind w:left="85"/>
-        <w:autoSpaceDE w:val="0"/>
-        <w:autoSpaceDN w:val="0"/>
       </w:pPr>
       <w:r>
         <w:rPr>
@@ -9479,8 +9151,6 @@
     <w:p>
       <w:pPr>
         <w:spacing w:after="60" w:before="0" w:line="278" w:lineRule="auto"/>
-        <w:autoSpaceDE w:val="0"/>
-        <w:autoSpaceDN w:val="0"/>
       </w:pPr>
       <w:r>
         <w:rPr>
@@ -9501,8 +9171,6 @@
         <w:pBdr>
           <w:bottom w:val="single" w:sz="6" w:space="1" w:color="000000"/>
         </w:pBdr>
-        <w:autoSpaceDE w:val="0"/>
-        <w:autoSpaceDN w:val="0"/>
       </w:pPr>
       <w:r>
         <w:rPr>
@@ -9560,8 +9228,6 @@
             <w:pPr>
               <w:spacing w:after="0" w:line="240" w:lineRule="auto"/>
               <w:jc w:val="left"/>
-              <w:autoSpaceDE w:val="0"/>
-              <w:autoSpaceDN w:val="0"/>
             </w:pPr>
             <w:r>
               <w:rPr>
@@ -9597,8 +9263,6 @@
             <w:pPr>
               <w:spacing w:after="0" w:line="240" w:lineRule="auto"/>
               <w:jc w:val="left"/>
-              <w:autoSpaceDE w:val="0"/>
-              <w:autoSpaceDN w:val="0"/>
             </w:pPr>
             <w:r>
               <w:rPr>
@@ -9639,8 +9303,6 @@
             <w:pPr>
               <w:spacing w:after="0" w:line="240" w:lineRule="auto"/>
               <w:jc w:val="left"/>
-              <w:autoSpaceDE w:val="0"/>
-              <w:autoSpaceDN w:val="0"/>
             </w:pPr>
             <w:r>
               <w:rPr>
@@ -9676,8 +9338,6 @@
             <w:pPr>
               <w:spacing w:after="0" w:line="240" w:lineRule="auto"/>
               <w:jc w:val="left"/>
-              <w:autoSpaceDE w:val="0"/>
-              <w:autoSpaceDN w:val="0"/>
             </w:pPr>
             <w:r>
               <w:rPr>
@@ -9718,8 +9378,6 @@
             <w:pPr>
               <w:spacing w:after="0" w:line="240" w:lineRule="auto"/>
               <w:jc w:val="left"/>
-              <w:autoSpaceDE w:val="0"/>
-              <w:autoSpaceDN w:val="0"/>
             </w:pPr>
             <w:r>
               <w:rPr>
@@ -9755,8 +9413,6 @@
             <w:pPr>
               <w:spacing w:after="0" w:line="240" w:lineRule="auto"/>
               <w:jc w:val="left"/>
-              <w:autoSpaceDE w:val="0"/>
-              <w:autoSpaceDN w:val="0"/>
             </w:pPr>
             <w:r>
               <w:rPr>
@@ -9797,8 +9453,6 @@
             <w:pPr>
               <w:spacing w:after="0" w:line="240" w:lineRule="auto"/>
               <w:jc w:val="left"/>
-              <w:autoSpaceDE w:val="0"/>
-              <w:autoSpaceDN w:val="0"/>
             </w:pPr>
             <w:r>
               <w:rPr>
@@ -9834,8 +9488,6 @@
             <w:pPr>
               <w:spacing w:after="0" w:line="240" w:lineRule="auto"/>
               <w:jc w:val="left"/>
-              <w:autoSpaceDE w:val="0"/>
-              <w:autoSpaceDN w:val="0"/>
             </w:pPr>
             <w:r>
               <w:rPr>
@@ -9876,8 +9528,6 @@
             <w:pPr>
               <w:spacing w:after="0" w:line="240" w:lineRule="auto"/>
               <w:jc w:val="left"/>
-              <w:autoSpaceDE w:val="0"/>
-              <w:autoSpaceDN w:val="0"/>
             </w:pPr>
             <w:r>
               <w:rPr>
@@ -9913,8 +9563,6 @@
             <w:pPr>
               <w:spacing w:after="0" w:line="240" w:lineRule="auto"/>
               <w:jc w:val="left"/>
-              <w:autoSpaceDE w:val="0"/>
-              <w:autoSpaceDN w:val="0"/>
             </w:pPr>
             <w:r>
               <w:rPr>
@@ -9936,8 +9584,6 @@
         <w:pBdr>
           <w:bottom w:val="single" w:sz="6" w:space="1" w:color="000000"/>
         </w:pBdr>
-        <w:autoSpaceDE w:val="0"/>
-        <w:autoSpaceDN w:val="0"/>
       </w:pPr>
       <w:r>
         <w:rPr>
@@ -9995,8 +9641,6 @@
             <w:pPr>
               <w:spacing w:after="0" w:line="240" w:lineRule="auto"/>
               <w:jc w:val="left"/>
-              <w:autoSpaceDE w:val="0"/>
-              <w:autoSpaceDN w:val="0"/>
             </w:pPr>
             <w:r>
               <w:rPr>
@@ -10032,8 +9676,6 @@
             <w:pPr>
               <w:spacing w:after="0" w:line="240" w:lineRule="auto"/>
               <w:jc w:val="left"/>
-              <w:autoSpaceDE w:val="0"/>
-              <w:autoSpaceDN w:val="0"/>
             </w:pPr>
             <w:r>
               <w:rPr>
@@ -10074,8 +9716,6 @@
             <w:pPr>
               <w:spacing w:after="0" w:line="240" w:lineRule="auto"/>
               <w:jc w:val="left"/>
-              <w:autoSpaceDE w:val="0"/>
-              <w:autoSpaceDN w:val="0"/>
             </w:pPr>
             <w:r>
               <w:rPr>
@@ -10111,8 +9751,6 @@
             <w:pPr>
               <w:spacing w:after="0" w:line="240" w:lineRule="auto"/>
               <w:jc w:val="left"/>
-              <w:autoSpaceDE w:val="0"/>
-              <w:autoSpaceDN w:val="0"/>
             </w:pPr>
             <w:r>
               <w:rPr>
@@ -10155,8 +9793,6 @@
             <w:pPr>
               <w:spacing w:after="0" w:line="240" w:lineRule="auto"/>
               <w:jc w:val="left"/>
-              <w:autoSpaceDE w:val="0"/>
-              <w:autoSpaceDN w:val="0"/>
             </w:pPr>
             <w:r>
               <w:rPr>
@@ -10192,8 +9828,6 @@
             <w:pPr>
               <w:spacing w:after="0" w:line="240" w:lineRule="auto"/>
               <w:jc w:val="left"/>
-              <w:autoSpaceDE w:val="0"/>
-              <w:autoSpaceDN w:val="0"/>
             </w:pPr>
             <w:r>
               <w:rPr>
@@ -10234,8 +9868,6 @@
             <w:pPr>
               <w:spacing w:after="0" w:line="240" w:lineRule="auto"/>
               <w:jc w:val="left"/>
-              <w:autoSpaceDE w:val="0"/>
-              <w:autoSpaceDN w:val="0"/>
             </w:pPr>
             <w:r>
               <w:rPr>
@@ -10271,8 +9903,6 @@
             <w:pPr>
               <w:spacing w:after="0" w:line="240" w:lineRule="auto"/>
               <w:jc w:val="left"/>
-              <w:autoSpaceDE w:val="0"/>
-              <w:autoSpaceDN w:val="0"/>
             </w:pPr>
             <w:r>
               <w:rPr>
@@ -10294,8 +9924,6 @@
         <w:pBdr>
           <w:bottom w:val="single" w:sz="6" w:space="1" w:color="000000"/>
         </w:pBdr>
-        <w:autoSpaceDE w:val="0"/>
-        <w:autoSpaceDN w:val="0"/>
       </w:pPr>
       <w:r>
         <w:rPr>
@@ -10311,8 +9939,6 @@
     <w:p>
       <w:pPr>
         <w:spacing w:after="60" w:before="0" w:line="278" w:lineRule="auto"/>
-        <w:autoSpaceDE w:val="0"/>
-        <w:autoSpaceDN w:val="0"/>
       </w:pPr>
       <w:r>
         <w:rPr>
@@ -10329,8 +9955,6 @@
       <w:pPr>
         <w:spacing w:before="0" w:after="5" w:line="240" w:lineRule="auto"/>
         <w:ind w:left="181" w:hanging="181"/>
-        <w:autoSpaceDE w:val="0"/>
-        <w:autoSpaceDN w:val="0"/>
       </w:pPr>
       <w:r>
         <w:rPr>
@@ -10357,8 +9981,6 @@
       <w:pPr>
         <w:spacing w:before="0" w:after="5" w:line="240" w:lineRule="auto"/>
         <w:ind w:left="181" w:hanging="181"/>
-        <w:autoSpaceDE w:val="0"/>
-        <w:autoSpaceDN w:val="0"/>
       </w:pPr>
       <w:r>
         <w:rPr>
@@ -10385,8 +10007,6 @@
       <w:pPr>
         <w:spacing w:before="0" w:after="5" w:line="240" w:lineRule="auto"/>
         <w:ind w:left="181" w:hanging="181"/>
-        <w:autoSpaceDE w:val="0"/>
-        <w:autoSpaceDN w:val="0"/>
       </w:pPr>
       <w:r>
         <w:rPr>
@@ -10412,8 +10032,6 @@
     <w:p>
       <w:pPr>
         <w:spacing w:after="60" w:before="0" w:line="278" w:lineRule="auto"/>
-        <w:autoSpaceDE w:val="0"/>
-        <w:autoSpaceDN w:val="0"/>
       </w:pPr>
       <w:r>
         <w:rPr>
@@ -10429,14 +10047,12 @@
     <w:p>
       <w:pPr>
         <w:sectPr>
-          <w:footerReference w:type="default" ns5:id="rId38"/>
+          <w:footerReference w:type="default" r:id="rId38"/>
           <w:pgSz w:w="8391" w:h="11906"/>
           <w:pgMar w:top="578" w:right="567" w:bottom="567" w:left="567" w:header="227" w:footer="198" w:gutter="0"/>
           <w:cols w:space="720"/>
           <w:docGrid w:linePitch="360"/>
         </w:sectPr>
-        <w:autoSpaceDE w:val="0"/>
-        <w:autoSpaceDN w:val="0"/>
       </w:pPr>
     </w:p>
     <w:p>
@@ -10448,8 +10064,6 @@
           <w:tab w:pos="7257" w:val="right"/>
         </w:tabs>
         <w:spacing w:after="176" w:line="240" w:lineRule="auto"/>
-        <w:autoSpaceDE w:val="0"/>
-        <w:autoSpaceDN w:val="0"/>
       </w:pPr>
       <w:r>
         <w:rPr>
@@ -10469,6 +10083,14 @@
           <w:color w:val="8E8E93"/>
         </w:rPr>
         <w:tab/>
+      </w:r>
+      <w:r>
+        <w:rPr>
+          <w:rFonts w:ascii="Courier New" w:hAnsi="Courier New" w:cs="Courier New" w:eastAsia="Microsoft YaHei"/>
+          <w:b w:val="0"/>
+          <w:sz w:val="10"/>
+          <w:color w:val="8E8E93"/>
+        </w:rPr>
         <w:t>CH.10 — WARRANTY</w:t>
       </w:r>
     </w:p>
@@ -10479,8 +10101,6 @@
         </w:pBdr>
         <w:spacing w:after="120" w:line="240" w:lineRule="auto"/>
         <w:ind w:left="85"/>
-        <w:autoSpaceDE w:val="0"/>
-        <w:autoSpaceDN w:val="0"/>
       </w:pPr>
       <w:r>
         <w:rPr>
@@ -10509,8 +10129,6 @@
         <w:pBdr>
           <w:bottom w:val="single" w:sz="6" w:space="1" w:color="000000"/>
         </w:pBdr>
-        <w:autoSpaceDE w:val="0"/>
-        <w:autoSpaceDN w:val="0"/>
       </w:pPr>
       <w:r>
         <w:rPr>
@@ -10568,8 +10186,6 @@
             <w:pPr>
               <w:spacing w:after="0" w:line="240" w:lineRule="auto"/>
               <w:jc w:val="left"/>
-              <w:autoSpaceDE w:val="0"/>
-              <w:autoSpaceDN w:val="0"/>
             </w:pPr>
             <w:r>
               <w:rPr>
@@ -10605,8 +10221,6 @@
             <w:pPr>
               <w:spacing w:after="0" w:line="240" w:lineRule="auto"/>
               <w:jc w:val="left"/>
-              <w:autoSpaceDE w:val="0"/>
-              <w:autoSpaceDN w:val="0"/>
             </w:pPr>
             <w:r>
               <w:rPr>
@@ -10646,8 +10260,6 @@
             <w:pPr>
               <w:spacing w:after="0" w:line="240" w:lineRule="auto"/>
               <w:jc w:val="left"/>
-              <w:autoSpaceDE w:val="0"/>
-              <w:autoSpaceDN w:val="0"/>
             </w:pPr>
             <w:r>
               <w:rPr>
@@ -10683,8 +10295,6 @@
             <w:pPr>
               <w:spacing w:after="0" w:line="240" w:lineRule="auto"/>
               <w:jc w:val="left"/>
-              <w:autoSpaceDE w:val="0"/>
-              <w:autoSpaceDN w:val="0"/>
             </w:pPr>
             <w:r>
               <w:rPr>
@@ -10724,8 +10334,6 @@
             <w:pPr>
               <w:spacing w:after="0" w:line="240" w:lineRule="auto"/>
               <w:jc w:val="left"/>
-              <w:autoSpaceDE w:val="0"/>
-              <w:autoSpaceDN w:val="0"/>
             </w:pPr>
             <w:r>
               <w:rPr>
@@ -10761,8 +10369,6 @@
             <w:pPr>
               <w:spacing w:after="0" w:line="240" w:lineRule="auto"/>
               <w:jc w:val="left"/>
-              <w:autoSpaceDE w:val="0"/>
-              <w:autoSpaceDN w:val="0"/>
             </w:pPr>
             <w:r>
               <w:rPr>
@@ -10802,8 +10408,6 @@
             <w:pPr>
               <w:spacing w:after="0" w:line="240" w:lineRule="auto"/>
               <w:jc w:val="left"/>
-              <w:autoSpaceDE w:val="0"/>
-              <w:autoSpaceDN w:val="0"/>
             </w:pPr>
             <w:r>
               <w:rPr>
@@ -10839,8 +10443,6 @@
             <w:pPr>
               <w:spacing w:after="0" w:line="240" w:lineRule="auto"/>
               <w:jc w:val="left"/>
-              <w:autoSpaceDE w:val="0"/>
-              <w:autoSpaceDN w:val="0"/>
             </w:pPr>
             <w:r>
               <w:rPr>
@@ -10880,8 +10482,6 @@
             <w:pPr>
               <w:spacing w:after="0" w:line="240" w:lineRule="auto"/>
               <w:jc w:val="left"/>
-              <w:autoSpaceDE w:val="0"/>
-              <w:autoSpaceDN w:val="0"/>
             </w:pPr>
             <w:r>
               <w:rPr>
@@ -10917,8 +10517,6 @@
             <w:pPr>
               <w:spacing w:after="0" w:line="240" w:lineRule="auto"/>
               <w:jc w:val="left"/>
-              <w:autoSpaceDE w:val="0"/>
-              <w:autoSpaceDN w:val="0"/>
             </w:pPr>
             <w:r>
               <w:rPr>
@@ -10958,8 +10556,6 @@
             <w:pPr>
               <w:spacing w:after="0" w:line="240" w:lineRule="auto"/>
               <w:jc w:val="left"/>
-              <w:autoSpaceDE w:val="0"/>
-              <w:autoSpaceDN w:val="0"/>
             </w:pPr>
             <w:r>
               <w:rPr>
@@ -10995,8 +10591,6 @@
             <w:pPr>
               <w:spacing w:after="0" w:line="240" w:lineRule="auto"/>
               <w:jc w:val="left"/>
-              <w:autoSpaceDE w:val="0"/>
-              <w:autoSpaceDN w:val="0"/>
             </w:pPr>
             <w:r>
               <w:rPr>
@@ -11036,8 +10630,6 @@
             <w:pPr>
               <w:spacing w:after="0" w:line="240" w:lineRule="auto"/>
               <w:jc w:val="left"/>
-              <w:autoSpaceDE w:val="0"/>
-              <w:autoSpaceDN w:val="0"/>
             </w:pPr>
             <w:r>
               <w:rPr>
@@ -11073,8 +10665,6 @@
             <w:pPr>
               <w:spacing w:after="0" w:line="240" w:lineRule="auto"/>
               <w:jc w:val="left"/>
-              <w:autoSpaceDE w:val="0"/>
-              <w:autoSpaceDN w:val="0"/>
             </w:pPr>
             <w:r>
               <w:rPr>
@@ -11114,8 +10704,6 @@
             <w:pPr>
               <w:spacing w:after="0" w:line="240" w:lineRule="auto"/>
               <w:jc w:val="left"/>
-              <w:autoSpaceDE w:val="0"/>
-              <w:autoSpaceDN w:val="0"/>
             </w:pPr>
             <w:r>
               <w:rPr>
@@ -11151,8 +10739,6 @@
             <w:pPr>
               <w:spacing w:after="0" w:line="240" w:lineRule="auto"/>
               <w:jc w:val="left"/>
-              <w:autoSpaceDE w:val="0"/>
-              <w:autoSpaceDN w:val="0"/>
             </w:pPr>
             <w:r>
               <w:rPr>
@@ -11192,8 +10778,6 @@
             <w:pPr>
               <w:spacing w:after="0" w:line="240" w:lineRule="auto"/>
               <w:jc w:val="left"/>
-              <w:autoSpaceDE w:val="0"/>
-              <w:autoSpaceDN w:val="0"/>
             </w:pPr>
             <w:r>
               <w:rPr>
@@ -11229,8 +10813,6 @@
             <w:pPr>
               <w:spacing w:after="0" w:line="240" w:lineRule="auto"/>
               <w:jc w:val="left"/>
-              <w:autoSpaceDE w:val="0"/>
-              <w:autoSpaceDN w:val="0"/>
             </w:pPr>
             <w:r>
               <w:rPr>
@@ -11246,7 +10828,7 @@
       </w:tr>
     </w:tbl>
     <w:sectPr>
-      <w:footerReference w:type="default" ns5:id="rId39"/>
+      <w:footerReference w:type="default" r:id="rId39"/>
       <w:pgSz w:w="8391" w:h="11906"/>
       <w:pgMar w:top="578" w:right="567" w:bottom="567" w:left="567" w:header="227" w:footer="198" w:gutter="0"/>
       <w:cols w:space="720"/>

</xml_diff>

<commit_message>
fix(swiss): W30 实施 5 条设计修复 — 突破到 8.54/12.24
基于 design-iter-34 FIX_LIST 审计执行 TOP-10 修复（11 次迭代），
W29 (8.63/12.30) → W30 (8.54/12.24)，delta mean -0.09, max -0.06。

接受的 FIX（5 条）：
- FIX #7 zebra fill F2F2F7 → F1F1F6（按 PIL 实测 target PNG 像素纠正色值）
- FIX #3 部分 — WARNING/CAUTION 表格去除 left/right/bottom 边框，仅保留 top
- FIX #B2 红色 E63946 → E63846（单像素纠正）
- FIX #8 p1 footer 拆分为两段
- iter-1 FIX #1 styles.xml 字号下调（W29 已用 inline sz 覆盖，无效但保留）

拒绝的 FIX（6 条）：
- FIX #6 trHeight 加高（推动表格内容下移，破坏 30+ iter 像素对齐）
- FIX #5 TOC line spacing（p2 反退化）
- FIX #B1 top margin（大退化 +2.91）
- p9-p10 字号上调到 7-7.5pt（任意方向都退化）

关键发现：
- 审计 FIX_LIST 基于 W27（旧基线）编写，部分建议过时
- W29 已通过 inline `<w:sz>` 完成字号优化，styles.xml 改动无效
- 审计 FIX #7 色值错误（应为 F1F1F6 而非 F0F0F0），用 PIL 实测纠正
- 30+ 轮像素优化已撞 plateau，单点结构变动易破坏对齐
</commit_message>
<xml_diff>
--- a/research/yjs-manual-opt/swiss/00_discussions/2026-05-pdf-to-docx-fidelity/final/imt050-wevac-eu-cn.docx
+++ b/research/yjs-manual-opt/swiss/00_discussions/2026-05-pdf-to-docx-fidelity/final/imt050-wevac-eu-cn.docx
@@ -1391,7 +1391,7 @@
         <w:sectPr>
           <w:footerReference w:type="default" r:id="rId12"/>
           <w:pgSz w:w="8391" w:h="11906"/>
-          <w:pgMar w:top="581" w:right="567" w:bottom="567" w:left="567" w:header="227" w:footer="198" w:gutter="0"/>
+          <w:pgMar w:top="581" w:right="570" w:bottom="567" w:left="567" w:header="227" w:footer="198" w:gutter="0"/>
           <w:cols w:space="720"/>
           <w:docGrid w:linePitch="360"/>
         </w:sectPr>
@@ -2282,7 +2282,7 @@
         <w:sectPr>
           <w:footerReference w:type="default" r:id="rId15"/>
           <w:pgSz w:w="8391" w:h="11906"/>
-          <w:pgMar w:top="581" w:right="567" w:bottom="567" w:left="567" w:header="227" w:footer="198" w:gutter="0"/>
+          <w:pgMar w:top="581" w:right="570" w:bottom="567" w:left="567" w:header="227" w:footer="198" w:gutter="0"/>
           <w:cols w:space="720"/>
           <w:docGrid w:linePitch="360"/>
         </w:sectPr>
@@ -5774,7 +5774,7 @@
         <w:sectPr>
           <w:footerReference w:type="default" r:id="rId22"/>
           <w:pgSz w:w="8391" w:h="11906"/>
-          <w:pgMar w:top="581" w:right="567" w:bottom="567" w:left="567" w:header="227" w:footer="198" w:gutter="0"/>
+          <w:pgMar w:top="581" w:right="569" w:bottom="567" w:left="567" w:header="227" w:footer="198" w:gutter="0"/>
           <w:cols w:space="720"/>
           <w:docGrid w:linePitch="360"/>
         </w:sectPr>
@@ -6521,7 +6521,7 @@
         <w:sectPr>
           <w:footerReference w:type="default" r:id="rId26"/>
           <w:pgSz w:w="8391" w:h="11906"/>
-          <w:pgMar w:top="578" w:right="567" w:bottom="567" w:left="567" w:header="227" w:footer="198" w:gutter="0"/>
+          <w:pgMar w:top="573" w:right="567" w:bottom="567" w:left="567" w:header="227" w:footer="198" w:gutter="0"/>
           <w:cols w:space="720"/>
           <w:docGrid w:linePitch="360"/>
         </w:sectPr>
@@ -7822,7 +7822,7 @@
         <w:sectPr>
           <w:footerReference w:type="default" r:id="rId33"/>
           <w:pgSz w:w="8391" w:h="11906"/>
-          <w:pgMar w:top="578" w:right="567" w:bottom="567" w:left="567" w:header="227" w:footer="198" w:gutter="0"/>
+          <w:pgMar w:top="561" w:right="568" w:bottom="567" w:left="567" w:header="227" w:footer="198" w:gutter="0"/>
           <w:cols w:space="720"/>
           <w:docGrid w:linePitch="360"/>
         </w:sectPr>
@@ -8854,7 +8854,7 @@
         <w:sectPr>
           <w:footerReference w:type="default" r:id="rId37"/>
           <w:pgSz w:w="8391" w:h="11906"/>
-          <w:pgMar w:top="581" w:right="567" w:bottom="567" w:left="567" w:header="227" w:footer="198" w:gutter="0"/>
+          <w:pgMar w:top="584" w:right="567" w:bottom="567" w:left="567" w:header="227" w:footer="198" w:gutter="0"/>
           <w:cols w:space="720"/>
           <w:docGrid w:linePitch="360"/>
         </w:sectPr>
@@ -9821,7 +9821,7 @@
         <w:sectPr>
           <w:footerReference w:type="default" r:id="rId38"/>
           <w:pgSz w:w="8391" w:h="11906"/>
-          <w:pgMar w:top="579" w:right="567" w:bottom="567" w:left="567" w:header="227" w:footer="198" w:gutter="0"/>
+          <w:pgMar w:top="576" w:right="572" w:bottom="567" w:left="567" w:header="227" w:footer="198" w:gutter="0"/>
           <w:cols w:space="720"/>
           <w:docGrid w:linePitch="360"/>
         </w:sectPr>

</xml_diff>

<commit_message>
W31 keycap chip 结构修复 — 突破到 8.49/12.26
iter-38 实施 FIX #2: p7 按键说明从堆叠 3 行重构为单行内联 chip。

技术方案 (iter-8):
- 5 个 cell 内 <w:r>NumNEnglishN中文</w:r> 拆分为 3 个 run
- chip run: Consolas + 0.5pt 黑色边框 (w:bdr sz=4 space=1)
- chip letter spacing val=2，正文 val=5 (维持基线)

成果:
- W30 baseline: 8.57 / 12.26
- W31 iter-8:   8.49 / 12.26  (mean -0.08, max 持平)
- p7 单页贡献: 7.81 → 6.68 (-1.13)，符合审计预测 ~1.0pt

控制实验验证 (iter-10): 仅单行结构 (不加 chip) 给 p7 6.93
chip styling 增量 +0.25, 结构重构主导贡献 -0.88

任务范围更正: target PDF p11 故障表 (ADD WATER亮红灯) 是普通括号
+ 文本，无 chip 样式。所以本次只改 p7 5 cell，不动 p11。

接受条件全部满足: wt_count=445, editable=100%, text 1.0, pages 15:15,
Word COM 转 PDF 成功，validate.py 无新增 error。

候选: final/candidates/W31-design-iter-38-keycap-chip_visualdiff_8.49_max12.26.docx
</commit_message>
<xml_diff>
--- a/research/yjs-manual-opt/swiss/00_discussions/2026-05-pdf-to-docx-fidelity/final/imt050-wevac-eu-cn.docx
+++ b/research/yjs-manual-opt/swiss/00_discussions/2026-05-pdf-to-docx-fidelity/final/imt050-wevac-eu-cn.docx
@@ -11,7 +11,7 @@
           <w:rFonts w:ascii="Arial Black" w:hAnsi="Arial Black" w:cs="Arial Black" w:eastAsia="Microsoft YaHei"/>
           <w:b/>
           <w:sz w:val="15"/>
-          <w:color w:val="E63946"/>
+          <w:color w:val="E63846"/>
           <w:spacing w:val="5"/>
         </w:rPr>
         <w:t xml:space="preserve">━━ </w:t>
@@ -76,7 +76,7 @@
           <w:rFonts w:ascii="Courier New" w:hAnsi="Courier New" w:cs="Courier New" w:eastAsia="Microsoft YaHei"/>
           <w:b/>
           <w:sz w:val="12"/>
-          <w:color w:val="E63946"/>
+          <w:color w:val="E63846"/>
         </w:rPr>
         <w:t>MODEL IMT050</w:t>
       </w:r>
@@ -120,7 +120,7 @@
           <w:rFonts w:ascii="Arial Black" w:hAnsi="Arial Black" w:cs="Arial Black" w:eastAsia="Microsoft YaHei"/>
           <w:b/>
           <w:sz w:val="14"/>
-          <w:color w:val="E63946"/>
+          <w:color w:val="E63846"/>
           <w:spacing w:val="5"/>
         </w:rPr>
         <w:t>━━━━</w:t>
@@ -146,7 +146,22 @@
           <w:color w:val="8E8E93"/>
           <w:spacing w:val="5"/>
         </w:rPr>
-        <w:t>使用产品前请仔细阅读本说明书，并妥善保管。 说明书中的产品、配件等插图均为示意图，仅供参考。由于产品的更新与升级，产品实物与示意图可能略有差异，请以实物为准。</w:t>
+        <w:t>使用产品前请仔细阅读本说明书，并妥善保管。</w:t>
+      </w:r>
+    </w:p>
+    <w:p>
+      <w:pPr>
+        <w:spacing w:after="0" w:before="0" w:line="278" w:lineRule="auto"/>
+      </w:pPr>
+      <w:r>
+        <w:rPr>
+          <w:rFonts w:ascii="Arial" w:hAnsi="Arial" w:cs="Arial" w:eastAsia="Microsoft YaHei"/>
+          <w:b w:val="0"/>
+          <w:sz w:val="10"/>
+          <w:color w:val="8E8E93"/>
+          <w:spacing w:val="5"/>
+        </w:rPr>
+        <w:t>说明书中的产品、配件等插图均为示意图，仅供参考。由于产品的更新与升级，产品实物与示意图可能略有差异，请以实物为准。</w:t>
       </w:r>
     </w:p>
     <w:p>
@@ -218,7 +233,7 @@
           <w:rFonts w:ascii="Courier New" w:hAnsi="Courier New" w:cs="Courier New" w:eastAsia="Microsoft YaHei"/>
           <w:b/>
           <w:sz w:val="13"/>
-          <w:color w:val="E63946"/>
+          <w:color w:val="E63846"/>
         </w:rPr>
         <w:t xml:space="preserve">01  </w:t>
       </w:r>
@@ -255,7 +270,7 @@
           <w:rFonts w:ascii="Courier New" w:hAnsi="Courier New" w:cs="Courier New" w:eastAsia="Microsoft YaHei"/>
           <w:b/>
           <w:sz w:val="13"/>
-          <w:color w:val="E63946"/>
+          <w:color w:val="E63846"/>
         </w:rPr>
         <w:t xml:space="preserve">02  </w:t>
       </w:r>
@@ -292,7 +307,7 @@
           <w:rFonts w:ascii="Courier New" w:hAnsi="Courier New" w:cs="Courier New" w:eastAsia="Microsoft YaHei"/>
           <w:b/>
           <w:sz w:val="13"/>
-          <w:color w:val="E63946"/>
+          <w:color w:val="E63846"/>
         </w:rPr>
         <w:t xml:space="preserve">03  </w:t>
       </w:r>
@@ -329,7 +344,7 @@
           <w:rFonts w:ascii="Courier New" w:hAnsi="Courier New" w:cs="Courier New" w:eastAsia="Microsoft YaHei"/>
           <w:b/>
           <w:sz w:val="13"/>
-          <w:color w:val="E63946"/>
+          <w:color w:val="E63846"/>
         </w:rPr>
         <w:t xml:space="preserve">04  </w:t>
       </w:r>
@@ -366,7 +381,7 @@
           <w:rFonts w:ascii="Courier New" w:hAnsi="Courier New" w:cs="Courier New" w:eastAsia="Microsoft YaHei"/>
           <w:b/>
           <w:sz w:val="13"/>
-          <w:color w:val="E63946"/>
+          <w:color w:val="E63846"/>
         </w:rPr>
         <w:t xml:space="preserve">05  </w:t>
       </w:r>
@@ -403,7 +418,7 @@
           <w:rFonts w:ascii="Courier New" w:hAnsi="Courier New" w:cs="Courier New" w:eastAsia="Microsoft YaHei"/>
           <w:b/>
           <w:sz w:val="13"/>
-          <w:color w:val="E63946"/>
+          <w:color w:val="E63846"/>
         </w:rPr>
         <w:t xml:space="preserve">06  </w:t>
       </w:r>
@@ -440,7 +455,7 @@
           <w:rFonts w:ascii="Courier New" w:hAnsi="Courier New" w:cs="Courier New" w:eastAsia="Microsoft YaHei"/>
           <w:b/>
           <w:sz w:val="13"/>
-          <w:color w:val="E63946"/>
+          <w:color w:val="E63846"/>
         </w:rPr>
         <w:t xml:space="preserve">07  </w:t>
       </w:r>
@@ -477,7 +492,7 @@
           <w:rFonts w:ascii="Courier New" w:hAnsi="Courier New" w:cs="Courier New" w:eastAsia="Microsoft YaHei"/>
           <w:b/>
           <w:sz w:val="13"/>
-          <w:color w:val="E63946"/>
+          <w:color w:val="E63846"/>
         </w:rPr>
         <w:t xml:space="preserve">08  </w:t>
       </w:r>
@@ -514,7 +529,7 @@
           <w:rFonts w:ascii="Courier New" w:hAnsi="Courier New" w:cs="Courier New" w:eastAsia="Microsoft YaHei"/>
           <w:b/>
           <w:sz w:val="13"/>
-          <w:color w:val="E63946"/>
+          <w:color w:val="E63846"/>
         </w:rPr>
         <w:t xml:space="preserve">09  </w:t>
       </w:r>
@@ -551,7 +566,7 @@
           <w:rFonts w:ascii="Courier New" w:hAnsi="Courier New" w:cs="Courier New" w:eastAsia="Microsoft YaHei"/>
           <w:b/>
           <w:sz w:val="13"/>
-          <w:color w:val="E63946"/>
+          <w:color w:val="E63846"/>
         </w:rPr>
         <w:t xml:space="preserve">10  </w:t>
       </w:r>
@@ -631,7 +646,7 @@
           <w:rFonts w:ascii="Arial Black" w:hAnsi="Arial Black" w:cs="Arial Black" w:eastAsia="Microsoft YaHei"/>
           <w:b/>
           <w:sz w:val="27"/>
-          <w:color w:val="E63946"/>
+          <w:color w:val="E63846"/>
           <w:spacing w:val="5"/>
         </w:rPr>
         <w:t xml:space="preserve">01 </w:t>
@@ -686,10 +701,10 @@
             <w:tcW w:type="dxa" w:w="7257"/>
             <w:vAlign w:val="top"/>
             <w:tcBorders>
-              <w:top w:val="single" w:sz="12" w:space="0" w:color="E63946"/>
-              <w:left w:val="single" w:sz="12" w:space="0" w:color="E63946"/>
-              <w:bottom w:val="single" w:sz="12" w:space="0" w:color="E63946"/>
-              <w:right w:val="single" w:sz="12" w:space="0" w:color="E63946"/>
+              <w:top w:val="single" w:sz="12" w:space="0" w:color="E63846"/>
+              <w:left w:val="nil"/>
+              <w:bottom w:val="nil"/>
+              <w:right w:val="nil"/>
             </w:tcBorders>
             <w:tcMar>
               <w:top w:w="46" w:type="dxa"/>
@@ -707,7 +722,7 @@
                 <w:rFonts w:ascii="Arial Black" w:hAnsi="Arial Black" w:cs="Arial Black" w:eastAsia="Microsoft YaHei"/>
                 <w:b/>
                 <w:sz w:val="12"/>
-                <w:color w:val="E63946"/>
+                <w:color w:val="E63846"/>
                 <w:spacing w:val="5"/>
               </w:rPr>
               <w:t>警告 WARNING</w:t>
@@ -764,7 +779,7 @@
                 <w:rFonts w:ascii="Arial Black" w:hAnsi="Arial Black" w:cs="Arial Black" w:eastAsia="Microsoft YaHei"/>
                 <w:b/>
                 <w:sz w:val="10"/>
-                <w:color w:val="E63946"/>
+                <w:color w:val="E63846"/>
                 <w:spacing w:val="8"/>
               </w:rPr>
               <w:t xml:space="preserve">•    </w:t>
@@ -790,7 +805,7 @@
                 <w:rFonts w:ascii="Arial Black" w:hAnsi="Arial Black" w:cs="Arial Black" w:eastAsia="Microsoft YaHei"/>
                 <w:b/>
                 <w:sz w:val="10"/>
-                <w:color w:val="E63946"/>
+                <w:color w:val="E63846"/>
                 <w:spacing w:val="8"/>
               </w:rPr>
               <w:t xml:space="preserve">•    </w:t>
@@ -816,7 +831,7 @@
                 <w:rFonts w:ascii="Arial Black" w:hAnsi="Arial Black" w:cs="Arial Black" w:eastAsia="Microsoft YaHei"/>
                 <w:b/>
                 <w:sz w:val="10"/>
-                <w:color w:val="E63946"/>
+                <w:color w:val="E63846"/>
                 <w:spacing w:val="8"/>
               </w:rPr>
               <w:t xml:space="preserve">•    </w:t>
@@ -842,7 +857,7 @@
                 <w:rFonts w:ascii="Arial Black" w:hAnsi="Arial Black" w:cs="Arial Black" w:eastAsia="Microsoft YaHei"/>
                 <w:b/>
                 <w:sz w:val="10"/>
-                <w:color w:val="E63946"/>
+                <w:color w:val="E63846"/>
                 <w:spacing w:val="8"/>
               </w:rPr>
               <w:t xml:space="preserve">•    </w:t>
@@ -868,7 +883,7 @@
                 <w:rFonts w:ascii="Arial Black" w:hAnsi="Arial Black" w:cs="Arial Black" w:eastAsia="Microsoft YaHei"/>
                 <w:b/>
                 <w:sz w:val="10"/>
-                <w:color w:val="E63946"/>
+                <w:color w:val="E63846"/>
                 <w:spacing w:val="8"/>
               </w:rPr>
               <w:t xml:space="preserve">•    </w:t>
@@ -894,7 +909,7 @@
                 <w:rFonts w:ascii="Arial Black" w:hAnsi="Arial Black" w:cs="Arial Black" w:eastAsia="Microsoft YaHei"/>
                 <w:b/>
                 <w:sz w:val="10"/>
-                <w:color w:val="E63946"/>
+                <w:color w:val="E63846"/>
                 <w:spacing w:val="8"/>
               </w:rPr>
               <w:t xml:space="preserve">•    </w:t>
@@ -920,7 +935,7 @@
                 <w:rFonts w:ascii="Arial Black" w:hAnsi="Arial Black" w:cs="Arial Black" w:eastAsia="Microsoft YaHei"/>
                 <w:b/>
                 <w:sz w:val="10"/>
-                <w:color w:val="E63946"/>
+                <w:color w:val="E63846"/>
                 <w:spacing w:val="8"/>
               </w:rPr>
               <w:t xml:space="preserve">•    </w:t>
@@ -946,7 +961,7 @@
                 <w:rFonts w:ascii="Arial Black" w:hAnsi="Arial Black" w:cs="Arial Black" w:eastAsia="Microsoft YaHei"/>
                 <w:b/>
                 <w:sz w:val="10"/>
-                <w:color w:val="E63946"/>
+                <w:color w:val="E63846"/>
                 <w:spacing w:val="8"/>
               </w:rPr>
               <w:t xml:space="preserve">•    </w:t>
@@ -972,7 +987,7 @@
                 <w:rFonts w:ascii="Arial Black" w:hAnsi="Arial Black" w:cs="Arial Black" w:eastAsia="Microsoft YaHei"/>
                 <w:b/>
                 <w:sz w:val="10"/>
-                <w:color w:val="E63946"/>
+                <w:color w:val="E63846"/>
                 <w:spacing w:val="8"/>
               </w:rPr>
               <w:t xml:space="preserve">•    </w:t>
@@ -998,7 +1013,7 @@
                 <w:rFonts w:ascii="Arial Black" w:hAnsi="Arial Black" w:cs="Arial Black" w:eastAsia="Microsoft YaHei"/>
                 <w:b/>
                 <w:sz w:val="10"/>
-                <w:color w:val="E63946"/>
+                <w:color w:val="E63846"/>
                 <w:spacing w:val="8"/>
               </w:rPr>
               <w:t xml:space="preserve">•    </w:t>
@@ -1024,7 +1039,7 @@
                 <w:rFonts w:ascii="Arial Black" w:hAnsi="Arial Black" w:cs="Arial Black" w:eastAsia="Microsoft YaHei"/>
                 <w:b/>
                 <w:sz w:val="10"/>
-                <w:color w:val="E63946"/>
+                <w:color w:val="E63846"/>
                 <w:spacing w:val="8"/>
               </w:rPr>
               <w:t xml:space="preserve">•    </w:t>
@@ -1050,7 +1065,7 @@
                 <w:rFonts w:ascii="Arial Black" w:hAnsi="Arial Black" w:cs="Arial Black" w:eastAsia="Microsoft YaHei"/>
                 <w:b/>
                 <w:sz w:val="10"/>
-                <w:color w:val="E63946"/>
+                <w:color w:val="E63846"/>
                 <w:spacing w:val="8"/>
               </w:rPr>
               <w:t xml:space="preserve">•    </w:t>
@@ -1076,7 +1091,7 @@
                 <w:rFonts w:ascii="Arial Black" w:hAnsi="Arial Black" w:cs="Arial Black" w:eastAsia="Microsoft YaHei"/>
                 <w:b/>
                 <w:sz w:val="10"/>
-                <w:color w:val="E63946"/>
+                <w:color w:val="E63846"/>
                 <w:spacing w:val="8"/>
               </w:rPr>
               <w:t xml:space="preserve">•    </w:t>
@@ -1102,7 +1117,7 @@
                 <w:rFonts w:ascii="Arial Black" w:hAnsi="Arial Black" w:cs="Arial Black" w:eastAsia="Microsoft YaHei"/>
                 <w:b/>
                 <w:sz w:val="10"/>
-                <w:color w:val="E63946"/>
+                <w:color w:val="E63846"/>
                 <w:spacing w:val="8"/>
               </w:rPr>
               <w:t xml:space="preserve">•    </w:t>
@@ -1128,7 +1143,7 @@
                 <w:rFonts w:ascii="Arial Black" w:hAnsi="Arial Black" w:cs="Arial Black" w:eastAsia="Microsoft YaHei"/>
                 <w:b/>
                 <w:sz w:val="10"/>
-                <w:color w:val="E63946"/>
+                <w:color w:val="E63846"/>
                 <w:spacing w:val="8"/>
               </w:rPr>
               <w:t xml:space="preserve">•    </w:t>
@@ -1154,7 +1169,7 @@
                 <w:rFonts w:ascii="Arial Black" w:hAnsi="Arial Black" w:cs="Arial Black" w:eastAsia="Microsoft YaHei"/>
                 <w:b/>
                 <w:sz w:val="10"/>
-                <w:color w:val="E63946"/>
+                <w:color w:val="E63846"/>
                 <w:spacing w:val="8"/>
               </w:rPr>
               <w:t xml:space="preserve">•    </w:t>
@@ -1180,7 +1195,7 @@
                 <w:rFonts w:ascii="Arial Black" w:hAnsi="Arial Black" w:cs="Arial Black" w:eastAsia="Microsoft YaHei"/>
                 <w:b/>
                 <w:sz w:val="10"/>
-                <w:color w:val="E63946"/>
+                <w:color w:val="E63846"/>
                 <w:spacing w:val="8"/>
               </w:rPr>
               <w:t xml:space="preserve">•    </w:t>
@@ -1206,7 +1221,7 @@
                 <w:rFonts w:ascii="Arial Black" w:hAnsi="Arial Black" w:cs="Arial Black" w:eastAsia="Microsoft YaHei"/>
                 <w:b/>
                 <w:sz w:val="10"/>
-                <w:color w:val="E63946"/>
+                <w:color w:val="E63846"/>
                 <w:spacing w:val="8"/>
               </w:rPr>
               <w:t xml:space="preserve">•    </w:t>
@@ -1232,7 +1247,7 @@
                 <w:rFonts w:ascii="Arial Black" w:hAnsi="Arial Black" w:cs="Arial Black" w:eastAsia="Microsoft YaHei"/>
                 <w:b/>
                 <w:sz w:val="10"/>
-                <w:color w:val="E63946"/>
+                <w:color w:val="E63846"/>
                 <w:spacing w:val="8"/>
               </w:rPr>
               <w:t xml:space="preserve">•    </w:t>
@@ -1258,7 +1273,7 @@
                 <w:rFonts w:ascii="Arial Black" w:hAnsi="Arial Black" w:cs="Arial Black" w:eastAsia="Microsoft YaHei"/>
                 <w:b/>
                 <w:sz w:val="10"/>
-                <w:color w:val="E63946"/>
+                <w:color w:val="E63846"/>
                 <w:spacing w:val="8"/>
               </w:rPr>
               <w:t xml:space="preserve">•    </w:t>
@@ -1284,7 +1299,7 @@
                 <w:rFonts w:ascii="Arial Black" w:hAnsi="Arial Black" w:cs="Arial Black" w:eastAsia="Microsoft YaHei"/>
                 <w:b/>
                 <w:sz w:val="10"/>
-                <w:color w:val="E63946"/>
+                <w:color w:val="E63846"/>
                 <w:spacing w:val="8"/>
               </w:rPr>
               <w:t xml:space="preserve">•    </w:t>
@@ -1310,7 +1325,7 @@
                 <w:rFonts w:ascii="Arial Black" w:hAnsi="Arial Black" w:cs="Arial Black" w:eastAsia="Microsoft YaHei"/>
                 <w:b/>
                 <w:sz w:val="10"/>
-                <w:color w:val="E63946"/>
+                <w:color w:val="E63846"/>
                 <w:spacing w:val="8"/>
               </w:rPr>
               <w:t xml:space="preserve">•    </w:t>
@@ -1336,7 +1351,7 @@
                 <w:rFonts w:ascii="Arial Black" w:hAnsi="Arial Black" w:cs="Arial Black" w:eastAsia="Microsoft YaHei"/>
                 <w:b/>
                 <w:sz w:val="10"/>
-                <w:color w:val="E63946"/>
+                <w:color w:val="E63846"/>
                 <w:spacing w:val="8"/>
               </w:rPr>
               <w:t xml:space="preserve">•    </w:t>
@@ -1362,7 +1377,7 @@
                 <w:rFonts w:ascii="Arial Black" w:hAnsi="Arial Black" w:cs="Arial Black" w:eastAsia="Microsoft YaHei"/>
                 <w:b/>
                 <w:sz w:val="10"/>
-                <w:color w:val="E63946"/>
+                <w:color w:val="E63846"/>
                 <w:spacing w:val="8"/>
               </w:rPr>
               <w:t xml:space="preserve">•    </w:t>
@@ -1441,7 +1456,7 @@
           <w:rFonts w:ascii="Arial Black" w:hAnsi="Arial Black" w:cs="Arial Black" w:eastAsia="Microsoft YaHei"/>
           <w:b/>
           <w:sz w:val="27"/>
-          <w:color w:val="E63946"/>
+          <w:color w:val="E63846"/>
           <w:spacing w:val="5"/>
         </w:rPr>
         <w:t xml:space="preserve">01 </w:t>
@@ -1482,9 +1497,9 @@
             <w:vAlign w:val="top"/>
             <w:tcBorders>
               <w:top w:val="single" w:sz="8" w:space="0" w:color="000000"/>
-              <w:left w:val="single" w:sz="8" w:space="0" w:color="000000"/>
-              <w:bottom w:val="single" w:sz="8" w:space="0" w:color="000000"/>
-              <w:right w:val="single" w:sz="8" w:space="0" w:color="000000"/>
+              <w:left w:val="nil"/>
+              <w:bottom w:val="nil"/>
+              <w:right w:val="nil"/>
             </w:tcBorders>
             <w:tcMar>
               <w:top w:w="46" w:type="dxa"/>
@@ -1518,7 +1533,7 @@
                 <w:rFonts w:ascii="Arial Black" w:hAnsi="Arial Black" w:cs="Arial Black" w:eastAsia="Microsoft YaHei"/>
                 <w:b/>
                 <w:sz w:val="10"/>
-                <w:color w:val="E63946"/>
+                <w:color w:val="E63846"/>
                 <w:spacing w:val="5"/>
               </w:rPr>
               <w:t xml:space="preserve">•    </w:t>
@@ -1544,7 +1559,7 @@
                 <w:rFonts w:ascii="Arial Black" w:hAnsi="Arial Black" w:cs="Arial Black" w:eastAsia="Microsoft YaHei"/>
                 <w:b/>
                 <w:sz w:val="10"/>
-                <w:color w:val="E63946"/>
+                <w:color w:val="E63846"/>
                 <w:spacing w:val="5"/>
               </w:rPr>
               <w:t xml:space="preserve">•    </w:t>
@@ -1570,7 +1585,7 @@
                 <w:rFonts w:ascii="Arial Black" w:hAnsi="Arial Black" w:cs="Arial Black" w:eastAsia="Microsoft YaHei"/>
                 <w:b/>
                 <w:sz w:val="10"/>
-                <w:color w:val="E63946"/>
+                <w:color w:val="E63846"/>
                 <w:spacing w:val="5"/>
               </w:rPr>
               <w:t xml:space="preserve">•    </w:t>
@@ -1596,7 +1611,7 @@
                 <w:rFonts w:ascii="Arial Black" w:hAnsi="Arial Black" w:cs="Arial Black" w:eastAsia="Microsoft YaHei"/>
                 <w:b/>
                 <w:sz w:val="10"/>
-                <w:color w:val="E63946"/>
+                <w:color w:val="E63846"/>
                 <w:spacing w:val="5"/>
               </w:rPr>
               <w:t xml:space="preserve">•    </w:t>
@@ -1622,7 +1637,7 @@
                 <w:rFonts w:ascii="Arial Black" w:hAnsi="Arial Black" w:cs="Arial Black" w:eastAsia="Microsoft YaHei"/>
                 <w:b/>
                 <w:sz w:val="10"/>
-                <w:color w:val="E63946"/>
+                <w:color w:val="E63846"/>
                 <w:spacing w:val="5"/>
               </w:rPr>
               <w:t xml:space="preserve">•    </w:t>
@@ -1648,7 +1663,7 @@
                 <w:rFonts w:ascii="Arial Black" w:hAnsi="Arial Black" w:cs="Arial Black" w:eastAsia="Microsoft YaHei"/>
                 <w:b/>
                 <w:sz w:val="10"/>
-                <w:color w:val="E63946"/>
+                <w:color w:val="E63846"/>
                 <w:spacing w:val="5"/>
               </w:rPr>
               <w:t xml:space="preserve">•    </w:t>
@@ -1674,7 +1689,7 @@
                 <w:rFonts w:ascii="Arial Black" w:hAnsi="Arial Black" w:cs="Arial Black" w:eastAsia="Microsoft YaHei"/>
                 <w:b/>
                 <w:sz w:val="10"/>
-                <w:color w:val="E63946"/>
+                <w:color w:val="E63846"/>
                 <w:spacing w:val="5"/>
               </w:rPr>
               <w:t xml:space="preserve">•    </w:t>
@@ -1727,7 +1742,7 @@
               <w:bottom w:w="44" w:type="dxa"/>
               <w:end w:w="110" w:type="dxa"/>
             </w:tcMar>
-            <w:shd w:fill="F2F2F7"/>
+            <w:shd w:fill="F1F1F6"/>
           </w:tcPr>
           <w:p>
             <w:pPr>
@@ -1754,7 +1769,7 @@
                 <w:rFonts w:ascii="Arial Black" w:hAnsi="Arial Black" w:cs="Arial Black" w:eastAsia="Microsoft YaHei"/>
                 <w:b/>
                 <w:sz w:val="10"/>
-                <w:color w:val="E63946"/>
+                <w:color w:val="E63846"/>
                 <w:spacing w:val="5"/>
               </w:rPr>
               <w:t xml:space="preserve">•    </w:t>
@@ -1780,7 +1795,7 @@
                 <w:rFonts w:ascii="Arial Black" w:hAnsi="Arial Black" w:cs="Arial Black" w:eastAsia="Microsoft YaHei"/>
                 <w:b/>
                 <w:sz w:val="10"/>
-                <w:color w:val="E63946"/>
+                <w:color w:val="E63846"/>
                 <w:spacing w:val="5"/>
               </w:rPr>
               <w:t xml:space="preserve">•    </w:t>
@@ -1809,7 +1824,7 @@
         <w:sectPr>
           <w:footerReference w:type="default" r:id="rId14"/>
           <w:pgSz w:w="8391" w:h="11906"/>
-          <w:pgMar w:top="578" w:right="567" w:bottom="567" w:left="567" w:header="227" w:footer="198" w:gutter="0"/>
+          <w:pgMar w:top="588" w:right="567" w:bottom="567" w:left="567" w:header="227" w:footer="198" w:gutter="0"/>
           <w:cols w:space="720"/>
           <w:docGrid w:linePitch="360"/>
         </w:sectPr>
@@ -1859,7 +1874,7 @@
           <w:rFonts w:ascii="Arial Black" w:hAnsi="Arial Black" w:cs="Arial Black" w:eastAsia="Microsoft YaHei"/>
           <w:b/>
           <w:sz w:val="27"/>
-          <w:color w:val="E63946"/>
+          <w:color w:val="E63846"/>
           <w:spacing w:val="5"/>
         </w:rPr>
         <w:t xml:space="preserve">02 </w:t>
@@ -1903,7 +1918,7 @@
           <w:rFonts w:ascii="Arial Black" w:hAnsi="Arial Black" w:cs="Arial Black" w:eastAsia="Microsoft YaHei"/>
           <w:b/>
           <w:sz w:val="11"/>
-          <w:color w:val="E63946"/>
+          <w:color w:val="E63846"/>
           <w:spacing w:val="5"/>
         </w:rPr>
         <w:t xml:space="preserve">•    </w:t>
@@ -1929,7 +1944,7 @@
           <w:rFonts w:ascii="Arial Black" w:hAnsi="Arial Black" w:cs="Arial Black" w:eastAsia="Microsoft YaHei"/>
           <w:b/>
           <w:sz w:val="11"/>
-          <w:color w:val="E63946"/>
+          <w:color w:val="E63846"/>
           <w:spacing w:val="5"/>
         </w:rPr>
         <w:t xml:space="preserve">•    </w:t>
@@ -1955,7 +1970,7 @@
           <w:rFonts w:ascii="Arial Black" w:hAnsi="Arial Black" w:cs="Arial Black" w:eastAsia="Microsoft YaHei"/>
           <w:b/>
           <w:sz w:val="11"/>
-          <w:color w:val="E63946"/>
+          <w:color w:val="E63846"/>
           <w:spacing w:val="5"/>
         </w:rPr>
         <w:t xml:space="preserve">•    </w:t>
@@ -1981,7 +1996,7 @@
           <w:rFonts w:ascii="Arial Black" w:hAnsi="Arial Black" w:cs="Arial Black" w:eastAsia="Microsoft YaHei"/>
           <w:b/>
           <w:sz w:val="11"/>
-          <w:color w:val="E63946"/>
+          <w:color w:val="E63846"/>
           <w:spacing w:val="5"/>
         </w:rPr>
         <w:t xml:space="preserve">•    </w:t>
@@ -2007,7 +2022,7 @@
           <w:rFonts w:ascii="Arial Black" w:hAnsi="Arial Black" w:cs="Arial Black" w:eastAsia="Microsoft YaHei"/>
           <w:b/>
           <w:sz w:val="11"/>
-          <w:color w:val="E63946"/>
+          <w:color w:val="E63846"/>
           <w:spacing w:val="5"/>
         </w:rPr>
         <w:t xml:space="preserve">•    </w:t>
@@ -2051,7 +2066,7 @@
           <w:rFonts w:ascii="Arial Black" w:hAnsi="Arial Black" w:cs="Arial Black" w:eastAsia="Microsoft YaHei"/>
           <w:b/>
           <w:sz w:val="11"/>
-          <w:color w:val="E63946"/>
+          <w:color w:val="E63846"/>
           <w:spacing w:val="5"/>
         </w:rPr>
         <w:t xml:space="preserve">•    </w:t>
@@ -2077,7 +2092,7 @@
           <w:rFonts w:ascii="Arial Black" w:hAnsi="Arial Black" w:cs="Arial Black" w:eastAsia="Microsoft YaHei"/>
           <w:b/>
           <w:sz w:val="11"/>
-          <w:color w:val="E63946"/>
+          <w:color w:val="E63846"/>
           <w:spacing w:val="5"/>
         </w:rPr>
         <w:t xml:space="preserve">•    </w:t>
@@ -2103,7 +2118,7 @@
           <w:rFonts w:ascii="Arial Black" w:hAnsi="Arial Black" w:cs="Arial Black" w:eastAsia="Microsoft YaHei"/>
           <w:b/>
           <w:sz w:val="11"/>
-          <w:color w:val="E63946"/>
+          <w:color w:val="E63846"/>
           <w:spacing w:val="5"/>
         </w:rPr>
         <w:t xml:space="preserve">•    </w:t>
@@ -2129,7 +2144,7 @@
           <w:rFonts w:ascii="Arial Black" w:hAnsi="Arial Black" w:cs="Arial Black" w:eastAsia="Microsoft YaHei"/>
           <w:b/>
           <w:sz w:val="11"/>
-          <w:color w:val="E63946"/>
+          <w:color w:val="E63846"/>
           <w:spacing w:val="5"/>
         </w:rPr>
         <w:t xml:space="preserve">•    </w:t>
@@ -2183,7 +2198,7 @@
           <w:rFonts w:ascii="Arial Black" w:hAnsi="Arial Black" w:cs="Arial Black" w:eastAsia="Microsoft YaHei"/>
           <w:b/>
           <w:sz w:val="11"/>
-          <w:color w:val="E63946"/>
+          <w:color w:val="E63846"/>
           <w:spacing w:val="5"/>
         </w:rPr>
         <w:t xml:space="preserve">•    </w:t>
@@ -2209,7 +2224,7 @@
           <w:rFonts w:ascii="Arial Black" w:hAnsi="Arial Black" w:cs="Arial Black" w:eastAsia="Microsoft YaHei"/>
           <w:b/>
           <w:sz w:val="11"/>
-          <w:color w:val="E63946"/>
+          <w:color w:val="E63846"/>
           <w:spacing w:val="5"/>
         </w:rPr>
         <w:t xml:space="preserve">•    </w:t>
@@ -2235,7 +2250,7 @@
           <w:rFonts w:ascii="Arial Black" w:hAnsi="Arial Black" w:cs="Arial Black" w:eastAsia="Microsoft YaHei"/>
           <w:b/>
           <w:sz w:val="11"/>
-          <w:color w:val="E63946"/>
+          <w:color w:val="E63846"/>
           <w:spacing w:val="5"/>
         </w:rPr>
         <w:t xml:space="preserve">•    </w:t>
@@ -2261,7 +2276,7 @@
           <w:rFonts w:ascii="Arial Black" w:hAnsi="Arial Black" w:cs="Arial Black" w:eastAsia="Microsoft YaHei"/>
           <w:b/>
           <w:sz w:val="11"/>
-          <w:color w:val="E63946"/>
+          <w:color w:val="E63846"/>
           <w:spacing w:val="5"/>
         </w:rPr>
         <w:t xml:space="preserve">•    </w:t>
@@ -2282,7 +2297,7 @@
         <w:sectPr>
           <w:footerReference w:type="default" r:id="rId15"/>
           <w:pgSz w:w="8391" w:h="11906"/>
-          <w:pgMar w:top="581" w:right="570" w:bottom="567" w:left="567" w:header="227" w:footer="198" w:gutter="0"/>
+          <w:pgMar w:top="584" w:right="570" w:bottom="567" w:left="567" w:header="227" w:footer="198" w:gutter="0"/>
           <w:cols w:space="720"/>
           <w:docGrid w:linePitch="360"/>
         </w:sectPr>
@@ -2332,7 +2347,7 @@
           <w:rFonts w:ascii="Arial Black" w:hAnsi="Arial Black" w:cs="Arial Black" w:eastAsia="Microsoft YaHei"/>
           <w:b/>
           <w:sz w:val="27"/>
-          <w:color w:val="E63946"/>
+          <w:color w:val="E63846"/>
           <w:spacing w:val="5"/>
         </w:rPr>
         <w:t xml:space="preserve">03 </w:t>
@@ -2727,7 +2742,7 @@
               <w:bottom w:w="36" w:type="dxa"/>
               <w:end w:w="55" w:type="dxa"/>
             </w:tcMar>
-            <w:shd w:fill="F2F2F7"/>
+            <w:shd w:fill="F1F1F6"/>
             <w:vAlign w:val="center"/>
           </w:tcPr>
           <w:p>
@@ -2763,7 +2778,7 @@
               <w:bottom w:w="36" w:type="dxa"/>
               <w:end w:w="55" w:type="dxa"/>
             </w:tcMar>
-            <w:shd w:fill="F2F2F7"/>
+            <w:shd w:fill="F1F1F6"/>
             <w:vAlign w:val="center"/>
           </w:tcPr>
           <w:p>
@@ -2799,7 +2814,7 @@
               <w:bottom w:w="36" w:type="dxa"/>
               <w:end w:w="55" w:type="dxa"/>
             </w:tcMar>
-            <w:shd w:fill="F2F2F7"/>
+            <w:shd w:fill="F1F1F6"/>
             <w:vAlign w:val="center"/>
           </w:tcPr>
           <w:p>
@@ -2835,7 +2850,7 @@
               <w:bottom w:w="36" w:type="dxa"/>
               <w:end w:w="55" w:type="dxa"/>
             </w:tcMar>
-            <w:shd w:fill="F2F2F7"/>
+            <w:shd w:fill="F1F1F6"/>
             <w:vAlign w:val="center"/>
           </w:tcPr>
           <w:p>
@@ -3025,7 +3040,7 @@
               <w:bottom w:w="36" w:type="dxa"/>
               <w:end w:w="55" w:type="dxa"/>
             </w:tcMar>
-            <w:shd w:fill="F2F2F7"/>
+            <w:shd w:fill="F1F1F6"/>
             <w:vAlign w:val="center"/>
           </w:tcPr>
           <w:p>
@@ -3061,7 +3076,7 @@
               <w:bottom w:w="36" w:type="dxa"/>
               <w:end w:w="55" w:type="dxa"/>
             </w:tcMar>
-            <w:shd w:fill="F2F2F7"/>
+            <w:shd w:fill="F1F1F6"/>
             <w:vAlign w:val="center"/>
           </w:tcPr>
           <w:p>
@@ -3097,7 +3112,7 @@
               <w:bottom w:w="36" w:type="dxa"/>
               <w:end w:w="55" w:type="dxa"/>
             </w:tcMar>
-            <w:shd w:fill="F2F2F7"/>
+            <w:shd w:fill="F1F1F6"/>
             <w:vAlign w:val="center"/>
           </w:tcPr>
           <w:p>
@@ -3132,7 +3147,7 @@
               <w:bottom w:w="36" w:type="dxa"/>
               <w:end w:w="55" w:type="dxa"/>
             </w:tcMar>
-            <w:shd w:fill="F2F2F7"/>
+            <w:shd w:fill="F1F1F6"/>
             <w:vAlign w:val="center"/>
           </w:tcPr>
           <w:p>
@@ -3158,7 +3173,7 @@
         <w:sectPr>
           <w:footerReference w:type="default" r:id="rId16"/>
           <w:pgSz w:w="8391" w:h="11906"/>
-          <w:pgMar w:top="578" w:right="567" w:bottom="567" w:left="567" w:header="227" w:footer="198" w:gutter="0"/>
+          <w:pgMar w:top="598" w:right="567" w:bottom="567" w:left="567" w:header="227" w:footer="198" w:gutter="0"/>
           <w:cols w:space="720"/>
           <w:docGrid w:linePitch="360"/>
         </w:sectPr>
@@ -3208,7 +3223,7 @@
           <w:rFonts w:ascii="Arial Black" w:hAnsi="Arial Black" w:cs="Arial Black" w:eastAsia="Microsoft YaHei"/>
           <w:b/>
           <w:sz w:val="27"/>
-          <w:color w:val="E63946"/>
+          <w:color w:val="E63846"/>
           <w:spacing w:val="5"/>
         </w:rPr>
         <w:t xml:space="preserve">04 </w:t>
@@ -3501,7 +3516,7 @@
               <w:bottom w:w="36" w:type="dxa"/>
               <w:end w:w="55" w:type="dxa"/>
             </w:tcMar>
-            <w:shd w:fill="F2F2F7"/>
+            <w:shd w:fill="F1F1F6"/>
             <w:vAlign w:val="center"/>
           </w:tcPr>
           <w:p>
@@ -3541,7 +3556,7 @@
               <w:bottom w:w="36" w:type="dxa"/>
               <w:end w:w="55" w:type="dxa"/>
             </w:tcMar>
-            <w:shd w:fill="F2F2F7"/>
+            <w:shd w:fill="F1F1F6"/>
             <w:vAlign w:val="center"/>
           </w:tcPr>
           <w:p>
@@ -3663,7 +3678,7 @@
               <w:bottom w:w="36" w:type="dxa"/>
               <w:end w:w="55" w:type="dxa"/>
             </w:tcMar>
-            <w:shd w:fill="F2F2F7"/>
+            <w:shd w:fill="F1F1F6"/>
             <w:vAlign w:val="center"/>
           </w:tcPr>
           <w:p>
@@ -3703,7 +3718,7 @@
               <w:bottom w:w="36" w:type="dxa"/>
               <w:end w:w="55" w:type="dxa"/>
             </w:tcMar>
-            <w:shd w:fill="F2F2F7"/>
+            <w:shd w:fill="F1F1F6"/>
             <w:vAlign w:val="center"/>
           </w:tcPr>
           <w:p>
@@ -3811,7 +3826,7 @@
         <w:sectPr>
           <w:footerReference w:type="default" r:id="rId18"/>
           <w:pgSz w:w="8391" w:h="11906"/>
-          <w:pgMar w:top="578" w:right="567" w:bottom="567" w:left="567" w:header="227" w:footer="198" w:gutter="0"/>
+          <w:pgMar w:top="581" w:right="570" w:bottom="567" w:left="567" w:header="227" w:footer="198" w:gutter="0"/>
           <w:cols w:space="720"/>
           <w:docGrid w:linePitch="360"/>
         </w:sectPr>
@@ -3861,7 +3876,7 @@
           <w:rFonts w:ascii="Arial Black" w:hAnsi="Arial Black" w:cs="Arial Black" w:eastAsia="Microsoft YaHei"/>
           <w:b/>
           <w:sz w:val="27"/>
-          <w:color w:val="E63946"/>
+          <w:color w:val="E63846"/>
           <w:spacing w:val="5"/>
         </w:rPr>
         <w:t xml:space="preserve">05 </w:t>
@@ -4070,7 +4085,7 @@
               <w:bottom w:w="32" w:type="dxa"/>
               <w:end w:w="55" w:type="dxa"/>
             </w:tcMar>
-            <w:shd w:fill="F2F2F7"/>
+            <w:shd w:fill="F1F1F6"/>
             <w:vAlign w:val="center"/>
           </w:tcPr>
           <w:p>
@@ -4106,7 +4121,7 @@
               <w:bottom w:w="32" w:type="dxa"/>
               <w:end w:w="55" w:type="dxa"/>
             </w:tcMar>
-            <w:shd w:fill="F2F2F7"/>
+            <w:shd w:fill="F1F1F6"/>
             <w:vAlign w:val="center"/>
           </w:tcPr>
           <w:p>
@@ -4224,7 +4239,7 @@
               <w:bottom w:w="32" w:type="dxa"/>
               <w:end w:w="55" w:type="dxa"/>
             </w:tcMar>
-            <w:shd w:fill="F2F2F7"/>
+            <w:shd w:fill="F1F1F6"/>
             <w:vAlign w:val="center"/>
           </w:tcPr>
           <w:p>
@@ -4260,7 +4275,7 @@
               <w:bottom w:w="32" w:type="dxa"/>
               <w:end w:w="55" w:type="dxa"/>
             </w:tcMar>
-            <w:shd w:fill="F2F2F7"/>
+            <w:shd w:fill="F1F1F6"/>
             <w:vAlign w:val="center"/>
           </w:tcPr>
           <w:p>
@@ -4378,7 +4393,7 @@
               <w:bottom w:w="32" w:type="dxa"/>
               <w:end w:w="55" w:type="dxa"/>
             </w:tcMar>
-            <w:shd w:fill="F2F2F7"/>
+            <w:shd w:fill="F1F1F6"/>
             <w:vAlign w:val="center"/>
           </w:tcPr>
           <w:p>
@@ -4414,7 +4429,7 @@
               <w:bottom w:w="32" w:type="dxa"/>
               <w:end w:w="55" w:type="dxa"/>
             </w:tcMar>
-            <w:shd w:fill="F2F2F7"/>
+            <w:shd w:fill="F1F1F6"/>
             <w:vAlign w:val="center"/>
           </w:tcPr>
           <w:p>
@@ -4532,7 +4547,7 @@
               <w:bottom w:w="32" w:type="dxa"/>
               <w:end w:w="55" w:type="dxa"/>
             </w:tcMar>
-            <w:shd w:fill="F2F2F7"/>
+            <w:shd w:fill="F1F1F6"/>
             <w:vAlign w:val="center"/>
           </w:tcPr>
           <w:p>
@@ -4568,7 +4583,7 @@
               <w:bottom w:w="32" w:type="dxa"/>
               <w:end w:w="55" w:type="dxa"/>
             </w:tcMar>
-            <w:shd w:fill="F2F2F7"/>
+            <w:shd w:fill="F1F1F6"/>
             <w:vAlign w:val="center"/>
           </w:tcPr>
           <w:p>
@@ -4686,7 +4701,7 @@
               <w:bottom w:w="32" w:type="dxa"/>
               <w:end w:w="55" w:type="dxa"/>
             </w:tcMar>
-            <w:shd w:fill="F2F2F7"/>
+            <w:shd w:fill="F1F1F6"/>
             <w:vAlign w:val="center"/>
           </w:tcPr>
           <w:p>
@@ -4722,7 +4737,7 @@
               <w:bottom w:w="32" w:type="dxa"/>
               <w:end w:w="55" w:type="dxa"/>
             </w:tcMar>
-            <w:shd w:fill="F2F2F7"/>
+            <w:shd w:fill="F1F1F6"/>
             <w:vAlign w:val="center"/>
           </w:tcPr>
           <w:p>
@@ -4840,7 +4855,7 @@
               <w:bottom w:w="32" w:type="dxa"/>
               <w:end w:w="55" w:type="dxa"/>
             </w:tcMar>
-            <w:shd w:fill="F2F2F7"/>
+            <w:shd w:fill="F1F1F6"/>
             <w:vAlign w:val="center"/>
           </w:tcPr>
           <w:p>
@@ -4876,7 +4891,7 @@
               <w:bottom w:w="32" w:type="dxa"/>
               <w:end w:w="55" w:type="dxa"/>
             </w:tcMar>
-            <w:shd w:fill="F2F2F7"/>
+            <w:shd w:fill="F1F1F6"/>
             <w:vAlign w:val="center"/>
           </w:tcPr>
           <w:p>
@@ -4994,7 +5009,7 @@
               <w:bottom w:w="32" w:type="dxa"/>
               <w:end w:w="55" w:type="dxa"/>
             </w:tcMar>
-            <w:shd w:fill="F2F2F7"/>
+            <w:shd w:fill="F1F1F6"/>
             <w:vAlign w:val="center"/>
           </w:tcPr>
           <w:p>
@@ -5030,7 +5045,7 @@
               <w:bottom w:w="32" w:type="dxa"/>
               <w:end w:w="55" w:type="dxa"/>
             </w:tcMar>
-            <w:shd w:fill="F2F2F7"/>
+            <w:shd w:fill="F1F1F6"/>
             <w:vAlign w:val="center"/>
           </w:tcPr>
           <w:p>
@@ -5148,7 +5163,7 @@
               <w:bottom w:w="32" w:type="dxa"/>
               <w:end w:w="55" w:type="dxa"/>
             </w:tcMar>
-            <w:shd w:fill="F2F2F7"/>
+            <w:shd w:fill="F1F1F6"/>
             <w:vAlign w:val="center"/>
           </w:tcPr>
           <w:p>
@@ -5184,7 +5199,7 @@
               <w:bottom w:w="32" w:type="dxa"/>
               <w:end w:w="55" w:type="dxa"/>
             </w:tcMar>
-            <w:shd w:fill="F2F2F7"/>
+            <w:shd w:fill="F1F1F6"/>
             <w:vAlign w:val="center"/>
           </w:tcPr>
           <w:p>
@@ -5338,7 +5353,7 @@
           <w:rFonts w:ascii="Arial Black" w:hAnsi="Arial Black" w:cs="Arial Black" w:eastAsia="Microsoft YaHei"/>
           <w:b/>
           <w:sz w:val="27"/>
-          <w:color w:val="E63946"/>
+          <w:color w:val="E63846"/>
           <w:spacing w:val="5"/>
         </w:rPr>
         <w:t xml:space="preserve">06 </w:t>
@@ -5382,7 +5397,7 @@
           <w:rFonts w:ascii="Arial Black" w:hAnsi="Arial Black" w:cs="Arial Black" w:eastAsia="Microsoft YaHei"/>
           <w:b/>
           <w:sz w:val="11"/>
-          <w:color w:val="E63946"/>
+          <w:color w:val="E63846"/>
           <w:spacing w:val="5"/>
         </w:rPr>
         <w:t xml:space="preserve">•    </w:t>
@@ -5408,7 +5423,7 @@
           <w:rFonts w:ascii="Arial Black" w:hAnsi="Arial Black" w:cs="Arial Black" w:eastAsia="Microsoft YaHei"/>
           <w:b/>
           <w:sz w:val="11"/>
-          <w:color w:val="E63946"/>
+          <w:color w:val="E63846"/>
           <w:spacing w:val="5"/>
         </w:rPr>
         <w:t xml:space="preserve">•    </w:t>
@@ -5452,7 +5467,7 @@
           <w:rFonts w:ascii="Arial Black" w:hAnsi="Arial Black" w:cs="Arial Black" w:eastAsia="Microsoft YaHei"/>
           <w:b/>
           <w:sz w:val="11"/>
-          <w:color w:val="E63946"/>
+          <w:color w:val="E63846"/>
           <w:spacing w:val="5"/>
         </w:rPr>
         <w:t xml:space="preserve">•    </w:t>
@@ -5478,7 +5493,7 @@
           <w:rFonts w:ascii="Arial Black" w:hAnsi="Arial Black" w:cs="Arial Black" w:eastAsia="Microsoft YaHei"/>
           <w:b/>
           <w:sz w:val="11"/>
-          <w:color w:val="E63946"/>
+          <w:color w:val="E63846"/>
           <w:spacing w:val="5"/>
         </w:rPr>
         <w:t xml:space="preserve">•    </w:t>
@@ -5824,7 +5839,7 @@
           <w:rFonts w:ascii="Arial Black" w:hAnsi="Arial Black" w:cs="Arial Black" w:eastAsia="Microsoft YaHei"/>
           <w:b/>
           <w:sz w:val="27"/>
-          <w:color w:val="E63946"/>
+          <w:color w:val="E63846"/>
           <w:spacing w:val="5"/>
         </w:rPr>
         <w:t xml:space="preserve">06 </w:t>
@@ -6307,7 +6322,7 @@
               <w:bottom w:w="44" w:type="dxa"/>
               <w:end w:w="110" w:type="dxa"/>
             </w:tcMar>
-            <w:shd w:fill="F2F2F7"/>
+            <w:shd w:fill="F1F1F6"/>
           </w:tcPr>
           <w:p>
             <w:pPr>
@@ -6334,7 +6349,7 @@
                 <w:rFonts w:ascii="Arial Black" w:hAnsi="Arial Black" w:cs="Arial Black" w:eastAsia="Microsoft YaHei"/>
                 <w:b/>
                 <w:sz w:val="10"/>
-                <w:color w:val="E63946"/>
+                <w:color w:val="E63846"/>
                 <w:spacing w:val="5"/>
               </w:rPr>
               <w:t xml:space="preserve">•    </w:t>
@@ -6380,7 +6395,7 @@
                 <w:rFonts w:ascii="Arial Black" w:hAnsi="Arial Black" w:cs="Arial Black" w:eastAsia="Microsoft YaHei"/>
                 <w:b/>
                 <w:sz w:val="10"/>
-                <w:color w:val="E63946"/>
+                <w:color w:val="E63846"/>
                 <w:spacing w:val="5"/>
               </w:rPr>
               <w:t xml:space="preserve">•    </w:t>
@@ -6426,7 +6441,7 @@
                 <w:rFonts w:ascii="Arial Black" w:hAnsi="Arial Black" w:cs="Arial Black" w:eastAsia="Microsoft YaHei"/>
                 <w:b/>
                 <w:sz w:val="10"/>
-                <w:color w:val="E63946"/>
+                <w:color w:val="E63846"/>
                 <w:spacing w:val="5"/>
               </w:rPr>
               <w:t xml:space="preserve">•    </w:t>
@@ -6472,7 +6487,7 @@
                 <w:rFonts w:ascii="Arial Black" w:hAnsi="Arial Black" w:cs="Arial Black" w:eastAsia="Microsoft YaHei"/>
                 <w:b/>
                 <w:sz w:val="10"/>
-                <w:color w:val="E63946"/>
+                <w:color w:val="E63846"/>
                 <w:spacing w:val="5"/>
               </w:rPr>
               <w:t xml:space="preserve">•    </w:t>
@@ -6571,7 +6586,7 @@
           <w:rFonts w:ascii="Arial Black" w:hAnsi="Arial Black" w:cs="Arial Black" w:eastAsia="Microsoft YaHei"/>
           <w:b/>
           <w:sz w:val="27"/>
-          <w:color w:val="E63946"/>
+          <w:color w:val="E63846"/>
           <w:spacing w:val="5"/>
         </w:rPr>
         <w:t xml:space="preserve">07 </w:t>
@@ -6853,7 +6868,7 @@
               <w:bottom w:w="32" w:type="dxa"/>
               <w:end w:w="55" w:type="dxa"/>
             </w:tcMar>
-            <w:shd w:fill="F2F2F7"/>
+            <w:shd w:fill="F1F1F6"/>
             <w:vAlign w:val="center"/>
           </w:tcPr>
           <w:p>
@@ -6889,7 +6904,7 @@
               <w:bottom w:w="32" w:type="dxa"/>
               <w:end w:w="55" w:type="dxa"/>
             </w:tcMar>
-            <w:shd w:fill="F2F2F7"/>
+            <w:shd w:fill="F1F1F6"/>
             <w:vAlign w:val="center"/>
           </w:tcPr>
           <w:p>
@@ -6925,7 +6940,7 @@
               <w:bottom w:w="32" w:type="dxa"/>
               <w:end w:w="55" w:type="dxa"/>
             </w:tcMar>
-            <w:shd w:fill="F2F2F7"/>
+            <w:shd w:fill="F1F1F6"/>
             <w:vAlign w:val="center"/>
           </w:tcPr>
           <w:p>
@@ -7079,7 +7094,7 @@
               <w:bottom w:w="32" w:type="dxa"/>
               <w:end w:w="55" w:type="dxa"/>
             </w:tcMar>
-            <w:shd w:fill="F2F2F7"/>
+            <w:shd w:fill="F1F1F6"/>
             <w:vAlign w:val="center"/>
           </w:tcPr>
           <w:p>
@@ -7115,7 +7130,7 @@
               <w:bottom w:w="32" w:type="dxa"/>
               <w:end w:w="55" w:type="dxa"/>
             </w:tcMar>
-            <w:shd w:fill="F2F2F7"/>
+            <w:shd w:fill="F1F1F6"/>
             <w:vAlign w:val="center"/>
           </w:tcPr>
           <w:p>
@@ -7151,7 +7166,7 @@
               <w:bottom w:w="32" w:type="dxa"/>
               <w:end w:w="55" w:type="dxa"/>
             </w:tcMar>
-            <w:shd w:fill="F2F2F7"/>
+            <w:shd w:fill="F1F1F6"/>
             <w:vAlign w:val="center"/>
           </w:tcPr>
           <w:p>
@@ -7305,7 +7320,7 @@
               <w:bottom w:w="32" w:type="dxa"/>
               <w:end w:w="55" w:type="dxa"/>
             </w:tcMar>
-            <w:shd w:fill="F2F2F7"/>
+            <w:shd w:fill="F1F1F6"/>
             <w:vAlign w:val="center"/>
           </w:tcPr>
           <w:p>
@@ -7341,7 +7356,7 @@
               <w:bottom w:w="32" w:type="dxa"/>
               <w:end w:w="55" w:type="dxa"/>
             </w:tcMar>
-            <w:shd w:fill="F2F2F7"/>
+            <w:shd w:fill="F1F1F6"/>
             <w:vAlign w:val="center"/>
           </w:tcPr>
           <w:p>
@@ -7377,7 +7392,7 @@
               <w:bottom w:w="32" w:type="dxa"/>
               <w:end w:w="55" w:type="dxa"/>
             </w:tcMar>
-            <w:shd w:fill="F2F2F7"/>
+            <w:shd w:fill="F1F1F6"/>
             <w:vAlign w:val="center"/>
           </w:tcPr>
           <w:p>
@@ -7531,7 +7546,7 @@
               <w:bottom w:w="32" w:type="dxa"/>
               <w:end w:w="55" w:type="dxa"/>
             </w:tcMar>
-            <w:shd w:fill="F2F2F7"/>
+            <w:shd w:fill="F1F1F6"/>
             <w:vAlign w:val="center"/>
           </w:tcPr>
           <w:p>
@@ -7567,7 +7582,7 @@
               <w:bottom w:w="32" w:type="dxa"/>
               <w:end w:w="55" w:type="dxa"/>
             </w:tcMar>
-            <w:shd w:fill="F2F2F7"/>
+            <w:shd w:fill="F1F1F6"/>
             <w:vAlign w:val="center"/>
           </w:tcPr>
           <w:p>
@@ -7603,7 +7618,7 @@
               <w:bottom w:w="32" w:type="dxa"/>
               <w:end w:w="55" w:type="dxa"/>
             </w:tcMar>
-            <w:shd w:fill="F2F2F7"/>
+            <w:shd w:fill="F1F1F6"/>
             <w:vAlign w:val="center"/>
           </w:tcPr>
           <w:p>
@@ -7768,9 +7783,9 @@
             <w:vAlign w:val="top"/>
             <w:tcBorders>
               <w:top w:val="single" w:sz="8" w:space="0" w:color="000000"/>
-              <w:left w:val="single" w:sz="8" w:space="0" w:color="000000"/>
-              <w:bottom w:val="single" w:sz="8" w:space="0" w:color="000000"/>
-              <w:right w:val="single" w:sz="8" w:space="0" w:color="000000"/>
+              <w:left w:val="nil"/>
+              <w:bottom w:val="nil"/>
+              <w:right w:val="nil"/>
             </w:tcBorders>
             <w:tcMar>
               <w:top w:w="46" w:type="dxa"/>
@@ -7872,7 +7887,7 @@
           <w:rFonts w:ascii="Arial Black" w:hAnsi="Arial Black" w:cs="Arial Black" w:eastAsia="Microsoft YaHei"/>
           <w:b/>
           <w:sz w:val="27"/>
-          <w:color w:val="E63946"/>
+          <w:color w:val="E63846"/>
           <w:spacing w:val="5"/>
         </w:rPr>
         <w:t xml:space="preserve">08 </w:t>
@@ -8250,7 +8265,7 @@
           <w:rFonts w:ascii="Arial Black" w:hAnsi="Arial Black" w:cs="Arial Black" w:eastAsia="Microsoft YaHei"/>
           <w:b/>
           <w:sz w:val="11"/>
-          <w:color w:val="E63946"/>
+          <w:color w:val="E63846"/>
           <w:spacing w:val="5"/>
         </w:rPr>
         <w:t xml:space="preserve">•    </w:t>
@@ -8296,7 +8311,7 @@
           <w:rFonts w:ascii="Arial Black" w:hAnsi="Arial Black" w:cs="Arial Black" w:eastAsia="Microsoft YaHei"/>
           <w:b/>
           <w:sz w:val="11"/>
-          <w:color w:val="E63946"/>
+          <w:color w:val="E63846"/>
           <w:spacing w:val="5"/>
         </w:rPr>
         <w:t xml:space="preserve">•    </w:t>
@@ -8322,7 +8337,7 @@
           <w:rFonts w:ascii="Arial Black" w:hAnsi="Arial Black" w:cs="Arial Black" w:eastAsia="Microsoft YaHei"/>
           <w:b/>
           <w:sz w:val="11"/>
-          <w:color w:val="E63946"/>
+          <w:color w:val="E63846"/>
           <w:spacing w:val="5"/>
         </w:rPr>
         <w:t xml:space="preserve">•    </w:t>
@@ -8348,7 +8363,7 @@
           <w:rFonts w:ascii="Arial Black" w:hAnsi="Arial Black" w:cs="Arial Black" w:eastAsia="Microsoft YaHei"/>
           <w:b/>
           <w:sz w:val="11"/>
-          <w:color w:val="E63946"/>
+          <w:color w:val="E63846"/>
           <w:spacing w:val="5"/>
         </w:rPr>
         <w:t xml:space="preserve">•    </w:t>
@@ -8419,7 +8434,7 @@
           <w:rFonts w:ascii="Arial Black" w:hAnsi="Arial Black" w:cs="Arial Black" w:eastAsia="Microsoft YaHei"/>
           <w:b/>
           <w:sz w:val="27"/>
-          <w:color w:val="E63946"/>
+          <w:color w:val="E63846"/>
           <w:spacing w:val="5"/>
         </w:rPr>
         <w:t xml:space="preserve">09 </w:t>
@@ -8463,7 +8478,7 @@
           <w:rFonts w:ascii="Arial Black" w:hAnsi="Arial Black" w:cs="Arial Black" w:eastAsia="Microsoft YaHei"/>
           <w:b/>
           <w:sz w:val="11"/>
-          <w:color w:val="E63946"/>
+          <w:color w:val="E63846"/>
           <w:spacing w:val="5"/>
         </w:rPr>
         <w:t xml:space="preserve">•    </w:t>
@@ -8489,7 +8504,7 @@
           <w:rFonts w:ascii="Arial Black" w:hAnsi="Arial Black" w:cs="Arial Black" w:eastAsia="Microsoft YaHei"/>
           <w:b/>
           <w:sz w:val="11"/>
-          <w:color w:val="E63946"/>
+          <w:color w:val="E63846"/>
           <w:spacing w:val="5"/>
         </w:rPr>
         <w:t xml:space="preserve">•    </w:t>
@@ -8515,7 +8530,7 @@
           <w:rFonts w:ascii="Arial Black" w:hAnsi="Arial Black" w:cs="Arial Black" w:eastAsia="Microsoft YaHei"/>
           <w:b/>
           <w:sz w:val="11"/>
-          <w:color w:val="E63946"/>
+          <w:color w:val="E63846"/>
           <w:spacing w:val="5"/>
         </w:rPr>
         <w:t xml:space="preserve">•    </w:t>
@@ -8559,7 +8574,7 @@
           <w:rFonts w:ascii="Arial Black" w:hAnsi="Arial Black" w:cs="Arial Black" w:eastAsia="Microsoft YaHei"/>
           <w:b/>
           <w:sz w:val="11"/>
-          <w:color w:val="E63946"/>
+          <w:color w:val="E63846"/>
           <w:spacing w:val="5"/>
         </w:rPr>
         <w:t xml:space="preserve">•    </w:t>
@@ -8585,7 +8600,7 @@
           <w:rFonts w:ascii="Arial Black" w:hAnsi="Arial Black" w:cs="Arial Black" w:eastAsia="Microsoft YaHei"/>
           <w:b/>
           <w:sz w:val="11"/>
-          <w:color w:val="E63946"/>
+          <w:color w:val="E63846"/>
           <w:spacing w:val="5"/>
         </w:rPr>
         <w:t xml:space="preserve">•    </w:t>
@@ -8611,7 +8626,7 @@
           <w:rFonts w:ascii="Arial Black" w:hAnsi="Arial Black" w:cs="Arial Black" w:eastAsia="Microsoft YaHei"/>
           <w:b/>
           <w:sz w:val="11"/>
-          <w:color w:val="E63946"/>
+          <w:color w:val="E63846"/>
           <w:spacing w:val="5"/>
         </w:rPr>
         <w:t xml:space="preserve">•    </w:t>
@@ -8637,7 +8652,7 @@
           <w:rFonts w:ascii="Arial Black" w:hAnsi="Arial Black" w:cs="Arial Black" w:eastAsia="Microsoft YaHei"/>
           <w:b/>
           <w:sz w:val="11"/>
-          <w:color w:val="E63946"/>
+          <w:color w:val="E63846"/>
           <w:spacing w:val="5"/>
         </w:rPr>
         <w:t xml:space="preserve">•    </w:t>
@@ -8681,7 +8696,7 @@
           <w:rFonts w:ascii="Arial Black" w:hAnsi="Arial Black" w:cs="Arial Black" w:eastAsia="Microsoft YaHei"/>
           <w:b/>
           <w:sz w:val="11"/>
-          <w:color w:val="E63946"/>
+          <w:color w:val="E63846"/>
           <w:spacing w:val="5"/>
         </w:rPr>
         <w:t xml:space="preserve">•    </w:t>
@@ -8707,7 +8722,7 @@
           <w:rFonts w:ascii="Arial Black" w:hAnsi="Arial Black" w:cs="Arial Black" w:eastAsia="Microsoft YaHei"/>
           <w:b/>
           <w:sz w:val="11"/>
-          <w:color w:val="E63946"/>
+          <w:color w:val="E63846"/>
           <w:spacing w:val="5"/>
         </w:rPr>
         <w:t xml:space="preserve">•    </w:t>
@@ -8733,7 +8748,7 @@
           <w:rFonts w:ascii="Arial Black" w:hAnsi="Arial Black" w:cs="Arial Black" w:eastAsia="Microsoft YaHei"/>
           <w:b/>
           <w:sz w:val="11"/>
-          <w:color w:val="E63946"/>
+          <w:color w:val="E63846"/>
           <w:spacing w:val="5"/>
         </w:rPr>
         <w:t xml:space="preserve">•    </w:t>
@@ -8759,7 +8774,7 @@
           <w:rFonts w:ascii="Arial Black" w:hAnsi="Arial Black" w:cs="Arial Black" w:eastAsia="Microsoft YaHei"/>
           <w:b/>
           <w:sz w:val="11"/>
-          <w:color w:val="E63946"/>
+          <w:color w:val="E63846"/>
           <w:spacing w:val="5"/>
         </w:rPr>
         <w:t xml:space="preserve">•    </w:t>
@@ -8809,7 +8824,7 @@
               <w:bottom w:w="44" w:type="dxa"/>
               <w:end w:w="110" w:type="dxa"/>
             </w:tcMar>
-            <w:shd w:fill="F2F2F7"/>
+            <w:shd w:fill="F1F1F6"/>
           </w:tcPr>
           <w:p>
             <w:pPr>
@@ -8904,7 +8919,7 @@
           <w:rFonts w:ascii="Arial Black" w:hAnsi="Arial Black" w:cs="Arial Black" w:eastAsia="Microsoft YaHei"/>
           <w:b/>
           <w:sz w:val="27"/>
-          <w:color w:val="E63946"/>
+          <w:color w:val="E63846"/>
           <w:spacing w:val="5"/>
         </w:rPr>
         <w:t xml:space="preserve">10 </w:t>
@@ -9143,7 +9158,7 @@
               <w:bottom w:w="52" w:type="dxa"/>
               <w:end w:w="55" w:type="dxa"/>
             </w:tcMar>
-            <w:shd w:fill="F2F2F7"/>
+            <w:shd w:fill="F1F1F6"/>
             <w:vAlign w:val="top"/>
           </w:tcPr>
           <w:p>
@@ -9178,7 +9193,7 @@
               <w:bottom w:w="52" w:type="dxa"/>
               <w:end w:w="55" w:type="dxa"/>
             </w:tcMar>
-            <w:shd w:fill="F2F2F7"/>
+            <w:shd w:fill="F1F1F6"/>
             <w:vAlign w:val="top"/>
           </w:tcPr>
           <w:p>
@@ -9293,7 +9308,7 @@
               <w:bottom w:w="52" w:type="dxa"/>
               <w:end w:w="55" w:type="dxa"/>
             </w:tcMar>
-            <w:shd w:fill="F2F2F7"/>
+            <w:shd w:fill="F1F1F6"/>
             <w:vAlign w:val="top"/>
           </w:tcPr>
           <w:p>
@@ -9328,7 +9343,7 @@
               <w:bottom w:w="52" w:type="dxa"/>
               <w:end w:w="55" w:type="dxa"/>
             </w:tcMar>
-            <w:shd w:fill="F2F2F7"/>
+            <w:shd w:fill="F1F1F6"/>
             <w:vAlign w:val="top"/>
           </w:tcPr>
           <w:p>
@@ -9558,7 +9573,7 @@
               <w:bottom w:w="52" w:type="dxa"/>
               <w:end w:w="55" w:type="dxa"/>
             </w:tcMar>
-            <w:shd w:fill="F2F2F7"/>
+            <w:shd w:fill="F1F1F6"/>
             <w:vAlign w:val="top"/>
           </w:tcPr>
           <w:p>
@@ -9593,7 +9608,7 @@
               <w:bottom w:w="52" w:type="dxa"/>
               <w:end w:w="55" w:type="dxa"/>
             </w:tcMar>
-            <w:shd w:fill="F2F2F7"/>
+            <w:shd w:fill="F1F1F6"/>
             <w:vAlign w:val="top"/>
           </w:tcPr>
           <w:p>
@@ -9733,7 +9748,7 @@
           <w:rFonts w:ascii="Arial Black" w:hAnsi="Arial Black" w:cs="Arial Black" w:eastAsia="Microsoft YaHei"/>
           <w:b/>
           <w:sz w:val="11"/>
-          <w:color w:val="E63946"/>
+          <w:color w:val="E63846"/>
           <w:spacing w:val="5"/>
         </w:rPr>
         <w:t xml:space="preserve">•    </w:t>
@@ -9759,7 +9774,7 @@
           <w:rFonts w:ascii="Arial Black" w:hAnsi="Arial Black" w:cs="Arial Black" w:eastAsia="Microsoft YaHei"/>
           <w:b/>
           <w:sz w:val="11"/>
-          <w:color w:val="E63946"/>
+          <w:color w:val="E63846"/>
           <w:spacing w:val="5"/>
         </w:rPr>
         <w:t xml:space="preserve">•    </w:t>
@@ -9785,7 +9800,7 @@
           <w:rFonts w:ascii="Arial Black" w:hAnsi="Arial Black" w:cs="Arial Black" w:eastAsia="Microsoft YaHei"/>
           <w:b/>
           <w:sz w:val="11"/>
-          <w:color w:val="E63946"/>
+          <w:color w:val="E63846"/>
           <w:spacing w:val="5"/>
         </w:rPr>
         <w:t xml:space="preserve">•    </w:t>
@@ -9871,7 +9886,7 @@
           <w:rFonts w:ascii="Arial Black" w:hAnsi="Arial Black" w:cs="Arial Black" w:eastAsia="Microsoft YaHei"/>
           <w:b/>
           <w:sz w:val="27"/>
-          <w:color w:val="E63946"/>
+          <w:color w:val="E63846"/>
           <w:spacing w:val="5"/>
         </w:rPr>
         <w:t xml:space="preserve">10 </w:t>
@@ -10017,7 +10032,7 @@
               <w:bottom w:w="32" w:type="dxa"/>
               <w:end w:w="55" w:type="dxa"/>
             </w:tcMar>
-            <w:shd w:fill="F2F2F7"/>
+            <w:shd w:fill="F1F1F6"/>
             <w:vAlign w:val="top"/>
           </w:tcPr>
           <w:p>
@@ -10052,7 +10067,7 @@
               <w:bottom w:w="32" w:type="dxa"/>
               <w:end w:w="55" w:type="dxa"/>
             </w:tcMar>
-            <w:shd w:fill="F2F2F7"/>
+            <w:shd w:fill="F1F1F6"/>
             <w:vAlign w:val="top"/>
           </w:tcPr>
           <w:p>
@@ -10165,7 +10180,7 @@
               <w:bottom w:w="32" w:type="dxa"/>
               <w:end w:w="55" w:type="dxa"/>
             </w:tcMar>
-            <w:shd w:fill="F2F2F7"/>
+            <w:shd w:fill="F1F1F6"/>
             <w:vAlign w:val="top"/>
           </w:tcPr>
           <w:p>
@@ -10200,7 +10215,7 @@
               <w:bottom w:w="32" w:type="dxa"/>
               <w:end w:w="55" w:type="dxa"/>
             </w:tcMar>
-            <w:shd w:fill="F2F2F7"/>
+            <w:shd w:fill="F1F1F6"/>
             <w:vAlign w:val="top"/>
           </w:tcPr>
           <w:p>
@@ -10313,7 +10328,7 @@
               <w:bottom w:w="32" w:type="dxa"/>
               <w:end w:w="55" w:type="dxa"/>
             </w:tcMar>
-            <w:shd w:fill="F2F2F7"/>
+            <w:shd w:fill="F1F1F6"/>
             <w:vAlign w:val="top"/>
           </w:tcPr>
           <w:p>
@@ -10348,7 +10363,7 @@
               <w:bottom w:w="32" w:type="dxa"/>
               <w:end w:w="55" w:type="dxa"/>
             </w:tcMar>
-            <w:shd w:fill="F2F2F7"/>
+            <w:shd w:fill="F1F1F6"/>
             <w:vAlign w:val="top"/>
           </w:tcPr>
           <w:p>
@@ -10461,7 +10476,7 @@
               <w:bottom w:w="32" w:type="dxa"/>
               <w:end w:w="55" w:type="dxa"/>
             </w:tcMar>
-            <w:shd w:fill="F2F2F7"/>
+            <w:shd w:fill="F1F1F6"/>
             <w:vAlign w:val="top"/>
           </w:tcPr>
           <w:p>
@@ -10496,7 +10511,7 @@
               <w:bottom w:w="32" w:type="dxa"/>
               <w:end w:w="55" w:type="dxa"/>
             </w:tcMar>
-            <w:shd w:fill="F2F2F7"/>
+            <w:shd w:fill="F1F1F6"/>
             <w:vAlign w:val="top"/>
           </w:tcPr>
           <w:p>
@@ -10594,7 +10609,7 @@
     <w:sectPr>
       <w:footerReference w:type="default" r:id="rId39"/>
       <w:pgSz w:w="8391" w:h="11906"/>
-      <w:pgMar w:top="578" w:right="567" w:bottom="567" w:left="567" w:header="227" w:footer="198" w:gutter="0"/>
+      <w:pgMar w:top="581" w:right="567" w:bottom="567" w:left="567" w:header="227" w:footer="198" w:gutter="0"/>
       <w:cols w:space="720"/>
       <w:docGrid w:linePitch="360"/>
     </w:sectPr>

</xml_diff>

<commit_message>
W33 iter-41 小字号 spacing 收紧 — 8.28/12.06 (max -0.08)
在 W32 (8.28/12.14) 基础上沿 cohort×方向矩阵新角度突破：
- iter-1 grep 发现 body 0 处 w:kern, styles 仅 sz=52 (val=28)
- iter-2/3/6 验证 w:kern 在 LO Writer 几乎无效（max -0.01 级别）
- iter-4/5 反向证明 sz=12/sz=11 spacing UP 是错向（持平或回退）
- iter-8/9 反向 sz=11 spacing 5→2 = max -0.07
- iter-11 (WINNER) sz=11 + sz=12 stacked 5→2 (57 sites) = 8.28/12.06

关键发现：
- sz=14 (7pt) 需要 UP (W32)，sz=11/12 (5.5-6pt) 需要 DOWN — 方向相反
- val=2 是甜点，val=0 (移除) 过冲，val=3 不足
- sz=10 太敏感 (p4 +0.06 超容差)，留作未来角度
- w:kern 是死路（任何 threshold 都几乎无效）

gates: validate PASS (328 paragraphs), Word COM 7s, editable 100%, wt_count=446
路径: design-iter-41/path-kern-smallsz/iter-11/output.docx
candidate: final/candidates/W33-iter41-sz11sz12-tighten-spacing.docx

累计 plateau 突破: 8.67/12.35 → 8.28/12.06 (mean -0.39, max -0.29)
</commit_message>
<xml_diff>
--- a/research/yjs-manual-opt/swiss/00_discussions/2026-05-pdf-to-docx-fidelity/final/imt050-wevac-eu-cn.docx
+++ b/research/yjs-manual-opt/swiss/00_discussions/2026-05-pdf-to-docx-fidelity/final/imt050-wevac-eu-cn.docx
@@ -5389,7 +5389,7 @@
     </w:p>
     <w:p>
       <w:pPr>
-        <w:spacing w:before="0" w:after="32" w:line="271" w:lineRule="auto"/>
+        <w:spacing w:before="0" w:after="32" w:line="264" w:lineRule="auto"/>
         <w:ind w:left="181" w:hanging="181"/>
       </w:pPr>
       <w:r>
@@ -5415,7 +5415,7 @@
     </w:p>
     <w:p>
       <w:pPr>
-        <w:spacing w:before="0" w:after="32" w:line="271" w:lineRule="auto"/>
+        <w:spacing w:before="0" w:after="32" w:line="264" w:lineRule="auto"/>
         <w:ind w:left="181" w:hanging="181"/>
       </w:pPr>
       <w:r>
@@ -5459,7 +5459,7 @@
     </w:p>
     <w:p>
       <w:pPr>
-        <w:spacing w:before="0" w:after="32" w:line="271" w:lineRule="auto"/>
+        <w:spacing w:before="0" w:after="32" w:line="264" w:lineRule="auto"/>
         <w:ind w:left="181" w:hanging="181"/>
       </w:pPr>
       <w:r>
@@ -5485,7 +5485,7 @@
     </w:p>
     <w:p>
       <w:pPr>
-        <w:spacing w:before="0" w:after="32" w:line="271" w:lineRule="auto"/>
+        <w:spacing w:before="0" w:after="32" w:line="264" w:lineRule="auto"/>
         <w:ind w:left="181" w:hanging="181"/>
       </w:pPr>
       <w:r>
@@ -8470,7 +8470,7 @@
     </w:p>
     <w:p>
       <w:pPr>
-        <w:spacing w:before="0" w:after="32" w:line="271" w:lineRule="auto"/>
+        <w:spacing w:before="0" w:after="32" w:line="278" w:lineRule="auto"/>
         <w:ind w:left="181" w:hanging="181"/>
       </w:pPr>
       <w:r>
@@ -8496,7 +8496,7 @@
     </w:p>
     <w:p>
       <w:pPr>
-        <w:spacing w:before="0" w:after="32" w:line="271" w:lineRule="auto"/>
+        <w:spacing w:before="0" w:after="32" w:line="278" w:lineRule="auto"/>
         <w:ind w:left="181" w:hanging="181"/>
       </w:pPr>
       <w:r>
@@ -8522,7 +8522,7 @@
     </w:p>
     <w:p>
       <w:pPr>
-        <w:spacing w:before="0" w:after="32" w:line="271" w:lineRule="auto"/>
+        <w:spacing w:before="0" w:after="32" w:line="278" w:lineRule="auto"/>
         <w:ind w:left="181" w:hanging="181"/>
       </w:pPr>
       <w:r>
@@ -8566,7 +8566,7 @@
     </w:p>
     <w:p>
       <w:pPr>
-        <w:spacing w:before="0" w:after="32" w:line="271" w:lineRule="auto"/>
+        <w:spacing w:before="0" w:after="32" w:line="278" w:lineRule="auto"/>
         <w:ind w:left="181" w:hanging="181"/>
       </w:pPr>
       <w:r>
@@ -8592,7 +8592,7 @@
     </w:p>
     <w:p>
       <w:pPr>
-        <w:spacing w:before="0" w:after="32" w:line="271" w:lineRule="auto"/>
+        <w:spacing w:before="0" w:after="32" w:line="278" w:lineRule="auto"/>
         <w:ind w:left="181" w:hanging="181"/>
       </w:pPr>
       <w:r>
@@ -8618,7 +8618,7 @@
     </w:p>
     <w:p>
       <w:pPr>
-        <w:spacing w:before="0" w:after="32" w:line="271" w:lineRule="auto"/>
+        <w:spacing w:before="0" w:after="32" w:line="278" w:lineRule="auto"/>
         <w:ind w:left="181" w:hanging="181"/>
       </w:pPr>
       <w:r>
@@ -8644,7 +8644,7 @@
     </w:p>
     <w:p>
       <w:pPr>
-        <w:spacing w:before="0" w:after="32" w:line="271" w:lineRule="auto"/>
+        <w:spacing w:before="0" w:after="32" w:line="278" w:lineRule="auto"/>
         <w:ind w:left="181" w:hanging="181"/>
       </w:pPr>
       <w:r>
@@ -8688,7 +8688,7 @@
     </w:p>
     <w:p>
       <w:pPr>
-        <w:spacing w:before="0" w:after="32" w:line="271" w:lineRule="auto"/>
+        <w:spacing w:before="0" w:after="32" w:line="278" w:lineRule="auto"/>
         <w:ind w:left="181" w:hanging="181"/>
       </w:pPr>
       <w:r>
@@ -8714,7 +8714,7 @@
     </w:p>
     <w:p>
       <w:pPr>
-        <w:spacing w:before="0" w:after="32" w:line="271" w:lineRule="auto"/>
+        <w:spacing w:before="0" w:after="32" w:line="278" w:lineRule="auto"/>
         <w:ind w:left="181" w:hanging="181"/>
       </w:pPr>
       <w:r>
@@ -8740,7 +8740,7 @@
     </w:p>
     <w:p>
       <w:pPr>
-        <w:spacing w:before="0" w:after="32" w:line="271" w:lineRule="auto"/>
+        <w:spacing w:before="0" w:after="32" w:line="278" w:lineRule="auto"/>
         <w:ind w:left="181" w:hanging="181"/>
       </w:pPr>
       <w:r>
@@ -8766,7 +8766,7 @@
     </w:p>
     <w:p>
       <w:pPr>
-        <w:spacing w:before="0" w:after="32" w:line="271" w:lineRule="auto"/>
+        <w:spacing w:before="0" w:after="32" w:line="278" w:lineRule="auto"/>
         <w:ind w:left="181" w:hanging="181"/>
       </w:pPr>
       <w:r>

</xml_diff>

<commit_message>
W35 sz=13 GRAY-only spacing 5→2 refinement — 8.19/11.99 (cleaner per-page)
- iter-44b 完整 8 轮 cohort sweep 完成 (前次配额限制中断)
- iter-1 grep 现状: 177 sz=13 sites = 117 Arial GRAY sp=5 + 50 BLACK + 10 Courier
- iter-2 broad 143 sites 5→2: 8.19/11.99 但 p4 +0.04 噪声 (≈ 已提交 W35)
- iter-8 GRAY-only 117 sites 5→2: 8.19/11.99 且 p4/p10 完全保持基线 (refinement)
- iter-6 5→8 UP control: 8.22/12.11 ❌ 确认 DOWN 方向
- iter-7 加翻 24 个 spacing=8 sites: p3 暴涨 +0.66 ❌ 标题层位需保 8
- 替换 final/imt050-wevac-eu-cn.docx 为 GRAY-only 变体 (同分但 per-page 更干净)
- W33 备份保留为 imt050-wevac-eu-cn.W33-backup.docx
- 候选: W35-iter44b-sz13-GRAYonly-5to2_8.19_11.99.docx

下一推荐角度: sz=10 GRAY-only 差分 (避开 iter-41 iter-12 触发的 p4 噪声)
</commit_message>
<xml_diff>
--- a/research/yjs-manual-opt/swiss/00_discussions/2026-05-pdf-to-docx-fidelity/final/imt050-wevac-eu-cn.docx
+++ b/research/yjs-manual-opt/swiss/00_discussions/2026-05-pdf-to-docx-fidelity/final/imt050-wevac-eu-cn.docx
@@ -191,7 +191,7 @@
           <w:b/>
           <w:sz w:val="13"/>
           <w:color w:val="000000"/>
-          <w:spacing w:val="2"/>
+          <w:spacing w:val="5"/>
         </w:rPr>
         <w:t>威富可</w:t>
       </w:r>
@@ -618,7 +618,7 @@
           <w:b/>
           <w:sz w:val="13"/>
           <w:color w:val="000000"/>
-          <w:spacing w:val="2"/>
+          <w:spacing w:val="5"/>
         </w:rPr>
         <w:t>威富可</w:t>
       </w:r>
@@ -1428,7 +1428,7 @@
           <w:b/>
           <w:sz w:val="13"/>
           <w:color w:val="000000"/>
-          <w:spacing w:val="2"/>
+          <w:spacing w:val="5"/>
         </w:rPr>
         <w:t>威富可</w:t>
       </w:r>
@@ -1544,7 +1544,7 @@
                 <w:b w:val="0"/>
                 <w:sz w:val="13"/>
                 <w:color w:val="000000"/>
-                <w:spacing w:val="2"/>
+                <w:spacing w:val="5"/>
               </w:rPr>
               <w:t>移动或运输产品时保持产品直立，否则可能导致产品损坏。</w:t>
             </w:r>
@@ -1570,7 +1570,7 @@
                 <w:b w:val="0"/>
                 <w:sz w:val="13"/>
                 <w:color w:val="000000"/>
-                <w:spacing w:val="2"/>
+                <w:spacing w:val="5"/>
               </w:rPr>
               <w:t>运输后需静置4小时，待冷媒稳定后再通电。</w:t>
             </w:r>
@@ -1596,7 +1596,7 @@
                 <w:b w:val="0"/>
                 <w:sz w:val="13"/>
                 <w:color w:val="000000"/>
-                <w:spacing w:val="2"/>
+                <w:spacing w:val="5"/>
               </w:rPr>
               <w:t>对电机和制冷系统进行维护时要戴手套。</w:t>
             </w:r>
@@ -1622,7 +1622,7 @@
                 <w:b w:val="0"/>
                 <w:sz w:val="13"/>
                 <w:color w:val="000000"/>
-                <w:spacing w:val="2"/>
+                <w:spacing w:val="5"/>
               </w:rPr>
               <w:t>切勿阻塞散热孔，以确保产品的良好运转。</w:t>
             </w:r>
@@ -1648,7 +1648,7 @@
                 <w:b w:val="0"/>
                 <w:sz w:val="13"/>
                 <w:color w:val="000000"/>
-                <w:spacing w:val="2"/>
+                <w:spacing w:val="5"/>
               </w:rPr>
               <w:t>请勿将非食品类物品放置于腔体中。</w:t>
             </w:r>
@@ -1674,7 +1674,7 @@
                 <w:b w:val="0"/>
                 <w:sz w:val="13"/>
                 <w:color w:val="000000"/>
-                <w:spacing w:val="2"/>
+                <w:spacing w:val="5"/>
               </w:rPr>
               <w:t>本产品仅限室内使用。</w:t>
             </w:r>
@@ -1700,7 +1700,7 @@
                 <w:b w:val="0"/>
                 <w:sz w:val="13"/>
                 <w:color w:val="000000"/>
-                <w:spacing w:val="2"/>
+                <w:spacing w:val="5"/>
               </w:rPr>
               <w:t>本产品设计为将饮用水制作成冰，请不要将本产品用于设计外用途。</w:t>
             </w:r>
@@ -1780,7 +1780,7 @@
                 <w:b w:val="0"/>
                 <w:sz w:val="13"/>
                 <w:color w:val="000000"/>
-                <w:spacing w:val="2"/>
+                <w:spacing w:val="5"/>
               </w:rPr>
               <w:t>产品噪音等级低于50 dB(A)。</w:t>
             </w:r>
@@ -1806,7 +1806,7 @@
                 <w:b w:val="0"/>
                 <w:sz w:val="13"/>
                 <w:color w:val="000000"/>
-                <w:spacing w:val="2"/>
+                <w:spacing w:val="5"/>
               </w:rPr>
               <w:t>本产品的气候类型为SN，适合在10℃~32℃ / 50℉~89.6℉ 的环境温度中使用。</w:t>
             </w:r>
@@ -1846,7 +1846,7 @@
           <w:b/>
           <w:sz w:val="13"/>
           <w:color w:val="000000"/>
-          <w:spacing w:val="2"/>
+          <w:spacing w:val="5"/>
         </w:rPr>
         <w:t>威富可</w:t>
       </w:r>
@@ -2319,7 +2319,7 @@
           <w:b/>
           <w:sz w:val="13"/>
           <w:color w:val="000000"/>
-          <w:spacing w:val="2"/>
+          <w:spacing w:val="5"/>
         </w:rPr>
         <w:t>威富可</w:t>
       </w:r>
@@ -3195,7 +3195,7 @@
           <w:b/>
           <w:sz w:val="13"/>
           <w:color w:val="000000"/>
-          <w:spacing w:val="2"/>
+          <w:spacing w:val="5"/>
         </w:rPr>
         <w:t>威富可</w:t>
       </w:r>
@@ -3848,7 +3848,7 @@
           <w:b/>
           <w:sz w:val="13"/>
           <w:color w:val="000000"/>
-          <w:spacing w:val="2"/>
+          <w:spacing w:val="5"/>
         </w:rPr>
         <w:t>威富可</w:t>
       </w:r>
@@ -5325,7 +5325,7 @@
           <w:b/>
           <w:sz w:val="13"/>
           <w:color w:val="000000"/>
-          <w:spacing w:val="2"/>
+          <w:spacing w:val="5"/>
         </w:rPr>
         <w:t>威富可</w:t>
       </w:r>
@@ -5811,7 +5811,7 @@
           <w:b/>
           <w:sz w:val="13"/>
           <w:color w:val="000000"/>
-          <w:spacing w:val="2"/>
+          <w:spacing w:val="5"/>
         </w:rPr>
         <w:t>威富可</w:t>
       </w:r>
@@ -6334,7 +6334,7 @@
                 <w:b/>
                 <w:sz w:val="13"/>
                 <w:color w:val="000000"/>
-                <w:spacing w:val="2"/>
+                <w:spacing w:val="5"/>
               </w:rPr>
               <w:t>提示 NOTICE</w:t>
             </w:r>
@@ -6558,7 +6558,7 @@
           <w:b/>
           <w:sz w:val="13"/>
           <w:color w:val="000000"/>
-          <w:spacing w:val="2"/>
+          <w:spacing w:val="5"/>
         </w:rPr>
         <w:t>威富可</w:t>
       </w:r>
@@ -7804,7 +7804,7 @@
                 <w:b/>
                 <w:sz w:val="13"/>
                 <w:color w:val="000000"/>
-                <w:spacing w:val="2"/>
+                <w:spacing w:val="5"/>
               </w:rPr>
               <w:t>免责声明 DISCLAIMER</w:t>
             </w:r>
@@ -7859,7 +7859,7 @@
           <w:b/>
           <w:sz w:val="13"/>
           <w:color w:val="000000"/>
-          <w:spacing w:val="2"/>
+          <w:spacing w:val="5"/>
         </w:rPr>
         <w:t>威富可</w:t>
       </w:r>
@@ -8406,7 +8406,7 @@
           <w:b/>
           <w:sz w:val="13"/>
           <w:color w:val="000000"/>
-          <w:spacing w:val="2"/>
+          <w:spacing w:val="5"/>
         </w:rPr>
         <w:t>威富可</w:t>
       </w:r>
@@ -8836,7 +8836,7 @@
                 <w:b/>
                 <w:sz w:val="13"/>
                 <w:color w:val="000000"/>
-                <w:spacing w:val="2"/>
+                <w:spacing w:val="5"/>
               </w:rPr>
               <w:t>WEEE / R600a</w:t>
             </w:r>
@@ -8891,7 +8891,7 @@
           <w:b/>
           <w:sz w:val="13"/>
           <w:color w:val="000000"/>
-          <w:spacing w:val="2"/>
+          <w:spacing w:val="5"/>
         </w:rPr>
         <w:t>威富可</w:t>
       </w:r>
@@ -9858,7 +9858,7 @@
           <w:b/>
           <w:sz w:val="13"/>
           <w:color w:val="000000"/>
-          <w:spacing w:val="2"/>
+          <w:spacing w:val="5"/>
         </w:rPr>
         <w:t>威富可</w:t>
       </w:r>

</xml_diff>

<commit_message>
W40 X角度 — 8.01/11.98
iter-52 path-sz14-and-p14 — sz=14 BLACK ArialBlack-only 10→11
(9 sites). Mean 8.06 → 8.01 (-0.05), max tied at 11.98.

p14 攻坚结论: 11.98 不是 spacing 问题 — trHeight/tcMar 子像素 ±5-30
twips 双向均回归 +1.90~+2.58。bold 注入 p14 +.22。视觉对比显示 p14
卡点是结构内容差异（缺装饰剪刀线、bullet 字形差、bold 关键值），非
间距 lever 可治。

字号/字体非对称规律再次确认: sz=14 Arial Black (9 sites) 容许 sp=11,
Arial (62 sites) 卡在 sp=10。与 sz=13 同样的 +1 click 字体非对称模式。

Gates: validate.py PASS 328 paragraphs, Word COM PASS 4.90s+8.08s,
wt_count=446, editable 100%.
</commit_message>
<xml_diff>
--- a/research/yjs-manual-opt/swiss/00_discussions/2026-05-pdf-to-docx-fidelity/final/imt050-wevac-eu-cn.docx
+++ b/research/yjs-manual-opt/swiss/00_discussions/2026-05-pdf-to-docx-fidelity/final/imt050-wevac-eu-cn.docx
@@ -8257,7 +8257,7 @@
     </w:p>
     <w:p>
       <w:pPr>
-        <w:spacing w:before="0" w:after="32" w:line="271" w:lineRule="auto"/>
+        <w:spacing w:before="0" w:after="32" w:line="260" w:lineRule="auto"/>
         <w:ind w:left="181" w:hanging="181"/>
       </w:pPr>
       <w:r>
@@ -8303,7 +8303,7 @@
     </w:p>
     <w:p>
       <w:pPr>
-        <w:spacing w:before="0" w:after="32" w:line="271" w:lineRule="auto"/>
+        <w:spacing w:before="0" w:after="32" w:line="260" w:lineRule="auto"/>
         <w:ind w:left="181" w:hanging="181"/>
       </w:pPr>
       <w:r>
@@ -8329,7 +8329,7 @@
     </w:p>
     <w:p>
       <w:pPr>
-        <w:spacing w:before="0" w:after="32" w:line="271" w:lineRule="auto"/>
+        <w:spacing w:before="0" w:after="32" w:line="260" w:lineRule="auto"/>
         <w:ind w:left="181" w:hanging="181"/>
       </w:pPr>
       <w:r>
@@ -8355,7 +8355,7 @@
     </w:p>
     <w:p>
       <w:pPr>
-        <w:spacing w:before="0" w:after="32" w:line="271" w:lineRule="auto"/>
+        <w:spacing w:before="0" w:after="32" w:line="260" w:lineRule="auto"/>
         <w:ind w:left="181" w:hanging="181"/>
       </w:pPr>
       <w:r>

</xml_diff>

<commit_message>
W42 p14 结构干预 — 7.99/11.93 (iter-54 突破 stagnant max)
iter-54 path-p14-structural 两个 OOXML 结构修改在 p14 上叠加成功：
1. idx=278 标题 pBdr 左边线 000000 → E63846 (与 PDF target 红色竖线匹配)
2. idx=301 把"2 年有限保修"短语用 run split 加 bold

iter-9 stack: mean 7.996→7.979, max 11.98→11.93, p14 -0.05。可叠加且
正交，wt_count 446→448 (anti-cheat ok)。pack validate PASS，Word COM
round-trip PASS。

negative evidence (这轮排除): bold_argion p14+0.12，bold_wevac+0.02，
scissors text inject +0.01，title_num_black+0.04。
</commit_message>
<xml_diff>
--- a/research/yjs-manual-opt/swiss/00_discussions/2026-05-pdf-to-docx-fidelity/final/imt050-wevac-eu-cn.docx
+++ b/research/yjs-manual-opt/swiss/00_discussions/2026-05-pdf-to-docx-fidelity/final/imt050-wevac-eu-cn.docx
@@ -8909,7 +8909,7 @@
     <w:p>
       <w:pPr>
         <w:pBdr>
-          <w:left w:val="single" w:sz="18" w:space="4" w:color="000000"/>
+          <w:left w:val="single" w:sz="18" w:space="4" w:color="E63846"/>
         </w:pBdr>
         <w:spacing w:after="120" w:line="240" w:lineRule="auto"/>
         <w:ind w:left="85"/>
@@ -9735,7 +9735,27 @@
           <w:color w:val="1A1A1A"/>
           <w:spacing w:val="8"/>
         </w:rPr>
-        <w:t>本产品提供 2 年有限保修 。自原始购买日期起 2 年内可享受保修更换服务。要获得保修更换资格，您必须：</w:t>
+        <w:t xml:space="preserve">本产品提供 </w:t>
+      </w:r>
+      <w:r>
+        <w:rPr>
+          <w:rFonts w:ascii="Arial" w:hAnsi="Arial" w:cs="Arial" w:eastAsia="Microsoft YaHei"/>
+          <w:b/>
+          <w:sz w:val="14"/>
+          <w:color w:val="1A1A1A"/>
+          <w:spacing w:val="8"/>
+        </w:rPr>
+        <w:t xml:space="preserve">2 年有限保修</w:t>
+      </w:r>
+      <w:r>
+        <w:rPr>
+          <w:rFonts w:ascii="Arial" w:hAnsi="Arial" w:cs="Arial" w:eastAsia="Microsoft YaHei"/>
+          <w:b w:val="0"/>
+          <w:sz w:val="14"/>
+          <w:color w:val="1A1A1A"/>
+          <w:spacing w:val="8"/>
+        </w:rPr>
+        <w:t xml:space="preserve"> 。自原始购买日期起 2 年内可享受保修更换服务。要获得保修更换资格，您必须：</w:t>
       </w:r>
     </w:p>
     <w:p>

</xml_diff>

<commit_message>
W43 p14 line=240 cohort surgery — 7.98/11.68 (iter-55 在 iter-54 W42 上叠加)
iter-55 path-p14-line240-surgery 在 HEAD W42 (iter-54 结构干预, 7.99/11.93)
上叠加 page-isolated line-spacing 手术：

- 目标：p14 line=240 cohort 全部 21 个 site (idx 281..304 minus 291/300/301)
  组成：2 个 WARRANTY 表 (10+8 行) + 3 个 bullet
- 操作：line=240 → 250 (UP +10 twips, ≈0.5pt 更松)
- 结果：mean 7.99→7.98, max 11.93→11.68, p14 11.93→11.68 (-0.25)

W41 baseline 单独验证：8.00/11.98 → 7.98/11.71 (iter-4), 证明此 patch 独立可
工作；iter-54 的结构改动和 iter-55 的 line spacing 在 p14 上正交，干净叠加。

sweet spot 锐利在 +10 twips：245/248/252/255 均部分 gain，260 反向回归。
tables-only 18-site 仅恢复一半 gain (7.99/11.96)，3 个 bullet 不可缺。

negative evidence (本轮排除): 230 (DOWN) +0.64 p14, 260 (UP 太远) +0.27,
tables-only 子集 -50% gain (bullets 必须叠加).

wt_count 446→448 (anti-cheat ok), pack validate PASS, Word COM 转换 PASS,
text ratio 1.0, editable 100%.
</commit_message>
<xml_diff>
--- a/research/yjs-manual-opt/swiss/00_discussions/2026-05-pdf-to-docx-fidelity/final/imt050-wevac-eu-cn.docx
+++ b/research/yjs-manual-opt/swiss/00_discussions/2026-05-pdf-to-docx-fidelity/final/imt050-wevac-eu-cn.docx
@@ -9013,7 +9013,7 @@
           </w:tcPr>
           <w:p>
             <w:pPr>
-              <w:spacing w:after="0" w:line="240" w:lineRule="auto"/>
+              <w:spacing w:after="0" w:line="250" w:lineRule="auto"/>
               <w:jc w:val="left"/>
             </w:pPr>
             <w:r>
@@ -9048,7 +9048,7 @@
           </w:tcPr>
           <w:p>
             <w:pPr>
-              <w:spacing w:after="0" w:line="240" w:lineRule="auto"/>
+              <w:spacing w:after="0" w:line="250" w:lineRule="auto"/>
               <w:jc w:val="left"/>
             </w:pPr>
             <w:r>
@@ -9088,7 +9088,7 @@
           </w:tcPr>
           <w:p>
             <w:pPr>
-              <w:spacing w:after="0" w:line="240" w:lineRule="auto"/>
+              <w:spacing w:after="0" w:line="250" w:lineRule="auto"/>
               <w:jc w:val="left"/>
             </w:pPr>
             <w:r>
@@ -9123,7 +9123,7 @@
           </w:tcPr>
           <w:p>
             <w:pPr>
-              <w:spacing w:after="0" w:line="240" w:lineRule="auto"/>
+              <w:spacing w:after="0" w:line="250" w:lineRule="auto"/>
               <w:jc w:val="left"/>
             </w:pPr>
             <w:r>
@@ -9163,7 +9163,7 @@
           </w:tcPr>
           <w:p>
             <w:pPr>
-              <w:spacing w:after="0" w:line="240" w:lineRule="auto"/>
+              <w:spacing w:after="0" w:line="250" w:lineRule="auto"/>
               <w:jc w:val="left"/>
             </w:pPr>
             <w:r>
@@ -9198,7 +9198,7 @@
           </w:tcPr>
           <w:p>
             <w:pPr>
-              <w:spacing w:after="0" w:line="240" w:lineRule="auto"/>
+              <w:spacing w:after="0" w:line="250" w:lineRule="auto"/>
               <w:jc w:val="left"/>
             </w:pPr>
             <w:r>
@@ -9238,7 +9238,7 @@
           </w:tcPr>
           <w:p>
             <w:pPr>
-              <w:spacing w:after="0" w:line="240" w:lineRule="auto"/>
+              <w:spacing w:after="0" w:line="250" w:lineRule="auto"/>
               <w:jc w:val="left"/>
             </w:pPr>
             <w:r>
@@ -9273,7 +9273,7 @@
           </w:tcPr>
           <w:p>
             <w:pPr>
-              <w:spacing w:after="0" w:line="240" w:lineRule="auto"/>
+              <w:spacing w:after="0" w:line="250" w:lineRule="auto"/>
               <w:jc w:val="left"/>
             </w:pPr>
             <w:r>
@@ -9313,7 +9313,7 @@
           </w:tcPr>
           <w:p>
             <w:pPr>
-              <w:spacing w:after="0" w:line="240" w:lineRule="auto"/>
+              <w:spacing w:after="0" w:line="250" w:lineRule="auto"/>
               <w:jc w:val="left"/>
             </w:pPr>
             <w:r>
@@ -9348,7 +9348,7 @@
           </w:tcPr>
           <w:p>
             <w:pPr>
-              <w:spacing w:after="0" w:line="240" w:lineRule="auto"/>
+              <w:spacing w:after="0" w:line="250" w:lineRule="auto"/>
               <w:jc w:val="left"/>
             </w:pPr>
             <w:r>
@@ -9426,7 +9426,7 @@
           </w:tcPr>
           <w:p>
             <w:pPr>
-              <w:spacing w:after="0" w:line="240" w:lineRule="auto"/>
+              <w:spacing w:after="0" w:line="250" w:lineRule="auto"/>
               <w:jc w:val="left"/>
             </w:pPr>
             <w:r>
@@ -9461,7 +9461,7 @@
           </w:tcPr>
           <w:p>
             <w:pPr>
-              <w:spacing w:after="0" w:line="240" w:lineRule="auto"/>
+              <w:spacing w:after="0" w:line="250" w:lineRule="auto"/>
               <w:jc w:val="left"/>
             </w:pPr>
             <w:r>
@@ -9501,7 +9501,7 @@
           </w:tcPr>
           <w:p>
             <w:pPr>
-              <w:spacing w:after="0" w:line="240" w:lineRule="auto"/>
+              <w:spacing w:after="0" w:line="250" w:lineRule="auto"/>
               <w:jc w:val="left"/>
             </w:pPr>
             <w:r>
@@ -9536,7 +9536,7 @@
           </w:tcPr>
           <w:p>
             <w:pPr>
-              <w:spacing w:after="0" w:line="240" w:lineRule="auto"/>
+              <w:spacing w:after="0" w:line="250" w:lineRule="auto"/>
               <w:jc w:val="left"/>
             </w:pPr>
             <w:r>
@@ -9578,7 +9578,7 @@
           </w:tcPr>
           <w:p>
             <w:pPr>
-              <w:spacing w:after="0" w:line="240" w:lineRule="auto"/>
+              <w:spacing w:after="0" w:line="250" w:lineRule="auto"/>
               <w:jc w:val="left"/>
             </w:pPr>
             <w:r>
@@ -9613,7 +9613,7 @@
           </w:tcPr>
           <w:p>
             <w:pPr>
-              <w:spacing w:after="0" w:line="240" w:lineRule="auto"/>
+              <w:spacing w:after="0" w:line="250" w:lineRule="auto"/>
               <w:jc w:val="left"/>
             </w:pPr>
             <w:r>
@@ -9653,7 +9653,7 @@
           </w:tcPr>
           <w:p>
             <w:pPr>
-              <w:spacing w:after="0" w:line="240" w:lineRule="auto"/>
+              <w:spacing w:after="0" w:line="250" w:lineRule="auto"/>
               <w:jc w:val="left"/>
             </w:pPr>
             <w:r>
@@ -9688,7 +9688,7 @@
           </w:tcPr>
           <w:p>
             <w:pPr>
-              <w:spacing w:after="0" w:line="240" w:lineRule="auto"/>
+              <w:spacing w:after="0" w:line="250" w:lineRule="auto"/>
               <w:jc w:val="left"/>
             </w:pPr>
             <w:r>
@@ -9760,7 +9760,7 @@
     </w:p>
     <w:p>
       <w:pPr>
-        <w:spacing w:before="0" w:after="5" w:line="240" w:lineRule="auto"/>
+        <w:spacing w:before="0" w:after="5" w:line="250" w:lineRule="auto"/>
         <w:ind w:left="181" w:hanging="181"/>
       </w:pPr>
       <w:r>
@@ -9786,7 +9786,7 @@
     </w:p>
     <w:p>
       <w:pPr>
-        <w:spacing w:before="0" w:after="5" w:line="240" w:lineRule="auto"/>
+        <w:spacing w:before="0" w:after="5" w:line="250" w:lineRule="auto"/>
         <w:ind w:left="181" w:hanging="181"/>
       </w:pPr>
       <w:r>
@@ -9812,7 +9812,7 @@
     </w:p>
     <w:p>
       <w:pPr>
-        <w:spacing w:before="0" w:after="5" w:line="240" w:lineRule="auto"/>
+        <w:spacing w:before="0" w:after="5" w:line="250" w:lineRule="auto"/>
         <w:ind w:left="181" w:hanging="181"/>
       </w:pPr>
       <w:r>

</xml_diff>

<commit_message>
W46 footer 传播 — 7.38/10.90 (iter-58 make-invisible 边框揭秘)
发现 candidate 里 18 个 black borders 在 target PDF 中 INVISIBLE，
直接翻色到 FFFFFF（保留 w:val="single" 占位避免 reflow）：
- bottom sz=6 000→FF (16 sites): 表格行底部 −0.28 mean
- top sz=10 000→FF (1 site, p1): 顶部 hairline 分隔线，p1 −0.52
- top sz=8 second only (p11 disclaimer): −0.02 mean
- 红 banner sz=18→sz=2: 13 sites, −0.02 max（10.92→10.90）
- footer micro: sz=10 spacing 5→2 + color F5→E8

mean: 7.73 → 7.38 (−0.35)
max:  10.92 → 10.90 (−0.02)
Word-safe: validate PASS, COM 1.6s
wt_count 448 / editable 100% / text_ratio 1.0
</commit_message>
<xml_diff>
--- a/research/yjs-manual-opt/swiss/00_discussions/2026-05-pdf-to-docx-fidelity/final/imt050-wevac-eu-cn.docx
+++ b/research/yjs-manual-opt/swiss/00_discussions/2026-05-pdf-to-docx-fidelity/final/imt050-wevac-eu-cn.docx
@@ -129,7 +129,7 @@
     <w:p>
       <w:pPr>
         <w:pBdr>
-          <w:top w:val="single" w:sz="10" w:space="1" w:color="000000"/>
+          <w:top w:val="single" w:sz="10" w:space="1" w:color="FFFFFF"/>
         </w:pBdr>
         <w:spacing w:after="60"/>
       </w:pPr>
@@ -636,7 +636,7 @@
     <w:p>
       <w:pPr>
         <w:pBdr>
-          <w:left w:val="single" w:sz="18" w:space="4" w:color="E63846"/>
+          <w:left w:val="single" w:sz="2" w:space="4" w:color="E63846"/>
         </w:pBdr>
         <w:spacing w:after="120" w:line="240" w:lineRule="auto"/>
         <w:ind w:left="85"/>
@@ -1446,7 +1446,7 @@
     <w:p>
       <w:pPr>
         <w:pBdr>
-          <w:left w:val="single" w:sz="18" w:space="4" w:color="E63846"/>
+          <w:left w:val="single" w:sz="2" w:space="4" w:color="E63846"/>
         </w:pBdr>
         <w:spacing w:after="120" w:line="240" w:lineRule="auto"/>
         <w:ind w:left="85"/>
@@ -1864,7 +1864,7 @@
     <w:p>
       <w:pPr>
         <w:pBdr>
-          <w:left w:val="single" w:sz="18" w:space="4" w:color="E63846"/>
+          <w:left w:val="single" w:sz="2" w:space="4" w:color="E63846"/>
         </w:pBdr>
         <w:spacing w:after="120" w:line="240" w:lineRule="auto"/>
         <w:ind w:left="85"/>
@@ -1894,7 +1894,7 @@
       <w:pPr>
         <w:spacing w:after="80" w:before="80" w:line="278" w:lineRule="auto"/>
         <w:pBdr>
-          <w:bottom w:val="single" w:sz="6" w:space="1" w:color="000000"/>
+          <w:bottom w:val="single" w:sz="6" w:space="1" w:color="FFFFFF"/>
         </w:pBdr>
       </w:pPr>
       <w:r>
@@ -2042,7 +2042,7 @@
       <w:pPr>
         <w:spacing w:after="80" w:before="160" w:line="278" w:lineRule="auto"/>
         <w:pBdr>
-          <w:bottom w:val="single" w:sz="6" w:space="1" w:color="000000"/>
+          <w:bottom w:val="single" w:sz="6" w:space="1" w:color="FFFFFF"/>
         </w:pBdr>
       </w:pPr>
       <w:r>
@@ -2174,7 +2174,7 @@
       <w:pPr>
         <w:spacing w:after="80" w:before="160" w:line="278" w:lineRule="auto"/>
         <w:pBdr>
-          <w:bottom w:val="single" w:sz="6" w:space="1" w:color="000000"/>
+          <w:bottom w:val="single" w:sz="6" w:space="1" w:color="FFFFFF"/>
         </w:pBdr>
       </w:pPr>
       <w:r>
@@ -2337,7 +2337,7 @@
     <w:p>
       <w:pPr>
         <w:pBdr>
-          <w:left w:val="single" w:sz="18" w:space="4" w:color="E63846"/>
+          <w:left w:val="single" w:sz="2" w:space="4" w:color="E63846"/>
         </w:pBdr>
         <w:spacing w:after="120" w:line="240" w:lineRule="auto"/>
         <w:ind w:left="85"/>
@@ -3213,7 +3213,7 @@
     <w:p>
       <w:pPr>
         <w:pBdr>
-          <w:left w:val="single" w:sz="18" w:space="4" w:color="E63846"/>
+          <w:left w:val="single" w:sz="2" w:space="4" w:color="E63846"/>
         </w:pBdr>
         <w:spacing w:after="120" w:line="240" w:lineRule="auto"/>
         <w:ind w:left="85"/>
@@ -3866,7 +3866,7 @@
     <w:p>
       <w:pPr>
         <w:pBdr>
-          <w:left w:val="single" w:sz="18" w:space="4" w:color="E63846"/>
+          <w:left w:val="single" w:sz="2" w:space="4" w:color="E63846"/>
         </w:pBdr>
         <w:spacing w:after="120" w:line="240" w:lineRule="auto"/>
         <w:ind w:left="85"/>
@@ -5343,7 +5343,7 @@
     <w:p>
       <w:pPr>
         <w:pBdr>
-          <w:left w:val="single" w:sz="18" w:space="4" w:color="E63846"/>
+          <w:left w:val="single" w:sz="2" w:space="4" w:color="E63846"/>
         </w:pBdr>
         <w:spacing w:after="120" w:line="240" w:lineRule="auto"/>
         <w:ind w:left="85"/>
@@ -5373,7 +5373,7 @@
       <w:pPr>
         <w:spacing w:after="80" w:before="80" w:line="278" w:lineRule="auto"/>
         <w:pBdr>
-          <w:bottom w:val="single" w:sz="6" w:space="1" w:color="000000"/>
+          <w:bottom w:val="single" w:sz="6" w:space="1" w:color="FFFFFF"/>
         </w:pBdr>
       </w:pPr>
       <w:r>
@@ -5443,7 +5443,7 @@
       <w:pPr>
         <w:spacing w:after="80" w:before="160" w:line="278" w:lineRule="auto"/>
         <w:pBdr>
-          <w:bottom w:val="single" w:sz="6" w:space="1" w:color="000000"/>
+          <w:bottom w:val="single" w:sz="6" w:space="1" w:color="FFFFFF"/>
         </w:pBdr>
       </w:pPr>
       <w:r>
@@ -5533,7 +5533,7 @@
       <w:pPr>
         <w:spacing w:after="80" w:before="160" w:line="278" w:lineRule="auto"/>
         <w:pBdr>
-          <w:bottom w:val="single" w:sz="6" w:space="1" w:color="000000"/>
+          <w:bottom w:val="single" w:sz="6" w:space="1" w:color="FFFFFF"/>
         </w:pBdr>
       </w:pPr>
       <w:r>
@@ -5829,7 +5829,7 @@
     <w:p>
       <w:pPr>
         <w:pBdr>
-          <w:left w:val="single" w:sz="18" w:space="4" w:color="E63846"/>
+          <w:left w:val="single" w:sz="2" w:space="4" w:color="E63846"/>
         </w:pBdr>
         <w:spacing w:after="120" w:line="240" w:lineRule="auto"/>
         <w:ind w:left="85"/>
@@ -6576,7 +6576,7 @@
     <w:p>
       <w:pPr>
         <w:pBdr>
-          <w:left w:val="single" w:sz="18" w:space="4" w:color="E63846"/>
+          <w:left w:val="single" w:sz="2" w:space="4" w:color="E63846"/>
         </w:pBdr>
         <w:spacing w:after="120" w:line="240" w:lineRule="auto"/>
         <w:ind w:left="85"/>
@@ -7782,7 +7782,7 @@
             <w:tcW w:type="dxa" w:w="7257"/>
             <w:vAlign w:val="top"/>
             <w:tcBorders>
-              <w:top w:val="single" w:sz="8" w:space="0" w:color="000000"/>
+              <w:top w:val="single" w:sz="8" w:space="0" w:color="FFFFFF"/>
               <w:left w:val="nil"/>
               <w:bottom w:val="nil"/>
               <w:right w:val="nil"/>
@@ -7877,7 +7877,7 @@
     <w:p>
       <w:pPr>
         <w:pBdr>
-          <w:left w:val="single" w:sz="18" w:space="4" w:color="E63846"/>
+          <w:left w:val="single" w:sz="2" w:space="4" w:color="E63846"/>
         </w:pBdr>
         <w:spacing w:after="120" w:line="240" w:lineRule="auto"/>
         <w:ind w:left="85"/>
@@ -7907,7 +7907,7 @@
       <w:pPr>
         <w:spacing w:after="80" w:before="80" w:line="278" w:lineRule="auto"/>
         <w:pBdr>
-          <w:bottom w:val="single" w:sz="6" w:space="1" w:color="000000"/>
+          <w:bottom w:val="single" w:sz="6" w:space="1" w:color="FFFFFF"/>
         </w:pBdr>
       </w:pPr>
       <w:r>
@@ -8023,7 +8023,7 @@
       <w:pPr>
         <w:spacing w:after="80" w:before="80" w:line="278" w:lineRule="auto"/>
         <w:pBdr>
-          <w:bottom w:val="single" w:sz="6" w:space="1" w:color="000000"/>
+          <w:bottom w:val="single" w:sz="6" w:space="1" w:color="FFFFFF"/>
         </w:pBdr>
       </w:pPr>
       <w:r>
@@ -8241,7 +8241,7 @@
       <w:pPr>
         <w:spacing w:after="80" w:before="80" w:line="278" w:lineRule="auto"/>
         <w:pBdr>
-          <w:bottom w:val="single" w:sz="6" w:space="1" w:color="000000"/>
+          <w:bottom w:val="single" w:sz="6" w:space="1" w:color="FFFFFF"/>
         </w:pBdr>
       </w:pPr>
       <w:r>
@@ -8424,7 +8424,7 @@
     <w:p>
       <w:pPr>
         <w:pBdr>
-          <w:left w:val="single" w:sz="18" w:space="4" w:color="E63846"/>
+          <w:left w:val="single" w:sz="2" w:space="4" w:color="E63846"/>
         </w:pBdr>
         <w:spacing w:after="120" w:line="240" w:lineRule="auto"/>
         <w:ind w:left="85"/>
@@ -8454,7 +8454,7 @@
       <w:pPr>
         <w:spacing w:after="80" w:before="80" w:line="278" w:lineRule="auto"/>
         <w:pBdr>
-          <w:bottom w:val="single" w:sz="6" w:space="1" w:color="000000"/>
+          <w:bottom w:val="single" w:sz="6" w:space="1" w:color="FFFFFF"/>
         </w:pBdr>
       </w:pPr>
       <w:r>
@@ -8550,7 +8550,7 @@
       <w:pPr>
         <w:spacing w:after="80" w:before="160" w:line="278" w:lineRule="auto"/>
         <w:pBdr>
-          <w:bottom w:val="single" w:sz="6" w:space="1" w:color="000000"/>
+          <w:bottom w:val="single" w:sz="6" w:space="1" w:color="FFFFFF"/>
         </w:pBdr>
       </w:pPr>
       <w:r>
@@ -8672,7 +8672,7 @@
       <w:pPr>
         <w:spacing w:after="80" w:before="160" w:line="278" w:lineRule="auto"/>
         <w:pBdr>
-          <w:bottom w:val="single" w:sz="6" w:space="1" w:color="000000"/>
+          <w:bottom w:val="single" w:sz="6" w:space="1" w:color="FFFFFF"/>
         </w:pBdr>
       </w:pPr>
       <w:r>
@@ -8909,7 +8909,7 @@
     <w:p>
       <w:pPr>
         <w:pBdr>
-          <w:left w:val="single" w:sz="18" w:space="4" w:color="E63846"/>
+          <w:left w:val="single" w:sz="2" w:space="4" w:color="E63846"/>
         </w:pBdr>
         <w:spacing w:after="120" w:line="240" w:lineRule="auto"/>
         <w:ind w:left="85"/>
@@ -8956,7 +8956,7 @@
       <w:pPr>
         <w:spacing w:after="80" w:before="80" w:line="278" w:lineRule="auto"/>
         <w:pBdr>
-          <w:bottom w:val="single" w:sz="6" w:space="1" w:color="000000"/>
+          <w:bottom w:val="single" w:sz="6" w:space="1" w:color="FFFFFF"/>
         </w:pBdr>
       </w:pPr>
       <w:r>
@@ -9369,7 +9369,7 @@
       <w:pPr>
         <w:spacing w:after="80" w:before="80" w:line="278" w:lineRule="auto"/>
         <w:pBdr>
-          <w:bottom w:val="single" w:sz="6" w:space="1" w:color="000000"/>
+          <w:bottom w:val="single" w:sz="6" w:space="1" w:color="FFFFFF"/>
         </w:pBdr>
       </w:pPr>
       <w:r>
@@ -9709,7 +9709,7 @@
       <w:pPr>
         <w:spacing w:after="80" w:before="80" w:line="278" w:lineRule="auto"/>
         <w:pBdr>
-          <w:bottom w:val="single" w:sz="6" w:space="1" w:color="000000"/>
+          <w:bottom w:val="single" w:sz="6" w:space="1" w:color="FFFFFF"/>
         </w:pBdr>
       </w:pPr>
       <w:r>
@@ -9896,7 +9896,7 @@
     <w:p>
       <w:pPr>
         <w:pBdr>
-          <w:left w:val="single" w:sz="18" w:space="4" w:color="E63846"/>
+          <w:left w:val="single" w:sz="2" w:space="4" w:color="E63846"/>
         </w:pBdr>
         <w:spacing w:after="120" w:line="240" w:lineRule="auto"/>
         <w:ind w:left="85"/>
@@ -9926,7 +9926,7 @@
       <w:pPr>
         <w:spacing w:after="80" w:before="80" w:line="278" w:lineRule="auto"/>
         <w:pBdr>
-          <w:bottom w:val="single" w:sz="6" w:space="1" w:color="000000"/>
+          <w:bottom w:val="single" w:sz="6" w:space="1" w:color="FFFFFF"/>
         </w:pBdr>
       </w:pPr>
       <w:r>
@@ -10701,8 +10701,8 @@
               <w:rFonts w:ascii="Arial" w:hAnsi="Arial" w:cs="Arial" w:eastAsia="Microsoft YaHei"/>
               <w:b w:val="0"/>
               <w:sz w:val="10"/>
-              <w:color w:val="F5F5F5"/>
-              <w:spacing w:val="5"/>
+              <w:color w:val="E8E8E8"/>
+              <w:spacing w:val="2"/>
             </w:rPr>
             <w:t>威富可 IMT050 说明书</w:t>
           </w:r>
@@ -10734,7 +10734,7 @@
               <w:rFonts w:ascii="Courier New" w:hAnsi="Courier New" w:cs="Courier New" w:eastAsia="Microsoft YaHei"/>
               <w:b w:val="0"/>
               <w:sz w:val="10"/>
-              <w:color w:val="F5F5F5"/>
+              <w:color w:val="E8E8E8"/>
             </w:rPr>
             <w:t>10</w:t>
           </w:r>
@@ -10798,8 +10798,8 @@
               <w:rFonts w:ascii="Arial" w:hAnsi="Arial" w:cs="Arial" w:eastAsia="Microsoft YaHei"/>
               <w:b w:val="0"/>
               <w:sz w:val="10"/>
-              <w:color w:val="F5F5F5"/>
-              <w:spacing w:val="5"/>
+              <w:color w:val="E8E8E8"/>
+              <w:spacing w:val="2"/>
             </w:rPr>
             <w:t>威富可 IMT050 说明书</w:t>
           </w:r>
@@ -10831,7 +10831,7 @@
               <w:rFonts w:ascii="Courier New" w:hAnsi="Courier New" w:cs="Courier New" w:eastAsia="Microsoft YaHei"/>
               <w:b w:val="0"/>
               <w:sz w:val="10"/>
-              <w:color w:val="F5F5F5"/>
+              <w:color w:val="E8E8E8"/>
             </w:rPr>
             <w:t>11</w:t>
           </w:r>
@@ -10895,8 +10895,8 @@
               <w:rFonts w:ascii="Arial" w:hAnsi="Arial" w:cs="Arial" w:eastAsia="Microsoft YaHei"/>
               <w:b w:val="0"/>
               <w:sz w:val="10"/>
-              <w:color w:val="F5F5F5"/>
-              <w:spacing w:val="5"/>
+              <w:color w:val="E8E8E8"/>
+              <w:spacing w:val="2"/>
             </w:rPr>
             <w:t>威富可 IMT050 说明书</w:t>
           </w:r>
@@ -10928,7 +10928,7 @@
               <w:rFonts w:ascii="Courier New" w:hAnsi="Courier New" w:cs="Courier New" w:eastAsia="Microsoft YaHei"/>
               <w:b w:val="0"/>
               <w:sz w:val="10"/>
-              <w:color w:val="F5F5F5"/>
+              <w:color w:val="E8E8E8"/>
             </w:rPr>
             <w:t>12</w:t>
           </w:r>
@@ -10992,8 +10992,8 @@
               <w:rFonts w:ascii="Arial" w:hAnsi="Arial" w:cs="Arial" w:eastAsia="Microsoft YaHei"/>
               <w:b w:val="0"/>
               <w:sz w:val="10"/>
-              <w:color w:val="F5F5F5"/>
-              <w:spacing w:val="5"/>
+              <w:color w:val="E8E8E8"/>
+              <w:spacing w:val="2"/>
             </w:rPr>
             <w:t>威富可 IMT050 说明书</w:t>
           </w:r>
@@ -11025,7 +11025,7 @@
               <w:rFonts w:ascii="Courier New" w:hAnsi="Courier New" w:cs="Courier New" w:eastAsia="Microsoft YaHei"/>
               <w:b w:val="0"/>
               <w:sz w:val="10"/>
-              <w:color w:val="F5F5F5"/>
+              <w:color w:val="E8E8E8"/>
             </w:rPr>
             <w:t>13</w:t>
           </w:r>
@@ -11089,8 +11089,8 @@
               <w:rFonts w:ascii="Arial" w:hAnsi="Arial" w:cs="Arial" w:eastAsia="Microsoft YaHei"/>
               <w:b w:val="0"/>
               <w:sz w:val="10"/>
-              <w:color w:val="F5F5F5"/>
-              <w:spacing w:val="5"/>
+              <w:color w:val="E8E8E8"/>
+              <w:spacing w:val="2"/>
             </w:rPr>
             <w:t>威富可 IMT050 说明书</w:t>
           </w:r>
@@ -11122,7 +11122,7 @@
               <w:rFonts w:ascii="Courier New" w:hAnsi="Courier New" w:cs="Courier New" w:eastAsia="Microsoft YaHei"/>
               <w:b w:val="0"/>
               <w:sz w:val="10"/>
-              <w:color w:val="F5F5F5"/>
+              <w:color w:val="E8E8E8"/>
             </w:rPr>
             <w:t>14</w:t>
           </w:r>
@@ -11186,8 +11186,8 @@
               <w:rFonts w:ascii="Arial" w:hAnsi="Arial" w:cs="Arial" w:eastAsia="Microsoft YaHei"/>
               <w:b w:val="0"/>
               <w:sz w:val="10"/>
-              <w:color w:val="F5F5F5"/>
-              <w:spacing w:val="5"/>
+              <w:color w:val="E8E8E8"/>
+              <w:spacing w:val="2"/>
             </w:rPr>
             <w:t>威富可 IMT050 说明书</w:t>
           </w:r>
@@ -11219,7 +11219,7 @@
               <w:rFonts w:ascii="Courier New" w:hAnsi="Courier New" w:cs="Courier New" w:eastAsia="Microsoft YaHei"/>
               <w:b w:val="0"/>
               <w:sz w:val="10"/>
-              <w:color w:val="F5F5F5"/>
+              <w:color w:val="E8E8E8"/>
             </w:rPr>
             <w:t>15</w:t>
           </w:r>
@@ -11283,8 +11283,8 @@
               <w:rFonts w:ascii="Arial" w:hAnsi="Arial" w:cs="Arial" w:eastAsia="Microsoft YaHei"/>
               <w:b w:val="0"/>
               <w:sz w:val="10"/>
-              <w:color w:val="F5F5F5"/>
-              <w:spacing w:val="5"/>
+              <w:color w:val="E8E8E8"/>
+              <w:spacing w:val="2"/>
             </w:rPr>
             <w:t>威富可 IMT050 说明书</w:t>
           </w:r>
@@ -11316,7 +11316,7 @@
               <w:rFonts w:ascii="Courier New" w:hAnsi="Courier New" w:cs="Courier New" w:eastAsia="Microsoft YaHei"/>
               <w:b w:val="0"/>
               <w:sz w:val="10"/>
-              <w:color w:val="F5F5F5"/>
+              <w:color w:val="E8E8E8"/>
             </w:rPr>
             <w:t>2</w:t>
           </w:r>
@@ -11380,8 +11380,8 @@
               <w:rFonts w:ascii="Arial" w:hAnsi="Arial" w:cs="Arial" w:eastAsia="Microsoft YaHei"/>
               <w:b w:val="0"/>
               <w:sz w:val="10"/>
-              <w:color w:val="F5F5F5"/>
-              <w:spacing w:val="5"/>
+              <w:color w:val="E8E8E8"/>
+              <w:spacing w:val="2"/>
             </w:rPr>
             <w:t>威富可 IMT050 说明书</w:t>
           </w:r>
@@ -11413,7 +11413,7 @@
               <w:rFonts w:ascii="Courier New" w:hAnsi="Courier New" w:cs="Courier New" w:eastAsia="Microsoft YaHei"/>
               <w:b w:val="0"/>
               <w:sz w:val="10"/>
-              <w:color w:val="F5F5F5"/>
+              <w:color w:val="E8E8E8"/>
             </w:rPr>
             <w:t>3</w:t>
           </w:r>
@@ -11477,8 +11477,8 @@
               <w:rFonts w:ascii="Arial" w:hAnsi="Arial" w:cs="Arial" w:eastAsia="Microsoft YaHei"/>
               <w:b w:val="0"/>
               <w:sz w:val="10"/>
-              <w:color w:val="F5F5F5"/>
-              <w:spacing w:val="5"/>
+              <w:color w:val="E8E8E8"/>
+              <w:spacing w:val="2"/>
             </w:rPr>
             <w:t>威富可 IMT050 说明书</w:t>
           </w:r>
@@ -11510,7 +11510,7 @@
               <w:rFonts w:ascii="Courier New" w:hAnsi="Courier New" w:cs="Courier New" w:eastAsia="Microsoft YaHei"/>
               <w:b w:val="0"/>
               <w:sz w:val="10"/>
-              <w:color w:val="F5F5F5"/>
+              <w:color w:val="E8E8E8"/>
             </w:rPr>
             <w:t>4</w:t>
           </w:r>
@@ -11574,8 +11574,8 @@
               <w:rFonts w:ascii="Arial" w:hAnsi="Arial" w:cs="Arial" w:eastAsia="Microsoft YaHei"/>
               <w:b w:val="0"/>
               <w:sz w:val="10"/>
-              <w:color w:val="F5F5F5"/>
-              <w:spacing w:val="5"/>
+              <w:color w:val="E8E8E8"/>
+              <w:spacing w:val="2"/>
             </w:rPr>
             <w:t>威富可 IMT050 说明书</w:t>
           </w:r>
@@ -11607,7 +11607,7 @@
               <w:rFonts w:ascii="Courier New" w:hAnsi="Courier New" w:cs="Courier New" w:eastAsia="Microsoft YaHei"/>
               <w:b w:val="0"/>
               <w:sz w:val="10"/>
-              <w:color w:val="F5F5F5"/>
+              <w:color w:val="E8E8E8"/>
             </w:rPr>
             <w:t>5</w:t>
           </w:r>
@@ -11671,8 +11671,8 @@
               <w:rFonts w:ascii="Arial" w:hAnsi="Arial" w:cs="Arial" w:eastAsia="Microsoft YaHei"/>
               <w:b w:val="0"/>
               <w:sz w:val="10"/>
-              <w:color w:val="F5F5F5"/>
-              <w:spacing w:val="5"/>
+              <w:color w:val="E8E8E8"/>
+              <w:spacing w:val="2"/>
             </w:rPr>
             <w:t>威富可 IMT050 说明书</w:t>
           </w:r>
@@ -11704,7 +11704,7 @@
               <w:rFonts w:ascii="Courier New" w:hAnsi="Courier New" w:cs="Courier New" w:eastAsia="Microsoft YaHei"/>
               <w:b w:val="0"/>
               <w:sz w:val="10"/>
-              <w:color w:val="F5F5F5"/>
+              <w:color w:val="E8E8E8"/>
             </w:rPr>
             <w:t>6</w:t>
           </w:r>
@@ -11768,8 +11768,8 @@
               <w:rFonts w:ascii="Arial" w:hAnsi="Arial" w:cs="Arial" w:eastAsia="Microsoft YaHei"/>
               <w:b w:val="0"/>
               <w:sz w:val="10"/>
-              <w:color w:val="F5F5F5"/>
-              <w:spacing w:val="5"/>
+              <w:color w:val="E8E8E8"/>
+              <w:spacing w:val="2"/>
             </w:rPr>
             <w:t>威富可 IMT050 说明书</w:t>
           </w:r>
@@ -11801,7 +11801,7 @@
               <w:rFonts w:ascii="Courier New" w:hAnsi="Courier New" w:cs="Courier New" w:eastAsia="Microsoft YaHei"/>
               <w:b w:val="0"/>
               <w:sz w:val="10"/>
-              <w:color w:val="F5F5F5"/>
+              <w:color w:val="E8E8E8"/>
             </w:rPr>
             <w:t>7</w:t>
           </w:r>
@@ -11865,8 +11865,8 @@
               <w:rFonts w:ascii="Arial" w:hAnsi="Arial" w:cs="Arial" w:eastAsia="Microsoft YaHei"/>
               <w:b w:val="0"/>
               <w:sz w:val="10"/>
-              <w:color w:val="F5F5F5"/>
-              <w:spacing w:val="5"/>
+              <w:color w:val="E8E8E8"/>
+              <w:spacing w:val="2"/>
             </w:rPr>
             <w:t>威富可 IMT050 说明书</w:t>
           </w:r>
@@ -11898,7 +11898,7 @@
               <w:rFonts w:ascii="Courier New" w:hAnsi="Courier New" w:cs="Courier New" w:eastAsia="Microsoft YaHei"/>
               <w:b w:val="0"/>
               <w:sz w:val="10"/>
-              <w:color w:val="F5F5F5"/>
+              <w:color w:val="E8E8E8"/>
             </w:rPr>
             <w:t>8</w:t>
           </w:r>
@@ -11962,8 +11962,8 @@
               <w:rFonts w:ascii="Arial" w:hAnsi="Arial" w:cs="Arial" w:eastAsia="Microsoft YaHei"/>
               <w:b w:val="0"/>
               <w:sz w:val="10"/>
-              <w:color w:val="F5F5F5"/>
-              <w:spacing w:val="5"/>
+              <w:color w:val="E8E8E8"/>
+              <w:spacing w:val="2"/>
             </w:rPr>
             <w:t>威富可 IMT050 说明书</w:t>
           </w:r>
@@ -11995,7 +11995,7 @@
               <w:rFonts w:ascii="Courier New" w:hAnsi="Courier New" w:cs="Courier New" w:eastAsia="Microsoft YaHei"/>
               <w:b w:val="0"/>
               <w:sz w:val="10"/>
-              <w:color w:val="F5F5F5"/>
+              <w:color w:val="E8E8E8"/>
             </w:rPr>
             <w:t>9</w:t>
           </w:r>

</xml_diff>